<commit_message>
docs(examples): regenerate dsl-discount README.docx
</commit_message>
<xml_diff>
--- a/examples/dsl-discount-spec/README.docx
+++ b/examples/dsl-discount-spec/README.docx
@@ -2,7 +2,7 @@
 <file path=word/document.xml><?xml version="1.0" encoding="utf-8"?>
 <w:document xmlns:w="http://schemas.openxmlformats.org/wordprocessingml/2006/main" xmlns:m="http://schemas.openxmlformats.org/officeDocument/2006/math" xmlns:r="http://schemas.openxmlformats.org/officeDocument/2006/relationships" xmlns:o="urn:schemas-microsoft-com:office:office" xmlns:v="urn:schemas-microsoft-com:vml" xmlns:w10="urn:schemas-microsoft-com:office:word" xmlns:a="http://schemas.openxmlformats.org/drawingml/2006/main" xmlns:pic="http://schemas.openxmlformats.org/drawingml/2006/picture" xmlns:wp="http://schemas.openxmlformats.org/drawingml/2006/wordprocessingDrawing">
   <w:body>
-    <w:bookmarkStart w:id="35" w:name="X090d5e3927d7b5166545c72cdb7bdebd54c4fbf"/>
+    <w:bookmarkStart w:id="38" w:name="X090d5e3927d7b5166545c72cdb7bdebd54c4fbf"/>
     <w:p>
       <w:pPr>
         <w:pStyle w:val="Heading1"/>
@@ -1559,7 +1559,7 @@
       </w:r>
     </w:p>
     <w:bookmarkEnd w:id="13"/>
-    <w:bookmarkStart w:id="20" w:name="X029a0491531b0d1fd32812592c9f593812440f4"/>
+    <w:bookmarkStart w:id="23" w:name="X029a0491531b0d1fd32812592c9f593812440f4"/>
     <w:p>
       <w:pPr>
         <w:pStyle w:val="Heading2"/>
@@ -1878,7 +1878,213 @@
         <w:t xml:space="preserve"> </w:t>
       </w:r>
       <w:r>
-        <w:t xml:space="preserve">renders that file inline. This is for</w:t>
+        <w:t xml:space="preserve">renders that file inline. The inserted skeleton now also seeds a</w:t>
+      </w:r>
+      <w:r>
+        <w:t xml:space="preserve"> </w:t>
+      </w:r>
+      <w:r>
+        <w:rPr>
+          <w:rStyle w:val="VerbatimChar"/>
+        </w:rPr>
+        <w:t xml:space="preserve">runner:</w:t>
+      </w:r>
+      <w:r>
+        <w:t xml:space="preserve"> </w:t>
+      </w:r>
+      <w:r>
+        <w:t xml:space="preserve">line — see below.</w:t>
+      </w:r>
+    </w:p>
+    <w:p>
+      <w:pPr>
+        <w:pStyle w:val="FirstParagraph"/>
+      </w:pPr>
+      <w:r>
+        <w:rPr>
+          <w:b/>
+          <w:bCs/>
+        </w:rPr>
+        <w:t xml:space="preserve">Naming the runner on the reference.</w:t>
+      </w:r>
+      <w:r>
+        <w:t xml:space="preserve"> </w:t>
+      </w:r>
+      <w:r>
+        <w:t xml:space="preserve">A</w:t>
+      </w:r>
+      <w:r>
+        <w:t xml:space="preserve"> </w:t>
+      </w:r>
+      <w:r>
+        <w:rPr>
+          <w:rStyle w:val="VerbatimChar"/>
+        </w:rPr>
+        <w:t xml:space="preserve">```gherkin-file</w:t>
+      </w:r>
+      <w:r>
+        <w:t xml:space="preserve"> </w:t>
+      </w:r>
+      <w:r>
+        <w:t xml:space="preserve">block can carry an optional</w:t>
+      </w:r>
+      <w:r>
+        <w:t xml:space="preserve"> </w:t>
+      </w:r>
+      <w:r>
+        <w:rPr>
+          <w:rStyle w:val="VerbatimChar"/>
+        </w:rPr>
+        <w:t xml:space="preserve">runner: &lt;cmd&gt;</w:t>
+      </w:r>
+      <w:r>
+        <w:t xml:space="preserve"> </w:t>
+      </w:r>
+      <w:r>
+        <w:t xml:space="preserve">line right beside its</w:t>
+      </w:r>
+      <w:r>
+        <w:t xml:space="preserve"> </w:t>
+      </w:r>
+      <w:r>
+        <w:rPr>
+          <w:rStyle w:val="VerbatimChar"/>
+        </w:rPr>
+        <w:t xml:space="preserve">.feature</w:t>
+      </w:r>
+      <w:r>
+        <w:t xml:space="preserve"> </w:t>
+      </w:r>
+      <w:r>
+        <w:t xml:space="preserve">path:</w:t>
+      </w:r>
+    </w:p>
+    <w:p>
+      <w:pPr>
+        <w:pStyle w:val="SourceCode"/>
+      </w:pPr>
+      <w:r>
+        <w:rPr>
+          <w:rStyle w:val="VerbatimChar"/>
+        </w:rPr>
+        <w:t xml:space="preserve">features/discount.feature</w:t>
+      </w:r>
+      <w:r>
+        <w:br/>
+      </w:r>
+      <w:r>
+        <w:rPr>
+          <w:rStyle w:val="VerbatimChar"/>
+        </w:rPr>
+        <w:t xml:space="preserve">runner: python dsl_runner.py</w:t>
+      </w:r>
+    </w:p>
+    <w:p>
+      <w:pPr>
+        <w:pStyle w:val="FirstParagraph"/>
+      </w:pPr>
+      <w:r>
+        <w:t xml:space="preserve">The board renders the referenced scenarios as usual and shows the</w:t>
+      </w:r>
+      <w:r>
+        <w:t xml:space="preserve"> </w:t>
+      </w:r>
+      <w:r>
+        <w:rPr>
+          <w:b/>
+          <w:bCs/>
+        </w:rPr>
+        <w:t xml:space="preserve">resolved runner command</w:t>
+      </w:r>
+      <w:r>
+        <w:t xml:space="preserve"> </w:t>
+      </w:r>
+      <w:r>
+        <w:t xml:space="preserve">—</w:t>
+      </w:r>
+      <w:r>
+        <w:t xml:space="preserve"> </w:t>
+      </w:r>
+      <w:r>
+        <w:rPr>
+          <w:rStyle w:val="VerbatimChar"/>
+        </w:rPr>
+        <w:t xml:space="preserve">&lt;runner&gt;</w:t>
+      </w:r>
+      <w:r>
+        <w:t xml:space="preserve"> </w:t>
+      </w:r>
+      <w:r>
+        <w:t xml:space="preserve">joined to the feature path — as a labeled chip directly beneath the panel:</w:t>
+      </w:r>
+    </w:p>
+    <w:p>
+      <w:pPr>
+        <w:pStyle w:val="CaptionedFigure"/>
+      </w:pPr>
+      <w:r>
+        <w:drawing>
+          <wp:inline>
+            <wp:extent cx="5334000" cy="3919458"/>
+            <wp:effectExtent b="0" l="0" r="0" t="0"/>
+            <wp:docPr descr="The board’s Acceptance tab: the three discount scenarios rendered as a Gherkin panel, with a RUNNER chip beneath it reading “python dsl_runner.py features/discount.feature”" title="" id="21" name="Picture"/>
+            <a:graphic>
+              <a:graphicData uri="http://schemas.openxmlformats.org/drawingml/2006/picture">
+                <pic:pic>
+                  <pic:nvPicPr>
+                    <pic:cNvPr descr="images/runner-line.png" id="22" name="Picture"/>
+                    <pic:cNvPicPr>
+                      <a:picLocks noChangeArrowheads="1" noChangeAspect="1"/>
+                    </pic:cNvPicPr>
+                  </pic:nvPicPr>
+                  <pic:blipFill>
+                    <a:blip r:embed="rId20"/>
+                    <a:stretch>
+                      <a:fillRect/>
+                    </a:stretch>
+                  </pic:blipFill>
+                  <pic:spPr bwMode="auto">
+                    <a:xfrm>
+                      <a:off x="0" y="0"/>
+                      <a:ext cx="5334000" cy="3919458"/>
+                    </a:xfrm>
+                    <a:prstGeom prst="rect">
+                      <a:avLst/>
+                    </a:prstGeom>
+                    <a:noFill/>
+                    <a:ln w="9525">
+                      <a:noFill/>
+                      <a:headEnd/>
+                      <a:tailEnd/>
+                    </a:ln>
+                  </pic:spPr>
+                </pic:pic>
+              </a:graphicData>
+            </a:graphic>
+          </wp:inline>
+        </w:drawing>
+      </w:r>
+    </w:p>
+    <w:p>
+      <w:pPr>
+        <w:pStyle w:val="ImageCaption"/>
+      </w:pPr>
+      <w:r>
+        <w:t xml:space="preserve">The board’s Acceptance tab: the three discount scenarios rendered as a Gherkin panel, with a RUNNER chip beneath it reading</w:t>
+      </w:r>
+      <w:r>
+        <w:t xml:space="preserve"> </w:t>
+      </w:r>
+      <w:r>
+        <w:t xml:space="preserve">“python dsl_runner.py features/discount.feature”</w:t>
+      </w:r>
+    </w:p>
+    <w:p>
+      <w:pPr>
+        <w:pStyle w:val="BodyText"/>
+      </w:pPr>
+      <w:r>
+        <w:t xml:space="preserve">This keeps the command that validates the spec</w:t>
       </w:r>
       <w:r>
         <w:t xml:space="preserve"> </w:t>
@@ -1888,146 +2094,225 @@
           <w:i/>
           <w:iCs/>
         </w:rPr>
-        <w:t xml:space="preserve">display</w:t>
-      </w:r>
-      <w:r>
-        <w:t xml:space="preserve"> </w:t>
-      </w:r>
-      <w:r>
-        <w:t xml:space="preserve">— the workshop’s checker still runs the project</w:t>
-      </w:r>
-      <w:r>
-        <w:t xml:space="preserve"> </w:t>
-      </w:r>
-      <w:r>
-        <w:t xml:space="preserve">copy,</w:t>
-      </w:r>
-      <w:r>
-        <w:t xml:space="preserve"> </w:t>
-      </w:r>
-      <w:r>
-        <w:rPr>
-          <w:rStyle w:val="VerbatimChar"/>
-        </w:rPr>
-        <w:t xml:space="preserve">python dsl_runner.py specs/discount.feature</w:t>
-      </w:r>
-      <w:r>
-        <w:t xml:space="preserve">.</w:t>
-      </w:r>
-    </w:p>
-    <w:p>
-      <w:pPr>
-        <w:pStyle w:val="FirstParagraph"/>
-      </w:pPr>
-      <w:r>
-        <w:t xml:space="preserve">The criterion is a real checkbox, so leaving it unchecked blocks</w:t>
-      </w:r>
-      <w:r>
-        <w:t xml:space="preserve"> </w:t>
-      </w:r>
-      <w:r>
-        <w:rPr>
-          <w:rStyle w:val="VerbatimChar"/>
-        </w:rPr>
-        <w:t xml:space="preserve">sprint complete</w:t>
-      </w:r>
-      <w:r>
-        <w:t xml:space="preserve"> </w:t>
-      </w:r>
-      <w:r>
-        <w:t xml:space="preserve">like any</w:t>
-      </w:r>
-      <w:r>
-        <w:t xml:space="preserve"> </w:t>
-      </w:r>
-      <w:r>
-        <w:t xml:space="preserve">other unmet criterion. The panel above keeps all three scenarios under one criterion (mirroring</w:t>
-      </w:r>
-      <w:r>
-        <w:t xml:space="preserve"> </w:t>
-      </w:r>
-      <w:r>
-        <w:rPr>
-          <w:rStyle w:val="VerbatimChar"/>
-        </w:rPr>
-        <w:t xml:space="preserve">discount.feature</w:t>
-      </w:r>
-      <w:r>
-        <w:t xml:space="preserve">); if you’d rather each scenario be graded and checked off on its own, split</w:t>
-      </w:r>
-      <w:r>
-        <w:t xml:space="preserve"> </w:t>
-      </w:r>
-      <w:r>
-        <w:t xml:space="preserve">them into one criterion per scenario — the panel renders the same either way.</w:t>
-      </w:r>
-    </w:p>
-    <w:p>
-      <w:pPr>
-        <w:pStyle w:val="BodyText"/>
-      </w:pPr>
+        <w:t xml:space="preserve">with the spec</w:t>
+      </w:r>
+      <w:r>
+        <w:t xml:space="preserve">, instead of only in</w:t>
+      </w:r>
+      <w:r>
+        <w:t xml:space="preserve"> </w:t>
+      </w:r>
+      <w:r>
+        <w:rPr>
+          <w:rStyle w:val="VerbatimChar"/>
+        </w:rPr>
+        <w:t xml:space="preserve">## Test Plan</w:t>
+      </w:r>
+      <w:r>
+        <w:t xml:space="preserve"> </w:t>
+      </w:r>
+      <w:r>
+        <w:t xml:space="preserve">prose. It is</w:t>
+      </w:r>
+      <w:r>
+        <w:t xml:space="preserve"> </w:t>
+      </w:r>
       <w:r>
         <w:rPr>
           <w:b/>
           <w:bCs/>
         </w:rPr>
-        <w:t xml:space="preserve">Why this matters for step 8’s grading:</w:t>
-      </w:r>
-      <w:r>
-        <w:t xml:space="preserve"> </w:t>
-      </w:r>
-      <w:r>
-        <w:t xml:space="preserve">because the criterion carries a real</w:t>
-      </w:r>
-      <w:r>
-        <w:t xml:space="preserve"> </w:t>
-      </w:r>
-      <w:r>
-        <w:rPr>
-          <w:rStyle w:val="VerbatimChar"/>
-        </w:rPr>
-        <w:t xml:space="preserve">Given/When/Then</w:t>
-      </w:r>
-      <w:r>
-        <w:t xml:space="preserve"> </w:t>
-      </w:r>
-      <w:r>
-        <w:t xml:space="preserve">block and names its runner command in</w:t>
-      </w:r>
-      <w:r>
-        <w:t xml:space="preserve"> </w:t>
-      </w:r>
-      <w:r>
-        <w:rPr>
-          <w:rStyle w:val="VerbatimChar"/>
-        </w:rPr>
-        <w:t xml:space="preserve">## Test Plan</w:t>
-      </w:r>
-      <w:r>
-        <w:t xml:space="preserve">, canon’s evaluator grades it by</w:t>
-      </w:r>
-      <w:r>
-        <w:t xml:space="preserve"> </w:t>
-      </w:r>
+        <w:t xml:space="preserve">display only</w:t>
+      </w:r>
+      <w:r>
+        <w:t xml:space="preserve"> </w:t>
+      </w:r>
+      <w:r>
+        <w:t xml:space="preserve">— the board never executes the runner. At</w:t>
+      </w:r>
+      <w:r>
+        <w:t xml:space="preserve"> </w:t>
+      </w:r>
+      <w:r>
+        <w:rPr>
+          <w:rStyle w:val="VerbatimChar"/>
+        </w:rPr>
+        <w:t xml:space="preserve">sprint complete</w:t>
+      </w:r>
+      <w:r>
+        <w:t xml:space="preserve"> </w:t>
+      </w:r>
+      <w:r>
+        <w:t xml:space="preserve">the fresh</w:t>
+      </w:r>
+      <w:r>
+        <w:t xml:space="preserve"> </w:t>
+      </w:r>
+      <w:r>
+        <w:t xml:space="preserve">evaluator reads that line, forms</w:t>
+      </w:r>
+      <w:r>
+        <w:t xml:space="preserve"> </w:t>
+      </w:r>
+      <w:r>
+        <w:rPr>
+          <w:rStyle w:val="VerbatimChar"/>
+        </w:rPr>
+        <w:t xml:space="preserve">python dsl_runner.py features/discount.feature</w:t>
+      </w:r>
+      <w:r>
+        <w:t xml:space="preserve">, runs it, and</w:t>
+      </w:r>
+      <w:r>
+        <w:t xml:space="preserve"> </w:t>
+      </w:r>
+      <w:r>
+        <w:t xml:space="preserve">grades on the exit code (the same</w:t>
+      </w:r>
+      <w:r>
+        <w:t xml:space="preserve"> </w:t>
+      </w:r>
+      <w:r>
+        <w:t xml:space="preserve">“run it, report the boolean”</w:t>
+      </w:r>
+      <w:r>
+        <w:t xml:space="preserve"> </w:t>
+      </w:r>
+      <w:r>
+        <w:t xml:space="preserve">behavior described below). The</w:t>
+      </w:r>
+      <w:r>
+        <w:t xml:space="preserve"> </w:t>
+      </w:r>
+      <w:r>
+        <w:t xml:space="preserve">workshop’s own checker still runs the project copy,</w:t>
+      </w:r>
+      <w:r>
+        <w:t xml:space="preserve"> </w:t>
+      </w:r>
+      <w:r>
+        <w:rPr>
+          <w:rStyle w:val="VerbatimChar"/>
+        </w:rPr>
+        <w:t xml:space="preserve">python dsl_runner.py specs/discount.feature</w:t>
+      </w:r>
+      <w:r>
+        <w:t xml:space="preserve">.</w:t>
+      </w:r>
+    </w:p>
+    <w:p>
+      <w:pPr>
+        <w:pStyle w:val="BodyText"/>
+      </w:pPr>
+      <w:r>
+        <w:t xml:space="preserve">The criterion is a real checkbox, so leaving it unchecked blocks</w:t>
+      </w:r>
+      <w:r>
+        <w:t xml:space="preserve"> </w:t>
+      </w:r>
+      <w:r>
+        <w:rPr>
+          <w:rStyle w:val="VerbatimChar"/>
+        </w:rPr>
+        <w:t xml:space="preserve">sprint complete</w:t>
+      </w:r>
+      <w:r>
+        <w:t xml:space="preserve"> </w:t>
+      </w:r>
+      <w:r>
+        <w:t xml:space="preserve">like any</w:t>
+      </w:r>
+      <w:r>
+        <w:t xml:space="preserve"> </w:t>
+      </w:r>
+      <w:r>
+        <w:t xml:space="preserve">other unmet criterion. The panel above keeps all three scenarios under one criterion (mirroring</w:t>
+      </w:r>
+      <w:r>
+        <w:t xml:space="preserve"> </w:t>
+      </w:r>
+      <w:r>
+        <w:rPr>
+          <w:rStyle w:val="VerbatimChar"/>
+        </w:rPr>
+        <w:t xml:space="preserve">discount.feature</w:t>
+      </w:r>
+      <w:r>
+        <w:t xml:space="preserve">); if you’d rather each scenario be graded and checked off on its own, split</w:t>
+      </w:r>
+      <w:r>
+        <w:t xml:space="preserve"> </w:t>
+      </w:r>
+      <w:r>
+        <w:t xml:space="preserve">them into one criterion per scenario — the panel renders the same either way.</w:t>
+      </w:r>
+    </w:p>
+    <w:p>
+      <w:pPr>
+        <w:pStyle w:val="BodyText"/>
+      </w:pPr>
       <w:r>
         <w:rPr>
           <w:b/>
           <w:bCs/>
         </w:rPr>
-        <w:t xml:space="preserve">running that</w:t>
+        <w:t xml:space="preserve">Why this matters for step 8’s grading:</w:t>
+      </w:r>
+      <w:r>
+        <w:t xml:space="preserve"> </w:t>
+      </w:r>
+      <w:r>
+        <w:t xml:space="preserve">because the criterion carries a real</w:t>
+      </w:r>
+      <w:r>
+        <w:t xml:space="preserve"> </w:t>
+      </w:r>
+      <w:r>
+        <w:rPr>
+          <w:rStyle w:val="VerbatimChar"/>
+        </w:rPr>
+        <w:t xml:space="preserve">Given/When/Then</w:t>
+      </w:r>
+      <w:r>
+        <w:t xml:space="preserve"> </w:t>
+      </w:r>
+      <w:r>
+        <w:t xml:space="preserve">block and names its runner command in</w:t>
+      </w:r>
+      <w:r>
+        <w:t xml:space="preserve"> </w:t>
+      </w:r>
+      <w:r>
+        <w:rPr>
+          <w:rStyle w:val="VerbatimChar"/>
+        </w:rPr>
+        <w:t xml:space="preserve">## Test Plan</w:t>
+      </w:r>
+      <w:r>
+        <w:t xml:space="preserve">, canon’s evaluator grades it by</w:t>
+      </w:r>
+      <w:r>
+        <w:t xml:space="preserve"> </w:t>
       </w:r>
       <w:r>
         <w:rPr>
           <w:b/>
           <w:bCs/>
         </w:rPr>
-        <w:t xml:space="preserve"> </w:t>
+        <w:t xml:space="preserve">running that</w:t>
       </w:r>
       <w:r>
         <w:rPr>
           <w:b/>
           <w:bCs/>
         </w:rPr>
+        <w:t xml:space="preserve"> </w:t>
+      </w:r>
+      <w:r>
+        <w:rPr>
+          <w:b/>
+          <w:bCs/>
+        </w:rPr>
         <w:t xml:space="preserve">command and reading the exit code</w:t>
       </w:r>
       <w:r>
@@ -2076,8 +2361,8 @@
         <w:t xml:space="preserve">criteria, and it’s exactly what makes the live break in step 9 impossible for the gate to miss.</w:t>
       </w:r>
     </w:p>
-    <w:bookmarkEnd w:id="20"/>
-    <w:bookmarkStart w:id="26" w:name="X54cde4a37826a355c914d9e62a5985e536eb501"/>
+    <w:bookmarkEnd w:id="23"/>
+    <w:bookmarkStart w:id="29" w:name="X54cde4a37826a355c914d9e62a5985e536eb501"/>
     <w:p>
       <w:pPr>
         <w:pStyle w:val="Heading2"/>
@@ -2273,18 +2558,18 @@
           <wp:inline>
             <wp:extent cx="5334000" cy="5048250"/>
             <wp:effectExtent b="0" l="0" r="0" t="0"/>
-            <wp:docPr descr="New Ticket modal — DSL Discount, Task, P2" title="" id="22" name="Picture"/>
+            <wp:docPr descr="New Ticket modal — DSL Discount, Task, P2" title="" id="25" name="Picture"/>
             <a:graphic>
               <a:graphicData uri="http://schemas.openxmlformats.org/drawingml/2006/picture">
                 <pic:pic>
                   <pic:nvPicPr>
-                    <pic:cNvPr descr="images/new-ticket.png" id="23" name="Picture"/>
+                    <pic:cNvPr descr="images/new-ticket.png" id="26" name="Picture"/>
                     <pic:cNvPicPr>
                       <a:picLocks noChangeArrowheads="1" noChangeAspect="1"/>
                     </pic:cNvPicPr>
                   </pic:nvPicPr>
                   <pic:blipFill>
-                    <a:blip r:embed="rId21"/>
+                    <a:blip r:embed="rId24"/>
                     <a:stretch>
                       <a:fillRect/>
                     </a:stretch>
@@ -2676,12 +2961,12 @@
           <wp:inline>
             <wp:extent cx="5334000" cy="3789947"/>
             <wp:effectExtent b="0" l="0" r="0" t="0"/>
-            <wp:docPr descr="Acceptance tab rendering the three discount scenarios as a highlighted Gherkin panel" title="" id="24" name="Picture"/>
+            <wp:docPr descr="Acceptance tab rendering the three discount scenarios as a highlighted Gherkin panel" title="" id="27" name="Picture"/>
             <a:graphic>
               <a:graphicData uri="http://schemas.openxmlformats.org/drawingml/2006/picture">
                 <pic:pic>
                   <pic:nvPicPr>
-                    <pic:cNvPr descr="images/scenario-panel.png" id="25" name="Picture"/>
+                    <pic:cNvPr descr="images/scenario-panel.png" id="28" name="Picture"/>
                     <pic:cNvPicPr>
                       <a:picLocks noChangeArrowheads="1" noChangeAspect="1"/>
                     </pic:cNvPicPr>
@@ -3307,8 +3592,8 @@
         <w:t xml:space="preserve">path run scenario runners safely is tracked as a separate improvement.</w:t>
       </w:r>
     </w:p>
-    <w:bookmarkEnd w:id="26"/>
-    <w:bookmarkStart w:id="27" w:name="the-spec-annotated"/>
+    <w:bookmarkEnd w:id="29"/>
+    <w:bookmarkStart w:id="30" w:name="the-spec-annotated"/>
     <w:p>
       <w:pPr>
         <w:pStyle w:val="Heading2"/>
@@ -3437,8 +3722,8 @@
         <w:t xml:space="preserve">steps; a spec that’s readable but unrun is just a comment.</w:t>
       </w:r>
     </w:p>
-    <w:bookmarkEnd w:id="27"/>
-    <w:bookmarkStart w:id="28" w:name="the-runner-annotated"/>
+    <w:bookmarkEnd w:id="30"/>
+    <w:bookmarkStart w:id="31" w:name="the-runner-annotated"/>
     <w:p>
       <w:pPr>
         <w:pStyle w:val="Heading2"/>
@@ -3510,8 +3795,8 @@
         <w:t xml:space="preserve">recognized step shapes, not switching to free-text parsing.</w:t>
       </w:r>
     </w:p>
-    <w:bookmarkEnd w:id="28"/>
-    <w:bookmarkStart w:id="29" w:name="test-cases"/>
+    <w:bookmarkEnd w:id="31"/>
+    <w:bookmarkStart w:id="32" w:name="test-cases"/>
     <w:p>
       <w:pPr>
         <w:pStyle w:val="Heading2"/>
@@ -3802,8 +4087,8 @@
         </w:tc>
       </w:tr>
     </w:tbl>
-    <w:bookmarkEnd w:id="29"/>
-    <w:bookmarkStart w:id="30" w:name="what-each-case-means-in-the-business"/>
+    <w:bookmarkEnd w:id="32"/>
+    <w:bookmarkStart w:id="33" w:name="what-each-case-means-in-the-business"/>
     <w:p>
       <w:pPr>
         <w:pStyle w:val="Heading2"/>
@@ -4344,8 +4629,8 @@
         </w:tc>
       </w:tr>
     </w:tbl>
-    <w:bookmarkEnd w:id="30"/>
-    <w:bookmarkStart w:id="31" w:name="X7b36cda1c18148df6fb1d9a3558d019695d053f"/>
+    <w:bookmarkEnd w:id="33"/>
+    <w:bookmarkStart w:id="34" w:name="X7b36cda1c18148df6fb1d9a3558d019695d053f"/>
     <w:p>
       <w:pPr>
         <w:pStyle w:val="Heading2"/>
@@ -4592,8 +4877,8 @@
         <w:t xml:space="preserve">implementer sign off on it, before trusting it as proof of anything.</w:t>
       </w:r>
     </w:p>
-    <w:bookmarkEnd w:id="31"/>
-    <w:bookmarkStart w:id="32" w:name="isnt-this-just-a-unit-test"/>
+    <w:bookmarkEnd w:id="34"/>
+    <w:bookmarkStart w:id="35" w:name="isnt-this-just-a-unit-test"/>
     <w:p>
       <w:pPr>
         <w:pStyle w:val="Heading2"/>
@@ -5007,8 +5292,8 @@
         <w:t xml:space="preserve">.</w:t>
       </w:r>
     </w:p>
-    <w:bookmarkEnd w:id="32"/>
-    <w:bookmarkStart w:id="33" w:name="X9a249f5f163a90280cb293225baf90a156639df"/>
+    <w:bookmarkEnd w:id="35"/>
+    <w:bookmarkStart w:id="36" w:name="X9a249f5f163a90280cb293225baf90a156639df"/>
     <w:p>
       <w:pPr>
         <w:pStyle w:val="Heading2"/>
@@ -5178,8 +5463,8 @@
         <w:t xml:space="preserve">the room asks.</w:t>
       </w:r>
     </w:p>
-    <w:bookmarkEnd w:id="33"/>
-    <w:bookmarkStart w:id="34" w:name="related-material"/>
+    <w:bookmarkEnd w:id="36"/>
+    <w:bookmarkStart w:id="37" w:name="related-material"/>
     <w:p>
       <w:pPr>
         <w:pStyle w:val="Heading2"/>
@@ -5260,8 +5545,8 @@
         <w:t xml:space="preserve">section above.</w:t>
       </w:r>
     </w:p>
-    <w:bookmarkEnd w:id="34"/>
-    <w:bookmarkEnd w:id="35"/>
+    <w:bookmarkEnd w:id="37"/>
+    <w:bookmarkEnd w:id="38"/>
     <w:sectPr>
       <w:footnotePr>
         <w:numRestart w:val="eachSect"/>

</xml_diff>

<commit_message>
docs(dsl-discount-spec): align README try-it output with runner
Show the runner's real 5-line compute-mode output (was abbreviated);
regenerate README.docx. Advisory reviewer/evaluator finding for t-1ba6.

Refs: t-1ba6
</commit_message>
<xml_diff>
--- a/examples/dsl-discount-spec/README.docx
+++ b/examples/dsl-discount-spec/README.docx
@@ -2843,7 +2843,7 @@
         <w:rPr>
           <w:rStyle w:val="NormalTok"/>
         </w:rPr>
-        <w:t xml:space="preserve">      120</w:t>
+        <w:t xml:space="preserve">           120</w:t>
       </w:r>
       <w:r>
         <w:br/>
@@ -2864,7 +2864,7 @@
         <w:rPr>
           <w:rStyle w:val="NormalTok"/>
         </w:rPr>
-        <w:t xml:space="preserve">        SAVE20</w:t>
+        <w:t xml:space="preserve">             SAVE20</w:t>
       </w:r>
       <w:r>
         <w:br/>
@@ -2885,7 +2885,7 @@
         <w:rPr>
           <w:rStyle w:val="NormalTok"/>
         </w:rPr>
-        <w:t xml:space="preserve">     true</w:t>
+        <w:t xml:space="preserve">          true</w:t>
       </w:r>
       <w:r>
         <w:br/>
@@ -2906,7 +2906,7 @@
         <w:rPr>
           <w:rStyle w:val="NormalTok"/>
         </w:rPr>
-        <w:t xml:space="preserve"> 96</w:t>
+        <w:t xml:space="preserve">      96</w:t>
       </w:r>
       <w:r>
         <w:br/>
@@ -2927,7 +2927,7 @@
         <w:rPr>
           <w:rStyle w:val="NormalTok"/>
         </w:rPr>
-        <w:t xml:space="preserve">      SAVE20 applied</w:t>
+        <w:t xml:space="preserve">           SAVE20 applied</w:t>
       </w:r>
       <w:r>
         <w:br/>
@@ -2960,13 +2960,55 @@
         <w:rPr>
           <w:rStyle w:val="ExtensionTok"/>
         </w:rPr>
+        <w:t xml:space="preserve">amount:</w:t>
+      </w:r>
+      <w:r>
+        <w:rPr>
+          <w:rStyle w:val="NormalTok"/>
+        </w:rPr>
+        <w:t xml:space="preserve">           40</w:t>
+      </w:r>
+      <w:r>
+        <w:br/>
+      </w:r>
+      <w:r>
+        <w:rPr>
+          <w:rStyle w:val="NormalTok"/>
+        </w:rPr>
+        <w:t xml:space="preserve">  </w:t>
+      </w:r>
+      <w:r>
+        <w:rPr>
+          <w:rStyle w:val="ExtensionTok"/>
+        </w:rPr>
+        <w:t xml:space="preserve">code:</w:t>
+      </w:r>
+      <w:r>
+        <w:rPr>
+          <w:rStyle w:val="NormalTok"/>
+        </w:rPr>
+        <w:t xml:space="preserve">             SAVE10</w:t>
+      </w:r>
+      <w:r>
+        <w:br/>
+      </w:r>
+      <w:r>
+        <w:rPr>
+          <w:rStyle w:val="NormalTok"/>
+        </w:rPr>
+        <w:t xml:space="preserve">  </w:t>
+      </w:r>
+      <w:r>
+        <w:rPr>
+          <w:rStyle w:val="ExtensionTok"/>
+        </w:rPr>
         <w:t xml:space="preserve">applied:</w:t>
       </w:r>
       <w:r>
         <w:rPr>
           <w:rStyle w:val="NormalTok"/>
         </w:rPr>
-        <w:t xml:space="preserve">     false</w:t>
+        <w:t xml:space="preserve">          false</w:t>
       </w:r>
       <w:r>
         <w:br/>
@@ -2981,13 +3023,34 @@
         <w:rPr>
           <w:rStyle w:val="ExtensionTok"/>
         </w:rPr>
+        <w:t xml:space="preserve">final_total:</w:t>
+      </w:r>
+      <w:r>
+        <w:rPr>
+          <w:rStyle w:val="NormalTok"/>
+        </w:rPr>
+        <w:t xml:space="preserve">      40</w:t>
+      </w:r>
+      <w:r>
+        <w:br/>
+      </w:r>
+      <w:r>
+        <w:rPr>
+          <w:rStyle w:val="NormalTok"/>
+        </w:rPr>
+        <w:t xml:space="preserve">  </w:t>
+      </w:r>
+      <w:r>
+        <w:rPr>
+          <w:rStyle w:val="ExtensionTok"/>
+        </w:rPr>
         <w:t xml:space="preserve">reason:</w:t>
       </w:r>
       <w:r>
         <w:rPr>
           <w:rStyle w:val="NormalTok"/>
         </w:rPr>
-        <w:t xml:space="preserve">      minimum not met</w:t>
+        <w:t xml:space="preserve">           minimum not met</w:t>
       </w:r>
     </w:p>
     <w:p>

</xml_diff>

<commit_message>
docs(dsl-discount-spec): scenario stays in Acceptance + build instruction + run screenshots
Part 1 now keeps the scenario in Acceptance (source of truth) and replaces
the hand-write-the-.feature step with a reusable agent-facing build
instruction that infers the function from the scenario (no author func def).
Add full-run terminal screenshots (pass + live break) captured from real
runner output; regenerate README.docx. Default JS; Python is a follow-up ask.

Closes: t-f2cf
</commit_message>
<xml_diff>
--- a/examples/dsl-discount-spec/README.docx
+++ b/examples/dsl-discount-spec/README.docx
@@ -2,7 +2,7 @@
 <file path=word/document.xml><?xml version="1.0" encoding="utf-8"?>
 <w:document xmlns:w="http://schemas.openxmlformats.org/wordprocessingml/2006/main" xmlns:m="http://schemas.openxmlformats.org/officeDocument/2006/math" xmlns:r="http://schemas.openxmlformats.org/officeDocument/2006/relationships" xmlns:o="urn:schemas-microsoft-com:office:office" xmlns:v="urn:schemas-microsoft-com:vml" xmlns:w10="urn:schemas-microsoft-com:office:word" xmlns:a="http://schemas.openxmlformats.org/drawingml/2006/main" xmlns:pic="http://schemas.openxmlformats.org/drawingml/2006/picture" xmlns:wp="http://schemas.openxmlformats.org/drawingml/2006/wordprocessingDrawing">
   <w:body>
-    <w:bookmarkStart w:id="45" w:name="X090d5e3927d7b5166545c72cdb7bdebd54c4fbf"/>
+    <w:bookmarkStart w:id="51" w:name="X090d5e3927d7b5166545c72cdb7bdebd54c4fbf"/>
     <w:p>
       <w:pPr>
         <w:pStyle w:val="Heading1"/>
@@ -480,19 +480,38 @@
         <w:t xml:space="preserve"> </w:t>
       </w:r>
       <w:r>
-        <w:t xml:space="preserve">You describe what you want in a canon ticket (the scenario,</w:t>
-      </w:r>
-      <w:r>
-        <w:t xml:space="preserve"> </w:t>
-      </w:r>
-      <w:r>
-        <w:t xml:space="preserve">plus</w:t>
-      </w:r>
-      <w:r>
-        <w:t xml:space="preserve"> </w:t>
-      </w:r>
-      <w:r>
-        <w:t xml:space="preserve">“write these scenarios to a</w:t>
+        <w:t xml:space="preserve">You author the scenario in a canon ticket’s</w:t>
+      </w:r>
+      <w:r>
+        <w:t xml:space="preserve"> </w:t>
+      </w:r>
+      <w:r>
+        <w:rPr>
+          <w:b/>
+          <w:bCs/>
+        </w:rPr>
+        <w:t xml:space="preserve">Acceptance</w:t>
+      </w:r>
+      <w:r>
+        <w:t xml:space="preserve">,</w:t>
+      </w:r>
+      <w:r>
+        <w:t xml:space="preserve"> </w:t>
+      </w:r>
+      <w:r>
+        <w:t xml:space="preserve">add a one-time build instruction (</w:t>
+      </w:r>
+      <w:r>
+        <w:t xml:space="preserve">“build a runner that validates this scenario”</w:t>
+      </w:r>
+      <w:r>
+        <w:t xml:space="preserve">), and the agent</w:t>
+      </w:r>
+      <w:r>
+        <w:t xml:space="preserve"> </w:t>
+      </w:r>
+      <w:r>
+        <w:t xml:space="preserve">produces the</w:t>
       </w:r>
       <w:r>
         <w:t xml:space="preserve"> </w:t>
@@ -504,37 +523,13 @@
         <w:t xml:space="preserve">.feature</w:t>
       </w:r>
       <w:r>
-        <w:t xml:space="preserve"> </w:t>
-      </w:r>
-      <w:r>
-        <w:t xml:space="preserve">file and build a runner that validates them”</w:t>
-      </w:r>
-      <w:r>
-        <w:t xml:space="preserve">), and the</w:t>
-      </w:r>
-      <w:r>
-        <w:t xml:space="preserve"> </w:t>
-      </w:r>
-      <w:r>
-        <w:t xml:space="preserve">agent builds the</w:t>
-      </w:r>
-      <w:r>
-        <w:t xml:space="preserve"> </w:t>
-      </w:r>
-      <w:r>
-        <w:rPr>
-          <w:rStyle w:val="VerbatimChar"/>
-        </w:rPr>
-        <w:t xml:space="preserve">.feature</w:t>
-      </w:r>
-      <w:r>
-        <w:t xml:space="preserve">, the runner, and the rule. canon’s fresh evaluator then grades the work</w:t>
-      </w:r>
-      <w:r>
-        <w:t xml:space="preserve"> </w:t>
-      </w:r>
-      <w:r>
-        <w:t xml:space="preserve">by</w:t>
+        <w:t xml:space="preserve">, the runner, and the rule — inferring the function straight from the</w:t>
+      </w:r>
+      <w:r>
+        <w:t xml:space="preserve"> </w:t>
+      </w:r>
+      <w:r>
+        <w:t xml:space="preserve">scenario, so you never write a function signature. canon’s fresh evaluator then grades the work by</w:t>
       </w:r>
       <w:r>
         <w:t xml:space="preserve"> </w:t>
@@ -550,13 +545,7 @@
         <w:t xml:space="preserve"> </w:t>
       </w:r>
       <w:r>
-        <w:t xml:space="preserve">that runner. You supply the intent and the behavior; the harness builds and checks the</w:t>
-      </w:r>
-      <w:r>
-        <w:t xml:space="preserve"> </w:t>
-      </w:r>
-      <w:r>
-        <w:t xml:space="preserve">rest.</w:t>
+        <w:t xml:space="preserve">that runner. You supply the intent and the behavior; the harness builds and checks the rest.</w:t>
       </w:r>
     </w:p>
     <w:p>
@@ -1439,7 +1428,7 @@
       </w:r>
     </w:p>
     <w:bookmarkEnd w:id="20"/>
-    <w:bookmarkStart w:id="33" w:name="X586ff856d845c7c4dd7f75ebb0568249fd28e6a"/>
+    <w:bookmarkStart w:id="36" w:name="X586ff856d845c7c4dd7f75ebb0568249fd28e6a"/>
     <w:p>
       <w:pPr>
         <w:pStyle w:val="Heading2"/>
@@ -2109,69 +2098,91 @@
           <w:b/>
           <w:bCs/>
         </w:rPr>
-        <w:t xml:space="preserve">Tell the ticket to produce the</w:t>
+        <w:t xml:space="preserve">Add the build instruction — once — so the agent knows how to check it.</w:t>
+      </w:r>
+      <w:r>
+        <w:t xml:space="preserve"> </w:t>
+      </w:r>
+      <w:r>
+        <w:t xml:space="preserve">The scenario you just</w:t>
+      </w:r>
+      <w:r>
+        <w:t xml:space="preserve"> </w:t>
+      </w:r>
+      <w:r>
+        <w:t xml:space="preserve">wrote</w:t>
+      </w:r>
+      <w:r>
+        <w:t xml:space="preserve"> </w:t>
       </w:r>
       <w:r>
         <w:rPr>
           <w:b/>
           <w:bCs/>
         </w:rPr>
-        <w:t xml:space="preserve"> </w:t>
-      </w:r>
-      <w:r>
-        <w:rPr>
-          <w:rStyle w:val="VerbatimChar"/>
+        <w:t xml:space="preserve">stays in Acceptance</w:t>
+      </w:r>
+      <w:r>
+        <w:t xml:space="preserve">: that’s the source of truth, and it’s all a non-engineer needs to</w:t>
+      </w:r>
+      <w:r>
+        <w:t xml:space="preserve"> </w:t>
+      </w:r>
+      <w:r>
+        <w:t xml:space="preserve">write. To spare the newcomer from knowing how to build a runner, add a short, reusable build</w:t>
+      </w:r>
+      <w:r>
+        <w:t xml:space="preserve"> </w:t>
+      </w:r>
+      <w:r>
+        <w:t xml:space="preserve">instruction to</w:t>
+      </w:r>
+      <w:r>
+        <w:t xml:space="preserve"> </w:t>
+      </w:r>
+      <w:r>
+        <w:rPr>
+          <w:rStyle w:val="VerbatimChar"/>
+        </w:rPr>
+        <w:t xml:space="preserve">plan.md</w:t>
+      </w:r>
+      <w:r>
+        <w:t xml:space="preserve"> </w:t>
+      </w:r>
+      <w:r>
+        <w:t xml:space="preserve">(or paste it into the sprint prompt in step 4). Notice it does</w:t>
+      </w:r>
+      <w:r>
+        <w:t xml:space="preserve"> </w:t>
+      </w:r>
+      <w:r>
+        <w:rPr>
           <w:b/>
           <w:bCs/>
         </w:rPr>
-        <w:t xml:space="preserve">.feature</w:t>
-      </w:r>
+        <w:t xml:space="preserve">not</w:t>
+      </w:r>
+      <w:r>
+        <w:t xml:space="preserve"> </w:t>
+      </w:r>
+      <w:r>
+        <w:t xml:space="preserve">name a function signature — the agent infers that from the scenario:</w:t>
+      </w:r>
+    </w:p>
+    <w:p>
+      <w:pPr>
+        <w:pStyle w:val="Compact"/>
+        <w:numPr>
+          <w:ilvl w:val="0"/>
+          <w:numId w:val="1000"/>
+        </w:numPr>
+      </w:pPr>
       <w:r>
         <w:rPr>
           <w:b/>
           <w:bCs/>
         </w:rPr>
-        <w:t xml:space="preserve"> </w:t>
-      </w:r>
-      <w:r>
-        <w:rPr>
-          <w:b/>
-          <w:bCs/>
-        </w:rPr>
-        <w:t xml:space="preserve">and the runner.</w:t>
-      </w:r>
-      <w:r>
-        <w:t xml:space="preserve"> </w:t>
-      </w:r>
-      <w:r>
-        <w:t xml:space="preserve">Add a short</w:t>
-      </w:r>
-      <w:r>
-        <w:t xml:space="preserve"> </w:t>
-      </w:r>
-      <w:r>
-        <w:rPr>
-          <w:rStyle w:val="VerbatimChar"/>
-        </w:rPr>
-        <w:t xml:space="preserve">plan.md</w:t>
-      </w:r>
-      <w:r>
-        <w:t xml:space="preserve"> </w:t>
-      </w:r>
-      <w:r>
-        <w:t xml:space="preserve">note (or put</w:t>
-      </w:r>
-      <w:r>
-        <w:t xml:space="preserve"> </w:t>
-      </w:r>
-      <w:r>
-        <w:t xml:space="preserve">it in the sprint prompt below) with the build instruction — this is what spares the newcomer from</w:t>
-      </w:r>
-      <w:r>
-        <w:t xml:space="preserve"> </w:t>
-      </w:r>
-      <w:r>
-        <w:t xml:space="preserve">knowing how to write a runner:</w:t>
+        <w:t xml:space="preserve">Build instruction (for the implementing agent)</w:t>
       </w:r>
     </w:p>
     <w:p>
@@ -2183,19 +2194,7 @@
         </w:numPr>
       </w:pPr>
       <w:r>
-        <w:t xml:space="preserve">Write the three scenarios above to</w:t>
-      </w:r>
-      <w:r>
-        <w:t xml:space="preserve"> </w:t>
-      </w:r>
-      <w:r>
-        <w:rPr>
-          <w:rStyle w:val="VerbatimChar"/>
-        </w:rPr>
-        <w:t xml:space="preserve">specs/discount.feature</w:t>
-      </w:r>
-      <w:r>
-        <w:t xml:space="preserve">.</w:t>
+        <w:t xml:space="preserve">Treat the scenario(s) in Acceptance as the behavior contract.</w:t>
       </w:r>
     </w:p>
     <w:p>
@@ -2207,49 +2206,56 @@
         </w:numPr>
       </w:pPr>
       <w:r>
-        <w:t xml:space="preserve">Put the rule in</w:t>
-      </w:r>
-      <w:r>
-        <w:t xml:space="preserve"> </w:t>
-      </w:r>
-      <w:r>
-        <w:rPr>
-          <w:rStyle w:val="VerbatimChar"/>
-        </w:rPr>
-        <w:t xml:space="preserve">app/discount.js</w:t>
-      </w:r>
-      <w:r>
-        <w:t xml:space="preserve"> </w:t>
-      </w:r>
-      <w:r>
-        <w:t xml:space="preserve">as</w:t>
-      </w:r>
-      <w:r>
-        <w:t xml:space="preserve"> </w:t>
-      </w:r>
-      <w:r>
-        <w:rPr>
-          <w:rStyle w:val="VerbatimChar"/>
-        </w:rPr>
-        <w:t xml:space="preserve">apply_discount(cartTotal, code)</w:t>
-      </w:r>
-      <w:r>
-        <w:t xml:space="preserve"> </w:t>
-      </w:r>
-      <w:r>
-        <w:t xml:space="preserve">returning</w:t>
-      </w:r>
-      <w:r>
-        <w:t xml:space="preserve"> </w:t>
-      </w:r>
-      <w:r>
-        <w:rPr>
-          <w:rStyle w:val="VerbatimChar"/>
-        </w:rPr>
-        <w:t xml:space="preserve">{ applied, final_total, reason }</w:t>
-      </w:r>
-      <w:r>
-        <w:t xml:space="preserve">.</w:t>
+        <w:t xml:space="preserve">Extract them verbatim into</w:t>
+      </w:r>
+      <w:r>
+        <w:t xml:space="preserve"> </w:t>
+      </w:r>
+      <w:r>
+        <w:rPr>
+          <w:rStyle w:val="VerbatimChar"/>
+        </w:rPr>
+        <w:t xml:space="preserve">specs/discount.feature</w:t>
+      </w:r>
+      <w:r>
+        <w:t xml:space="preserve">. That file is a</w:t>
+      </w:r>
+      <w:r>
+        <w:t xml:space="preserve"> </w:t>
+      </w:r>
+      <w:r>
+        <w:rPr>
+          <w:i/>
+          <w:iCs/>
+        </w:rPr>
+        <w:t xml:space="preserve">derived artifact</w:t>
+      </w:r>
+      <w:r>
+        <w:t xml:space="preserve"> </w:t>
+      </w:r>
+      <w:r>
+        <w:t xml:space="preserve">—</w:t>
+      </w:r>
+      <w:r>
+        <w:t xml:space="preserve"> </w:t>
+      </w:r>
+      <w:r>
+        <w:t xml:space="preserve">Acceptance stays the source; don’t hand-edit the</w:t>
+      </w:r>
+      <w:r>
+        <w:t xml:space="preserve"> </w:t>
+      </w:r>
+      <w:r>
+        <w:rPr>
+          <w:rStyle w:val="VerbatimChar"/>
+        </w:rPr>
+        <w:t xml:space="preserve">.feature</w:t>
+      </w:r>
+      <w:r>
+        <w:t xml:space="preserve"> </w:t>
+      </w:r>
+      <w:r>
+        <w:t xml:space="preserve">afterward.</w:t>
       </w:r>
     </w:p>
     <w:p>
@@ -2261,91 +2267,43 @@
         </w:numPr>
       </w:pPr>
       <w:r>
-        <w:t xml:space="preserve">Build</w:t>
-      </w:r>
-      <w:r>
-        <w:t xml:space="preserve"> </w:t>
-      </w:r>
-      <w:r>
-        <w:rPr>
-          <w:rStyle w:val="VerbatimChar"/>
-        </w:rPr>
-        <w:t xml:space="preserve">app/dsl_runner.js</w:t>
-      </w:r>
-      <w:r>
-        <w:t xml:space="preserve"> </w:t>
-      </w:r>
-      <w:r>
-        <w:t xml:space="preserve">— a small fixed-pattern Node runner that reads</w:t>
-      </w:r>
-      <w:r>
-        <w:t xml:space="preserve"> </w:t>
-      </w:r>
-      <w:r>
-        <w:rPr>
-          <w:rStyle w:val="VerbatimChar"/>
-        </w:rPr>
-        <w:t xml:space="preserve">specs/discount.feature</w:t>
-      </w:r>
-      <w:r>
-        <w:t xml:space="preserve">, runs</w:t>
-      </w:r>
-      <w:r>
-        <w:t xml:space="preserve"> </w:t>
-      </w:r>
-      <w:r>
-        <w:rPr>
-          <w:rStyle w:val="VerbatimChar"/>
-        </w:rPr>
-        <w:t xml:space="preserve">apply_discount</w:t>
-      </w:r>
-      <w:r>
-        <w:t xml:space="preserve"> </w:t>
-      </w:r>
-      <w:r>
-        <w:t xml:space="preserve">for each scenario, prints</w:t>
-      </w:r>
-      <w:r>
-        <w:t xml:space="preserve"> </w:t>
-      </w:r>
-      <w:r>
-        <w:rPr>
-          <w:rStyle w:val="VerbatimChar"/>
-        </w:rPr>
-        <w:t xml:space="preserve">[PASS]</w:t>
-      </w:r>
-      <w:r>
-        <w:t xml:space="preserve">/</w:t>
-      </w:r>
-      <w:r>
-        <w:rPr>
-          <w:rStyle w:val="VerbatimChar"/>
-        </w:rPr>
-        <w:t xml:space="preserve">[FAIL]</w:t>
-      </w:r>
-      <w:r>
-        <w:t xml:space="preserve">,</w:t>
-      </w:r>
-      <w:r>
-        <w:t xml:space="preserve"> </w:t>
-      </w:r>
-      <w:r>
-        <w:t xml:space="preserve">and exits</w:t>
-      </w:r>
-      <w:r>
-        <w:t xml:space="preserve"> </w:t>
-      </w:r>
-      <w:r>
-        <w:rPr>
-          <w:rStyle w:val="VerbatimChar"/>
-        </w:rPr>
-        <w:t xml:space="preserve">0</w:t>
-      </w:r>
-      <w:r>
-        <w:t xml:space="preserve"> </w:t>
-      </w:r>
-      <w:r>
-        <w:t xml:space="preserve">only if all pass.</w:t>
+        <w:t xml:space="preserve">Infer the function under test from the scenario:</w:t>
+      </w:r>
+      <w:r>
+        <w:t xml:space="preserve"> </w:t>
+      </w:r>
+      <w:r>
+        <w:rPr>
+          <w:rStyle w:val="VerbatimChar"/>
+        </w:rPr>
+        <w:t xml:space="preserve">Given</w:t>
+      </w:r>
+      <w:r>
+        <w:t xml:space="preserve"> </w:t>
+      </w:r>
+      <w:r>
+        <w:t xml:space="preserve">lines are the inputs,</w:t>
+      </w:r>
+      <w:r>
+        <w:t xml:space="preserve"> </w:t>
+      </w:r>
+      <w:r>
+        <w:rPr>
+          <w:rStyle w:val="VerbatimChar"/>
+        </w:rPr>
+        <w:t xml:space="preserve">Then</w:t>
+      </w:r>
+      <w:r>
+        <w:t xml:space="preserve"> </w:t>
+      </w:r>
+      <w:r>
+        <w:t xml:space="preserve">lines are</w:t>
+      </w:r>
+      <w:r>
+        <w:t xml:space="preserve"> </w:t>
+      </w:r>
+      <w:r>
+        <w:t xml:space="preserve">the output fields. You choose the name and signature — the author doesn’t specify it.</w:t>
       </w:r>
     </w:p>
     <w:p>
@@ -2357,7 +2315,124 @@
         </w:numPr>
       </w:pPr>
       <w:r>
-        <w:t xml:space="preserve">Don’t edit the spec to make the check pass; if the spec seems wrong, ask.</w:t>
+        <w:t xml:space="preserve">Implement it in</w:t>
+      </w:r>
+      <w:r>
+        <w:t xml:space="preserve"> </w:t>
+      </w:r>
+      <w:r>
+        <w:rPr>
+          <w:rStyle w:val="VerbatimChar"/>
+        </w:rPr>
+        <w:t xml:space="preserve">app/discount.js</w:t>
+      </w:r>
+      <w:r>
+        <w:t xml:space="preserve">, and build</w:t>
+      </w:r>
+      <w:r>
+        <w:t xml:space="preserve"> </w:t>
+      </w:r>
+      <w:r>
+        <w:rPr>
+          <w:rStyle w:val="VerbatimChar"/>
+        </w:rPr>
+        <w:t xml:space="preserve">app/dsl_runner.js</w:t>
+      </w:r>
+      <w:r>
+        <w:t xml:space="preserve"> </w:t>
+      </w:r>
+      <w:r>
+        <w:t xml:space="preserve">— a small fixed-pattern Node</w:t>
+      </w:r>
+      <w:r>
+        <w:t xml:space="preserve"> </w:t>
+      </w:r>
+      <w:r>
+        <w:t xml:space="preserve">runner that recognizes exactly this</w:t>
+      </w:r>
+      <w:r>
+        <w:t xml:space="preserve"> </w:t>
+      </w:r>
+      <w:r>
+        <w:rPr>
+          <w:rStyle w:val="VerbatimChar"/>
+        </w:rPr>
+        <w:t xml:space="preserve">.feature</w:t>
+      </w:r>
+      <w:r>
+        <w:t xml:space="preserve">’s step shapes, runs the function for each</w:t>
+      </w:r>
+      <w:r>
+        <w:t xml:space="preserve"> </w:t>
+      </w:r>
+      <w:r>
+        <w:t xml:space="preserve">scenario, prints</w:t>
+      </w:r>
+      <w:r>
+        <w:t xml:space="preserve"> </w:t>
+      </w:r>
+      <w:r>
+        <w:rPr>
+          <w:rStyle w:val="VerbatimChar"/>
+        </w:rPr>
+        <w:t xml:space="preserve">[PASS]</w:t>
+      </w:r>
+      <w:r>
+        <w:t xml:space="preserve">/</w:t>
+      </w:r>
+      <w:r>
+        <w:rPr>
+          <w:rStyle w:val="VerbatimChar"/>
+        </w:rPr>
+        <w:t xml:space="preserve">[FAIL]</w:t>
+      </w:r>
+      <w:r>
+        <w:t xml:space="preserve">, and exits</w:t>
+      </w:r>
+      <w:r>
+        <w:t xml:space="preserve"> </w:t>
+      </w:r>
+      <w:r>
+        <w:rPr>
+          <w:rStyle w:val="VerbatimChar"/>
+        </w:rPr>
+        <w:t xml:space="preserve">0</w:t>
+      </w:r>
+      <w:r>
+        <w:t xml:space="preserve"> </w:t>
+      </w:r>
+      <w:r>
+        <w:t xml:space="preserve">only if all pass.</w:t>
+      </w:r>
+    </w:p>
+    <w:p>
+      <w:pPr>
+        <w:pStyle w:val="Compact"/>
+        <w:numPr>
+          <w:ilvl w:val="1"/>
+          <w:numId w:val="1004"/>
+        </w:numPr>
+      </w:pPr>
+      <w:r>
+        <w:t xml:space="preserve">Name that runner command in Acceptance’s</w:t>
+      </w:r>
+      <w:r>
+        <w:t xml:space="preserve"> </w:t>
+      </w:r>
+      <w:r>
+        <w:rPr>
+          <w:rStyle w:val="VerbatimChar"/>
+        </w:rPr>
+        <w:t xml:space="preserve">## Test Plan</w:t>
+      </w:r>
+      <w:r>
+        <w:t xml:space="preserve">. Don’t edit the spec to make the check</w:t>
+      </w:r>
+      <w:r>
+        <w:t xml:space="preserve"> </w:t>
+      </w:r>
+      <w:r>
+        <w:t xml:space="preserve">pass; if the inputs, outputs, or naming are ambiguous, ask before implementing.</w:t>
       </w:r>
     </w:p>
     <w:p>
@@ -2368,88 +2443,167 @@
         </w:numPr>
       </w:pPr>
       <w:r>
-        <w:t xml:space="preserve">You can also name the runner command right next to the scenario, using a</w:t>
-      </w:r>
-      <w:r>
-        <w:t xml:space="preserve"> </w:t>
-      </w:r>
-      <w:r>
-        <w:rPr>
-          <w:rStyle w:val="VerbatimChar"/>
-        </w:rPr>
-        <w:t xml:space="preserve">```gherkin-file</w:t>
-      </w:r>
-      <w:r>
-        <w:t xml:space="preserve"> </w:t>
-      </w:r>
-      <w:r>
-        <w:t xml:space="preserve">reference with a</w:t>
-      </w:r>
-      <w:r>
-        <w:t xml:space="preserve"> </w:t>
-      </w:r>
-      <w:r>
-        <w:rPr>
-          <w:rStyle w:val="VerbatimChar"/>
-        </w:rPr>
-        <w:t xml:space="preserve">runner:</w:t>
-      </w:r>
-      <w:r>
-        <w:t xml:space="preserve"> </w:t>
-      </w:r>
-      <w:r>
-        <w:t xml:space="preserve">line, so the command travels with the spec:</w:t>
-      </w:r>
-    </w:p>
-    <w:p>
-      <w:pPr>
-        <w:pStyle w:val="SourceCode"/>
+        <w:t xml:space="preserve">This is the move that closes the</w:t>
+      </w:r>
+      <w:r>
+        <w:t xml:space="preserve"> </w:t>
+      </w:r>
+      <w:r>
+        <w:t xml:space="preserve">“but how do I even test a</w:t>
+      </w:r>
+      <w:r>
+        <w:t xml:space="preserve"> </w:t>
+      </w:r>
+      <w:r>
+        <w:rPr>
+          <w:rStyle w:val="VerbatimChar"/>
+        </w:rPr>
+        <w:t xml:space="preserve">.feature</w:t>
+      </w:r>
+      <w:r>
+        <w:t xml:space="preserve">?”</w:t>
+      </w:r>
+      <w:r>
+        <w:t xml:space="preserve"> </w:t>
+      </w:r>
+      <w:r>
+        <w:t xml:space="preserve">gap: the author writes only</w:t>
+      </w:r>
+      <w:r>
+        <w:t xml:space="preserve"> </w:t>
+      </w:r>
+      <w:r>
+        <w:t xml:space="preserve">the readable rule; the agent turns it into a</w:t>
+      </w:r>
+      <w:r>
+        <w:t xml:space="preserve"> </w:t>
+      </w:r>
+      <w:r>
+        <w:rPr>
+          <w:rStyle w:val="VerbatimChar"/>
+        </w:rPr>
+        <w:t xml:space="preserve">.feature</w:t>
+      </w:r>
+      <w:r>
+        <w:t xml:space="preserve">, a function, and a runner — and canon’s</w:t>
+      </w:r>
+      <w:r>
+        <w:t xml:space="preserve"> </w:t>
+      </w:r>
+      <w:r>
+        <w:t xml:space="preserve">fresh evaluator later grades it by</w:t>
+      </w:r>
+      <w:r>
+        <w:t xml:space="preserve"> </w:t>
+      </w:r>
+      <w:r>
+        <w:rPr>
+          <w:i/>
+          <w:iCs/>
+        </w:rPr>
+        <w:t xml:space="preserve">running</w:t>
+      </w:r>
+      <w:r>
+        <w:t xml:space="preserve"> </w:t>
+      </w:r>
+      <w:r>
+        <w:t xml:space="preserve">that runner. (Default is JavaScript —</w:t>
+      </w:r>
+      <w:r>
+        <w:t xml:space="preserve"> </w:t>
+      </w:r>
+      <w:r>
+        <w:rPr>
+          <w:rStyle w:val="VerbatimChar"/>
+        </w:rPr>
+        <w:t xml:space="preserve">app/discount.js</w:t>
+      </w:r>
+      <w:r>
+        <w:t xml:space="preserve">.</w:t>
+      </w:r>
+      <w:r>
+        <w:t xml:space="preserve"> </w:t>
+      </w:r>
+      <w:r>
+        <w:t xml:space="preserve">Want Python instead? Just tell the agent to implement it in</w:t>
+      </w:r>
+      <w:r>
+        <w:t xml:space="preserve"> </w:t>
+      </w:r>
+      <w:r>
+        <w:rPr>
+          <w:rStyle w:val="VerbatimChar"/>
+        </w:rPr>
+        <w:t xml:space="preserve">discount.py</w:t>
+      </w:r>
+      <w:r>
+        <w:t xml:space="preserve"> </w:t>
+      </w:r>
+      <w:r>
+        <w:t xml:space="preserve">with a Python runner; the</w:t>
+      </w:r>
+      <w:r>
+        <w:t xml:space="preserve"> </w:t>
+      </w:r>
+      <w:r>
+        <w:t xml:space="preserve">scenario and this instruction don’t change.)</w:t>
+      </w:r>
+    </w:p>
+    <w:p>
+      <w:pPr>
         <w:numPr>
           <w:ilvl w:val="0"/>
           <w:numId w:val="1000"/>
         </w:numPr>
       </w:pPr>
       <w:r>
-        <w:rPr>
-          <w:rStyle w:val="VerbatimChar"/>
-        </w:rPr>
-        <w:t xml:space="preserve">features/discount.feature</w:t>
-      </w:r>
-      <w:r>
-        <w:br/>
-      </w:r>
-      <w:r>
-        <w:rPr>
-          <w:rStyle w:val="VerbatimChar"/>
-        </w:rPr>
-        <w:t xml:space="preserve">runner: node dsl_runner.js</w:t>
-      </w:r>
-    </w:p>
-    <w:p>
-      <w:pPr>
-        <w:numPr>
-          <w:ilvl w:val="0"/>
-          <w:numId w:val="1000"/>
-        </w:numPr>
-      </w:pPr>
-      <w:r>
-        <w:t xml:space="preserve">The board renders the referenced scenarios and shows the</w:t>
-      </w:r>
-      <w:r>
-        <w:t xml:space="preserve"> </w:t>
-      </w:r>
-      <w:r>
-        <w:rPr>
-          <w:b/>
-          <w:bCs/>
-        </w:rPr>
-        <w:t xml:space="preserve">resolved runner command</w:t>
-      </w:r>
-      <w:r>
-        <w:t xml:space="preserve"> </w:t>
-      </w:r>
-      <w:r>
-        <w:t xml:space="preserve">as a chip</w:t>
+        <w:t xml:space="preserve">Optionally, the runner command can travel</w:t>
+      </w:r>
+      <w:r>
+        <w:t xml:space="preserve"> </w:t>
+      </w:r>
+      <w:r>
+        <w:rPr>
+          <w:i/>
+          <w:iCs/>
+        </w:rPr>
+        <w:t xml:space="preserve">with</w:t>
+      </w:r>
+      <w:r>
+        <w:t xml:space="preserve"> </w:t>
+      </w:r>
+      <w:r>
+        <w:t xml:space="preserve">the spec: if you reference the scenario via a</w:t>
+      </w:r>
+      <w:r>
+        <w:t xml:space="preserve"> </w:t>
+      </w:r>
+      <w:r>
+        <w:rPr>
+          <w:rStyle w:val="VerbatimChar"/>
+        </w:rPr>
+        <w:t xml:space="preserve">```gherkin-file</w:t>
+      </w:r>
+      <w:r>
+        <w:t xml:space="preserve"> </w:t>
+      </w:r>
+      <w:r>
+        <w:t xml:space="preserve">block with a</w:t>
+      </w:r>
+      <w:r>
+        <w:t xml:space="preserve"> </w:t>
+      </w:r>
+      <w:r>
+        <w:rPr>
+          <w:rStyle w:val="VerbatimChar"/>
+        </w:rPr>
+        <w:t xml:space="preserve">runner:</w:t>
+      </w:r>
+      <w:r>
+        <w:t xml:space="preserve"> </w:t>
+      </w:r>
+      <w:r>
+        <w:t xml:space="preserve">line, the board renders the resolved command as a chip</w:t>
       </w:r>
       <w:r>
         <w:t xml:space="preserve"> </w:t>
@@ -2590,73 +2744,19 @@
         <w:t xml:space="preserve">sprint start &lt;id&gt;</w:t>
       </w:r>
       <w:r>
-        <w:t xml:space="preserve">). Per its Acceptance scenario and plan,</w:t>
-      </w:r>
-      <w:r>
-        <w:t xml:space="preserve"> </w:t>
-      </w:r>
-      <w:r>
-        <w:t xml:space="preserve">write</w:t>
-      </w:r>
-      <w:r>
-        <w:t xml:space="preserve"> </w:t>
-      </w:r>
-      <w:r>
-        <w:rPr>
-          <w:rStyle w:val="VerbatimChar"/>
-        </w:rPr>
-        <w:t xml:space="preserve">specs/discount.feature</w:t>
-      </w:r>
-      <w:r>
-        <w:t xml:space="preserve">, implement the rule in</w:t>
-      </w:r>
-      <w:r>
-        <w:t xml:space="preserve"> </w:t>
-      </w:r>
-      <w:r>
-        <w:rPr>
-          <w:rStyle w:val="VerbatimChar"/>
-        </w:rPr>
-        <w:t xml:space="preserve">app/discount.js</w:t>
-      </w:r>
-      <w:r>
-        <w:t xml:space="preserve">, and build</w:t>
-      </w:r>
-      <w:r>
-        <w:t xml:space="preserve"> </w:t>
-      </w:r>
-      <w:r>
-        <w:rPr>
-          <w:rStyle w:val="VerbatimChar"/>
-        </w:rPr>
-        <w:t xml:space="preserve">app/dsl_runner.js</w:t>
-      </w:r>
-      <w:r>
-        <w:t xml:space="preserve"> </w:t>
-      </w:r>
-      <w:r>
-        <w:t xml:space="preserve">so that</w:t>
-      </w:r>
-      <w:r>
-        <w:t xml:space="preserve"> </w:t>
-      </w:r>
-      <w:r>
-        <w:rPr>
-          <w:rStyle w:val="VerbatimChar"/>
-        </w:rPr>
-        <w:t xml:space="preserve">node dsl_runner.js specs/discount.feature</w:t>
-      </w:r>
-      <w:r>
-        <w:t xml:space="preserve"> </w:t>
-      </w:r>
-      <w:r>
-        <w:t xml:space="preserve">exits 0. Don’t edit the</w:t>
-      </w:r>
-      <w:r>
-        <w:t xml:space="preserve"> </w:t>
-      </w:r>
-      <w:r>
-        <w:t xml:space="preserve">spec or the runner to force a pass.</w:t>
+        <w:t xml:space="preserve">) and implement it per its Acceptance scenario</w:t>
+      </w:r>
+      <w:r>
+        <w:t xml:space="preserve"> </w:t>
+      </w:r>
+      <w:r>
+        <w:t xml:space="preserve">and the build instruction in the plan. Ask me anything ambiguous first; after I approve the plan,</w:t>
+      </w:r>
+      <w:r>
+        <w:t xml:space="preserve"> </w:t>
+      </w:r>
+      <w:r>
+        <w:t xml:space="preserve">build it — don’t edit the spec or the runner to force a pass.</w:t>
       </w:r>
     </w:p>
     <w:p>
@@ -2667,7 +2767,52 @@
         </w:numPr>
       </w:pPr>
       <w:r>
-        <w:t xml:space="preserve">Review the plan, then approve. The agent writes the three files.</w:t>
+        <w:t xml:space="preserve">Review the plan, then approve. The agent writes</w:t>
+      </w:r>
+      <w:r>
+        <w:t xml:space="preserve"> </w:t>
+      </w:r>
+      <w:r>
+        <w:rPr>
+          <w:rStyle w:val="VerbatimChar"/>
+        </w:rPr>
+        <w:t xml:space="preserve">specs/discount.feature</w:t>
+      </w:r>
+      <w:r>
+        <w:t xml:space="preserve"> </w:t>
+      </w:r>
+      <w:r>
+        <w:t xml:space="preserve">(from the Acceptance</w:t>
+      </w:r>
+      <w:r>
+        <w:t xml:space="preserve"> </w:t>
+      </w:r>
+      <w:r>
+        <w:t xml:space="preserve">scenario), the inferred rule in</w:t>
+      </w:r>
+      <w:r>
+        <w:t xml:space="preserve"> </w:t>
+      </w:r>
+      <w:r>
+        <w:rPr>
+          <w:rStyle w:val="VerbatimChar"/>
+        </w:rPr>
+        <w:t xml:space="preserve">app/discount.js</w:t>
+      </w:r>
+      <w:r>
+        <w:t xml:space="preserve">, and the runner</w:t>
+      </w:r>
+      <w:r>
+        <w:t xml:space="preserve"> </w:t>
+      </w:r>
+      <w:r>
+        <w:rPr>
+          <w:rStyle w:val="VerbatimChar"/>
+        </w:rPr>
+        <w:t xml:space="preserve">app/dsl_runner.js</w:t>
+      </w:r>
+      <w:r>
+        <w:t xml:space="preserve">.</w:t>
       </w:r>
     </w:p>
     <w:p>
@@ -3055,12 +3200,75 @@
     </w:p>
     <w:p>
       <w:pPr>
+        <w:pStyle w:val="CaptionedFigure"/>
         <w:numPr>
           <w:ilvl w:val="0"/>
           <w:numId w:val="1000"/>
         </w:numPr>
       </w:pPr>
       <w:r>
+        <w:drawing>
+          <wp:inline>
+            <wp:extent cx="5334000" cy="2773680"/>
+            <wp:effectExtent b="0" l="0" r="0" t="0"/>
+            <wp:docPr descr="Terminal: node dsl_runner.js specs/discount.feature prints three green [PASS] lines and exits 0, then two try-it runs (120/SAVE20 → 96, 40/SAVE10 → minimum not met) print the computed applied/final_total/reason" title="" id="34" name="Picture"/>
+            <a:graphic>
+              <a:graphicData uri="http://schemas.openxmlformats.org/drawingml/2006/picture">
+                <pic:pic>
+                  <pic:nvPicPr>
+                    <pic:cNvPr descr="images/runner-pass.png" id="35" name="Picture"/>
+                    <pic:cNvPicPr>
+                      <a:picLocks noChangeArrowheads="1" noChangeAspect="1"/>
+                    </pic:cNvPicPr>
+                  </pic:nvPicPr>
+                  <pic:blipFill>
+                    <a:blip r:embed="rId33"/>
+                    <a:stretch>
+                      <a:fillRect/>
+                    </a:stretch>
+                  </pic:blipFill>
+                  <pic:spPr bwMode="auto">
+                    <a:xfrm>
+                      <a:off x="0" y="0"/>
+                      <a:ext cx="5334000" cy="2773680"/>
+                    </a:xfrm>
+                    <a:prstGeom prst="rect">
+                      <a:avLst/>
+                    </a:prstGeom>
+                    <a:noFill/>
+                    <a:ln w="9525">
+                      <a:noFill/>
+                      <a:headEnd/>
+                      <a:tailEnd/>
+                    </a:ln>
+                  </pic:spPr>
+                </pic:pic>
+              </a:graphicData>
+            </a:graphic>
+          </wp:inline>
+        </w:drawing>
+      </w:r>
+    </w:p>
+    <w:p>
+      <w:pPr>
+        <w:pStyle w:val="ImageCaption"/>
+        <w:numPr>
+          <w:ilvl w:val="0"/>
+          <w:numId w:val="1000"/>
+        </w:numPr>
+      </w:pPr>
+      <w:r>
+        <w:t xml:space="preserve">Terminal: node dsl_runner.js specs/discount.feature prints three green [PASS] lines and exits 0, then two try-it runs (120/SAVE20 → 96, 40/SAVE10 → minimum not met) print the computed applied/final_total/reason</w:t>
+      </w:r>
+    </w:p>
+    <w:p>
+      <w:pPr>
+        <w:numPr>
+          <w:ilvl w:val="0"/>
+          <w:numId w:val="1000"/>
+        </w:numPr>
+      </w:pPr>
+      <w:r>
         <w:t xml:space="preserve">That distinction is the lesson:</w:t>
       </w:r>
       <w:r>
@@ -3111,8 +3319,8 @@
         <w:t xml:space="preserve">just runs the rule. Only the first can fail.</w:t>
       </w:r>
     </w:p>
-    <w:bookmarkEnd w:id="33"/>
-    <w:bookmarkStart w:id="34" w:name="part-2-sprint-the-browser-app"/>
+    <w:bookmarkEnd w:id="36"/>
+    <w:bookmarkStart w:id="37" w:name="part-2-sprint-the-browser-app"/>
     <w:p>
       <w:pPr>
         <w:pStyle w:val="Heading2"/>
@@ -3409,8 +3617,8 @@
         <w:t xml:space="preserve">, it’s running the very rule the scenarios already vouch for.</w:t>
       </w:r>
     </w:p>
-    <w:bookmarkEnd w:id="34"/>
-    <w:bookmarkStart w:id="35" w:name="X3225df3d367c92eb2cd7b50a65d90b01ba60acc"/>
+    <w:bookmarkEnd w:id="37"/>
+    <w:bookmarkStart w:id="41" w:name="X3225df3d367c92eb2cd7b50a65d90b01ba60acc"/>
     <w:p>
       <w:pPr>
         <w:pStyle w:val="Heading2"/>
@@ -3515,12 +3723,87 @@
     </w:p>
     <w:p>
       <w:pPr>
+        <w:pStyle w:val="CaptionedFigure"/>
         <w:numPr>
           <w:ilvl w:val="0"/>
           <w:numId w:val="1000"/>
         </w:numPr>
       </w:pPr>
       <w:r>
+        <w:drawing>
+          <wp:inline>
+            <wp:extent cx="5334000" cy="1641230"/>
+            <wp:effectExtent b="0" l="0" r="0" t="0"/>
+            <wp:docPr descr="Terminal: after the minimum-cart check is removed, node dsl_runner.js specs/discount.feature prints [PASS], a red [FAIL] on “Valid code below minimum is rejected” naming the exact applied/reason mismatch, then [PASS], and exits 1" title="" id="39" name="Picture"/>
+            <a:graphic>
+              <a:graphicData uri="http://schemas.openxmlformats.org/drawingml/2006/picture">
+                <pic:pic>
+                  <pic:nvPicPr>
+                    <pic:cNvPr descr="images/runner-break.png" id="40" name="Picture"/>
+                    <pic:cNvPicPr>
+                      <a:picLocks noChangeArrowheads="1" noChangeAspect="1"/>
+                    </pic:cNvPicPr>
+                  </pic:nvPicPr>
+                  <pic:blipFill>
+                    <a:blip r:embed="rId38"/>
+                    <a:stretch>
+                      <a:fillRect/>
+                    </a:stretch>
+                  </pic:blipFill>
+                  <pic:spPr bwMode="auto">
+                    <a:xfrm>
+                      <a:off x="0" y="0"/>
+                      <a:ext cx="5334000" cy="1641230"/>
+                    </a:xfrm>
+                    <a:prstGeom prst="rect">
+                      <a:avLst/>
+                    </a:prstGeom>
+                    <a:noFill/>
+                    <a:ln w="9525">
+                      <a:noFill/>
+                      <a:headEnd/>
+                      <a:tailEnd/>
+                    </a:ln>
+                  </pic:spPr>
+                </pic:pic>
+              </a:graphicData>
+            </a:graphic>
+          </wp:inline>
+        </w:drawing>
+      </w:r>
+    </w:p>
+    <w:p>
+      <w:pPr>
+        <w:pStyle w:val="ImageCaption"/>
+        <w:numPr>
+          <w:ilvl w:val="0"/>
+          <w:numId w:val="1000"/>
+        </w:numPr>
+      </w:pPr>
+      <w:r>
+        <w:t xml:space="preserve">Terminal: after the minimum-cart check is removed, node dsl_runner.js specs/discount.feature prints [PASS], a red [FAIL] on</w:t>
+      </w:r>
+      <w:r>
+        <w:t xml:space="preserve"> </w:t>
+      </w:r>
+      <w:r>
+        <w:t xml:space="preserve">“Valid code below minimum is rejected”</w:t>
+      </w:r>
+      <w:r>
+        <w:t xml:space="preserve"> </w:t>
+      </w:r>
+      <w:r>
+        <w:t xml:space="preserve">naming the exact applied/reason mismatch, then [PASS], and exits 1</w:t>
+      </w:r>
+    </w:p>
+    <w:p>
+      <w:pPr>
+        <w:numPr>
+          <w:ilvl w:val="0"/>
+          <w:numId w:val="1000"/>
+        </w:numPr>
+      </w:pPr>
+      <w:r>
         <w:t xml:space="preserve">An exact, specific mismatch — exit code 1. Reload</w:t>
       </w:r>
       <w:r>
@@ -3866,8 +4149,8 @@
         <w:t xml:space="preserve">tracked as a separate improvement.</w:t>
       </w:r>
     </w:p>
-    <w:bookmarkEnd w:id="35"/>
-    <w:bookmarkStart w:id="36" w:name="the-spec-annotated"/>
+    <w:bookmarkEnd w:id="41"/>
+    <w:bookmarkStart w:id="42" w:name="the-spec-annotated"/>
     <w:p>
       <w:pPr>
         <w:pStyle w:val="Heading2"/>
@@ -3984,8 +4267,8 @@
         <w:t xml:space="preserve">steps; a spec that’s readable but unrun is just a comment.</w:t>
       </w:r>
     </w:p>
-    <w:bookmarkEnd w:id="36"/>
-    <w:bookmarkStart w:id="37" w:name="the-runner-annotated"/>
+    <w:bookmarkEnd w:id="42"/>
+    <w:bookmarkStart w:id="43" w:name="the-runner-annotated"/>
     <w:p>
       <w:pPr>
         <w:pStyle w:val="Heading2"/>
@@ -4087,8 +4370,8 @@
         <w:t xml:space="preserve">shapes, not switching to free-text parsing.</w:t>
       </w:r>
     </w:p>
-    <w:bookmarkEnd w:id="37"/>
-    <w:bookmarkStart w:id="38" w:name="X056f9cf604050148bb8cafc2ac1d16699dcdd43"/>
+    <w:bookmarkEnd w:id="43"/>
+    <w:bookmarkStart w:id="44" w:name="X056f9cf604050148bb8cafc2ac1d16699dcdd43"/>
     <w:p>
       <w:pPr>
         <w:pStyle w:val="Heading2"/>
@@ -4345,8 +4628,8 @@
         <w:t xml:space="preserve">original and is what canon’s own docs reference — pick whichever you prefer.</w:t>
       </w:r>
     </w:p>
-    <w:bookmarkEnd w:id="38"/>
-    <w:bookmarkStart w:id="39" w:name="test-cases"/>
+    <w:bookmarkEnd w:id="44"/>
+    <w:bookmarkStart w:id="45" w:name="test-cases"/>
     <w:p>
       <w:pPr>
         <w:pStyle w:val="Heading2"/>
@@ -4637,8 +4920,8 @@
         </w:tc>
       </w:tr>
     </w:tbl>
-    <w:bookmarkEnd w:id="39"/>
-    <w:bookmarkStart w:id="40" w:name="what-each-case-means-in-the-business"/>
+    <w:bookmarkEnd w:id="45"/>
+    <w:bookmarkStart w:id="46" w:name="what-each-case-means-in-the-business"/>
     <w:p>
       <w:pPr>
         <w:pStyle w:val="Heading2"/>
@@ -5179,8 +5462,8 @@
         </w:tc>
       </w:tr>
     </w:tbl>
-    <w:bookmarkEnd w:id="40"/>
-    <w:bookmarkStart w:id="41" w:name="X7b36cda1c18148df6fb1d9a3558d019695d053f"/>
+    <w:bookmarkEnd w:id="46"/>
+    <w:bookmarkStart w:id="47" w:name="X7b36cda1c18148df6fb1d9a3558d019695d053f"/>
     <w:p>
       <w:pPr>
         <w:pStyle w:val="Heading2"/>
@@ -5418,8 +5701,8 @@
         <w:t xml:space="preserve">trusting it as proof of anything.</w:t>
       </w:r>
     </w:p>
-    <w:bookmarkEnd w:id="41"/>
-    <w:bookmarkStart w:id="42" w:name="isnt-this-just-a-unit-test"/>
+    <w:bookmarkEnd w:id="47"/>
+    <w:bookmarkStart w:id="48" w:name="isnt-this-just-a-unit-test"/>
     <w:p>
       <w:pPr>
         <w:pStyle w:val="Heading2"/>
@@ -5896,8 +6179,8 @@
         <w:t xml:space="preserve">means was never going to write the assertion.</w:t>
       </w:r>
     </w:p>
-    <w:bookmarkEnd w:id="42"/>
-    <w:bookmarkStart w:id="43" w:name="X9a249f5f163a90280cb293225baf90a156639df"/>
+    <w:bookmarkEnd w:id="48"/>
+    <w:bookmarkStart w:id="49" w:name="X9a249f5f163a90280cb293225baf90a156639df"/>
     <w:p>
       <w:pPr>
         <w:pStyle w:val="Heading2"/>
@@ -6179,8 +6462,8 @@
         <w:t xml:space="preserve">Close on the honest-limit section above — name what this does and doesn’t prove before anyone asks.</w:t>
       </w:r>
     </w:p>
-    <w:bookmarkEnd w:id="43"/>
-    <w:bookmarkStart w:id="44" w:name="related-material"/>
+    <w:bookmarkEnd w:id="49"/>
+    <w:bookmarkStart w:id="50" w:name="related-material"/>
     <w:p>
       <w:pPr>
         <w:pStyle w:val="Heading2"/>
@@ -6261,8 +6544,8 @@
         <w:t xml:space="preserve">section above.</w:t>
       </w:r>
     </w:p>
-    <w:bookmarkEnd w:id="44"/>
-    <w:bookmarkEnd w:id="45"/>
+    <w:bookmarkEnd w:id="50"/>
+    <w:bookmarkEnd w:id="51"/>
     <w:sectPr>
       <w:footnotePr>
         <w:numRestart w:val="eachSect"/>

</xml_diff>

<commit_message>
docs(dsl-discount-spec): agent writes the Test Plan runner command (B default)
Author writes only the scenario; the Test Plan runner line is a placeholder
the agent fills after building the runner (it chose the name/path/language).
Add an A-vs-B note (new ticket -> agent writes it; reuse -> pre-fill/append;
one line per .feature) and clarify the scenario is locked at approval while
the command is finalized at build. Regenerate README.docx.

Closes: t-a2f0
</commit_message>
<xml_diff>
--- a/examples/dsl-discount-spec/README.docx
+++ b/examples/dsl-discount-spec/README.docx
@@ -2001,15 +2001,135 @@
       </w:r>
       <w:r>
         <w:rPr>
-          <w:rStyle w:val="InformationTok"/>
-        </w:rPr>
-        <w:t xml:space="preserve">`node dsl_runner.js specs/discount.feature`</w:t>
-      </w:r>
-      <w:r>
-        <w:rPr>
-          <w:rStyle w:val="NormalTok"/>
-        </w:rPr>
-        <w:t xml:space="preserve"> exits 0</w:t>
+          <w:rStyle w:val="DataTypeTok"/>
+        </w:rPr>
+        <w:t xml:space="preserve">&lt;</w:t>
+      </w:r>
+      <w:r>
+        <w:rPr>
+          <w:rStyle w:val="KeywordTok"/>
+        </w:rPr>
+        <w:t xml:space="preserve">the</w:t>
+      </w:r>
+      <w:r>
+        <w:rPr>
+          <w:rStyle w:val="OtherTok"/>
+        </w:rPr>
+        <w:t xml:space="preserve"> agent writes the runner command here after it builds the runner </w:t>
+      </w:r>
+      <w:r>
+        <w:rPr>
+          <w:rStyle w:val="ErrorTok"/>
+        </w:rPr>
+        <w:t xml:space="preserve">—</w:t>
+      </w:r>
+      <w:r>
+        <w:rPr>
+          <w:rStyle w:val="OtherTok"/>
+        </w:rPr>
+        <w:t xml:space="preserve"> for this workshop that lands on </w:t>
+      </w:r>
+      <w:r>
+        <w:rPr>
+          <w:rStyle w:val="ErrorTok"/>
+        </w:rPr>
+        <w:t xml:space="preserve">`</w:t>
+      </w:r>
+      <w:r>
+        <w:rPr>
+          <w:rStyle w:val="OtherTok"/>
+        </w:rPr>
+        <w:t xml:space="preserve">node dsl_runner.js specs</w:t>
+      </w:r>
+      <w:r>
+        <w:rPr>
+          <w:rStyle w:val="ErrorTok"/>
+        </w:rPr>
+        <w:t xml:space="preserve">/</w:t>
+      </w:r>
+      <w:r>
+        <w:rPr>
+          <w:rStyle w:val="OtherTok"/>
+        </w:rPr>
+        <w:t xml:space="preserve">discount.feature</w:t>
+      </w:r>
+      <w:r>
+        <w:rPr>
+          <w:rStyle w:val="ErrorTok"/>
+        </w:rPr>
+        <w:t xml:space="preserve">`</w:t>
+      </w:r>
+      <w:r>
+        <w:rPr>
+          <w:rStyle w:val="OtherTok"/>
+        </w:rPr>
+        <w:t xml:space="preserve"> exits </w:t>
+      </w:r>
+      <w:r>
+        <w:rPr>
+          <w:rStyle w:val="ErrorTok"/>
+        </w:rPr>
+        <w:t xml:space="preserve">0</w:t>
+      </w:r>
+      <w:r>
+        <w:rPr>
+          <w:rStyle w:val="DataTypeTok"/>
+        </w:rPr>
+        <w:t xml:space="preserve">&gt;</w:t>
+      </w:r>
+    </w:p>
+    <w:p>
+      <w:pPr>
+        <w:numPr>
+          <w:ilvl w:val="0"/>
+          <w:numId w:val="1000"/>
+        </w:numPr>
+      </w:pPr>
+      <w:r>
+        <w:t xml:space="preserve">You author only the scenario and this one Test Plan slot. You do</w:t>
+      </w:r>
+      <w:r>
+        <w:t xml:space="preserve"> </w:t>
+      </w:r>
+      <w:r>
+        <w:rPr>
+          <w:b/>
+          <w:bCs/>
+        </w:rPr>
+        <w:t xml:space="preserve">not</w:t>
+      </w:r>
+      <w:r>
+        <w:t xml:space="preserve"> </w:t>
+      </w:r>
+      <w:r>
+        <w:t xml:space="preserve">need to know the runner’s</w:t>
+      </w:r>
+      <w:r>
+        <w:t xml:space="preserve"> </w:t>
+      </w:r>
+      <w:r>
+        <w:t xml:space="preserve">filename, the</w:t>
+      </w:r>
+      <w:r>
+        <w:t xml:space="preserve"> </w:t>
+      </w:r>
+      <w:r>
+        <w:rPr>
+          <w:rStyle w:val="VerbatimChar"/>
+        </w:rPr>
+        <w:t xml:space="preserve">.feature</w:t>
+      </w:r>
+      <w:r>
+        <w:t xml:space="preserve"> </w:t>
+      </w:r>
+      <w:r>
+        <w:t xml:space="preserve">path, or the language — the agent picks those and fills the command in</w:t>
+      </w:r>
+      <w:r>
+        <w:t xml:space="preserve"> </w:t>
+      </w:r>
+      <w:r>
+        <w:t xml:space="preserve">(that’s why the slot is a placeholder, not a command you type).</w:t>
       </w:r>
     </w:p>
     <w:p>
@@ -2414,7 +2534,7 @@
         </w:numPr>
       </w:pPr>
       <w:r>
-        <w:t xml:space="preserve">Name that runner command in Acceptance’s</w:t>
+        <w:t xml:space="preserve">Write the runner command into Acceptance’s</w:t>
       </w:r>
       <w:r>
         <w:t xml:space="preserve"> </w:t>
@@ -2426,13 +2546,43 @@
         <w:t xml:space="preserve">## Test Plan</w:t>
       </w:r>
       <w:r>
-        <w:t xml:space="preserve">. Don’t edit the spec to make the check</w:t>
-      </w:r>
-      <w:r>
-        <w:t xml:space="preserve"> </w:t>
-      </w:r>
-      <w:r>
-        <w:t xml:space="preserve">pass; if the inputs, outputs, or naming are ambiguous, ask before implementing.</w:t>
+        <w:t xml:space="preserve"> </w:t>
+      </w:r>
+      <w:r>
+        <w:t xml:space="preserve">yourself (fill the placeholder there),</w:t>
+      </w:r>
+      <w:r>
+        <w:t xml:space="preserve"> </w:t>
+      </w:r>
+      <w:r>
+        <w:t xml:space="preserve">because you chose the runner’s name, path, and language — the author didn’t. Use one Test Plan</w:t>
+      </w:r>
+      <w:r>
+        <w:t xml:space="preserve"> </w:t>
+      </w:r>
+      <w:r>
+        <w:t xml:space="preserve">line per</w:t>
+      </w:r>
+      <w:r>
+        <w:t xml:space="preserve"> </w:t>
+      </w:r>
+      <w:r>
+        <w:rPr>
+          <w:rStyle w:val="VerbatimChar"/>
+        </w:rPr>
+        <w:t xml:space="preserve">.feature</w:t>
+      </w:r>
+      <w:r>
+        <w:t xml:space="preserve"> </w:t>
+      </w:r>
+      <w:r>
+        <w:t xml:space="preserve">file. Don’t edit the spec to make the check pass; if the inputs, outputs, or</w:t>
+      </w:r>
+      <w:r>
+        <w:t xml:space="preserve"> </w:t>
+      </w:r>
+      <w:r>
+        <w:t xml:space="preserve">naming are ambiguous, ask before implementing.</w:t>
       </w:r>
     </w:p>
     <w:p>
@@ -2507,7 +2657,25 @@
         <w:t xml:space="preserve"> </w:t>
       </w:r>
       <w:r>
-        <w:t xml:space="preserve">that runner. (Default is JavaScript —</w:t>
+        <w:t xml:space="preserve">the command the agent wrote into</w:t>
+      </w:r>
+      <w:r>
+        <w:t xml:space="preserve"> </w:t>
+      </w:r>
+      <w:r>
+        <w:rPr>
+          <w:rStyle w:val="VerbatimChar"/>
+        </w:rPr>
+        <w:t xml:space="preserve">## Test Plan</w:t>
+      </w:r>
+      <w:r>
+        <w:t xml:space="preserve">.</w:t>
+      </w:r>
+      <w:r>
+        <w:t xml:space="preserve"> </w:t>
+      </w:r>
+      <w:r>
+        <w:t xml:space="preserve">(Default is JavaScript —</w:t>
       </w:r>
       <w:r>
         <w:t xml:space="preserve"> </w:t>
@@ -2519,13 +2687,13 @@
         <w:t xml:space="preserve">app/discount.js</w:t>
       </w:r>
       <w:r>
-        <w:t xml:space="preserve">.</w:t>
-      </w:r>
-      <w:r>
-        <w:t xml:space="preserve"> </w:t>
-      </w:r>
-      <w:r>
-        <w:t xml:space="preserve">Want Python instead? Just tell the agent to implement it in</w:t>
+        <w:t xml:space="preserve">. Want Python instead? Just tell the agent to implement it</w:t>
+      </w:r>
+      <w:r>
+        <w:t xml:space="preserve"> </w:t>
+      </w:r>
+      <w:r>
+        <w:t xml:space="preserve">in</w:t>
       </w:r>
       <w:r>
         <w:t xml:space="preserve"> </w:t>
@@ -2540,13 +2708,325 @@
         <w:t xml:space="preserve"> </w:t>
       </w:r>
       <w:r>
-        <w:t xml:space="preserve">with a Python runner; the</w:t>
-      </w:r>
-      <w:r>
-        <w:t xml:space="preserve"> </w:t>
-      </w:r>
-      <w:r>
-        <w:t xml:space="preserve">scenario and this instruction don’t change.)</w:t>
+        <w:t xml:space="preserve">with a Python runner; the scenario and this instruction don’t change.)</w:t>
+      </w:r>
+    </w:p>
+    <w:p>
+      <w:pPr>
+        <w:numPr>
+          <w:ilvl w:val="0"/>
+          <w:numId w:val="1000"/>
+        </w:numPr>
+      </w:pPr>
+      <w:r>
+        <w:rPr>
+          <w:b/>
+          <w:bCs/>
+        </w:rPr>
+        <w:t xml:space="preserve">Who fills the Test Plan runner line, and when.</w:t>
+      </w:r>
+      <w:r>
+        <w:t xml:space="preserve"> </w:t>
+      </w:r>
+      <w:r>
+        <w:t xml:space="preserve">The evaluator grades a scenario-backed criterion</w:t>
+      </w:r>
+      <w:r>
+        <w:t xml:space="preserve"> </w:t>
+      </w:r>
+      <w:r>
+        <w:t xml:space="preserve">by</w:t>
+      </w:r>
+      <w:r>
+        <w:t xml:space="preserve"> </w:t>
+      </w:r>
+      <w:r>
+        <w:rPr>
+          <w:i/>
+          <w:iCs/>
+        </w:rPr>
+        <w:t xml:space="preserve">running</w:t>
+      </w:r>
+      <w:r>
+        <w:t xml:space="preserve"> </w:t>
+      </w:r>
+      <w:r>
+        <w:t xml:space="preserve">the command named in</w:t>
+      </w:r>
+      <w:r>
+        <w:t xml:space="preserve"> </w:t>
+      </w:r>
+      <w:r>
+        <w:rPr>
+          <w:rStyle w:val="VerbatimChar"/>
+        </w:rPr>
+        <w:t xml:space="preserve">## Test Plan</w:t>
+      </w:r>
+      <w:r>
+        <w:t xml:space="preserve">, so that command must be there by close — but it’s</w:t>
+      </w:r>
+      <w:r>
+        <w:t xml:space="preserve"> </w:t>
+      </w:r>
+      <w:r>
+        <w:t xml:space="preserve">the</w:t>
+      </w:r>
+      <w:r>
+        <w:t xml:space="preserve"> </w:t>
+      </w:r>
+      <w:r>
+        <w:rPr>
+          <w:b/>
+          <w:bCs/>
+        </w:rPr>
+        <w:t xml:space="preserve">agent’s</w:t>
+      </w:r>
+      <w:r>
+        <w:t xml:space="preserve"> </w:t>
+      </w:r>
+      <w:r>
+        <w:t xml:space="preserve">to write, not the author’s:</w:t>
+      </w:r>
+    </w:p>
+    <w:p>
+      <w:pPr>
+        <w:pStyle w:val="Compact"/>
+        <w:numPr>
+          <w:ilvl w:val="1"/>
+          <w:numId w:val="1005"/>
+        </w:numPr>
+      </w:pPr>
+      <w:r>
+        <w:rPr>
+          <w:b/>
+          <w:bCs/>
+        </w:rPr>
+        <w:t xml:space="preserve">New ticket / no runner yet:</w:t>
+      </w:r>
+      <w:r>
+        <w:t xml:space="preserve"> </w:t>
+      </w:r>
+      <w:r>
+        <w:t xml:space="preserve">the author leaves the Test Plan slot empty (the placeholder above);</w:t>
+      </w:r>
+      <w:r>
+        <w:t xml:space="preserve"> </w:t>
+      </w:r>
+      <w:r>
+        <w:t xml:space="preserve">the agent writes the command once it’s built the runner. A brand-new scenario’s author never has</w:t>
+      </w:r>
+      <w:r>
+        <w:t xml:space="preserve"> </w:t>
+      </w:r>
+      <w:r>
+        <w:t xml:space="preserve">to know the runner’s filename, path, or language.</w:t>
+      </w:r>
+    </w:p>
+    <w:p>
+      <w:pPr>
+        <w:pStyle w:val="Compact"/>
+        <w:numPr>
+          <w:ilvl w:val="1"/>
+          <w:numId w:val="1005"/>
+        </w:numPr>
+      </w:pPr>
+      <w:r>
+        <w:rPr>
+          <w:b/>
+          <w:bCs/>
+        </w:rPr>
+        <w:t xml:space="preserve">A ticket that reuses an existing runner:</w:t>
+      </w:r>
+      <w:r>
+        <w:t xml:space="preserve"> </w:t>
+      </w:r>
+      <w:r>
+        <w:t xml:space="preserve">the command is known convention, so it’s fine to</w:t>
+      </w:r>
+      <w:r>
+        <w:t xml:space="preserve"> </w:t>
+      </w:r>
+      <w:r>
+        <w:t xml:space="preserve">pre-fill or</w:t>
+      </w:r>
+      <w:r>
+        <w:t xml:space="preserve"> </w:t>
+      </w:r>
+      <w:r>
+        <w:rPr>
+          <w:b/>
+          <w:bCs/>
+        </w:rPr>
+        <w:t xml:space="preserve">append</w:t>
+      </w:r>
+      <w:r>
+        <w:t xml:space="preserve"> </w:t>
+      </w:r>
+      <w:r>
+        <w:t xml:space="preserve">it by hand — e.g. add</w:t>
+      </w:r>
+      <w:r>
+        <w:t xml:space="preserve"> </w:t>
+      </w:r>
+      <w:r>
+        <w:rPr>
+          <w:rStyle w:val="VerbatimChar"/>
+        </w:rPr>
+        <w:t xml:space="preserve">`node dsl_runner.js specs/&lt;new&gt;.feature` exits 0</w:t>
+      </w:r>
+      <w:r>
+        <w:t xml:space="preserve"> </w:t>
+      </w:r>
+      <w:r>
+        <w:t xml:space="preserve">for the new file; the agent just adds the new scenarios.</w:t>
+      </w:r>
+    </w:p>
+    <w:p>
+      <w:pPr>
+        <w:pStyle w:val="Compact"/>
+        <w:numPr>
+          <w:ilvl w:val="1"/>
+          <w:numId w:val="1005"/>
+        </w:numPr>
+      </w:pPr>
+      <w:r>
+        <w:rPr>
+          <w:b/>
+          <w:bCs/>
+        </w:rPr>
+        <w:t xml:space="preserve">Several distinct</w:t>
+      </w:r>
+      <w:r>
+        <w:rPr>
+          <w:b/>
+          <w:bCs/>
+        </w:rPr>
+        <w:t xml:space="preserve"> </w:t>
+      </w:r>
+      <w:r>
+        <w:rPr>
+          <w:rStyle w:val="VerbatimChar"/>
+          <w:b/>
+          <w:bCs/>
+        </w:rPr>
+        <w:t xml:space="preserve">.feature</w:t>
+      </w:r>
+      <w:r>
+        <w:rPr>
+          <w:b/>
+          <w:bCs/>
+        </w:rPr>
+        <w:t xml:space="preserve"> </w:t>
+      </w:r>
+      <w:r>
+        <w:rPr>
+          <w:b/>
+          <w:bCs/>
+        </w:rPr>
+        <w:t xml:space="preserve">files in one ticket:</w:t>
+      </w:r>
+      <w:r>
+        <w:t xml:space="preserve"> </w:t>
+      </w:r>
+      <w:r>
+        <w:t xml:space="preserve">one Test Plan line each (the agent appends</w:t>
+      </w:r>
+      <w:r>
+        <w:t xml:space="preserve"> </w:t>
+      </w:r>
+      <w:r>
+        <w:t xml:space="preserve">them). Keep cohesive scenarios in a single</w:t>
+      </w:r>
+      <w:r>
+        <w:t xml:space="preserve"> </w:t>
+      </w:r>
+      <w:r>
+        <w:rPr>
+          <w:rStyle w:val="VerbatimChar"/>
+        </w:rPr>
+        <w:t xml:space="preserve">.feature</w:t>
+      </w:r>
+      <w:r>
+        <w:t xml:space="preserve"> </w:t>
+      </w:r>
+      <w:r>
+        <w:t xml:space="preserve">with a single line.</w:t>
+      </w:r>
+    </w:p>
+    <w:p>
+      <w:pPr>
+        <w:numPr>
+          <w:ilvl w:val="0"/>
+          <w:numId w:val="1000"/>
+        </w:numPr>
+      </w:pPr>
+      <w:r>
+        <w:t xml:space="preserve">Note the ordering this preserves: the</w:t>
+      </w:r>
+      <w:r>
+        <w:t xml:space="preserve"> </w:t>
+      </w:r>
+      <w:r>
+        <w:rPr>
+          <w:b/>
+          <w:bCs/>
+        </w:rPr>
+        <w:t xml:space="preserve">scenario</w:t>
+      </w:r>
+      <w:r>
+        <w:t xml:space="preserve"> </w:t>
+      </w:r>
+      <w:r>
+        <w:t xml:space="preserve">— the</w:t>
+      </w:r>
+      <w:r>
+        <w:t xml:space="preserve"> </w:t>
+      </w:r>
+      <w:r>
+        <w:rPr>
+          <w:rStyle w:val="VerbatimChar"/>
+        </w:rPr>
+        <w:t xml:space="preserve">Then</w:t>
+      </w:r>
+      <w:r>
+        <w:t xml:space="preserve"> </w:t>
+      </w:r>
+      <w:r>
+        <w:t xml:space="preserve">expectations, i.e. the correctness</w:t>
+      </w:r>
+      <w:r>
+        <w:t xml:space="preserve"> </w:t>
+      </w:r>
+      <w:r>
+        <w:t xml:space="preserve">bar — is what’s locked at the sprint-start approval gate, before any code. The runner</w:t>
+      </w:r>
+      <w:r>
+        <w:t xml:space="preserve"> </w:t>
+      </w:r>
+      <w:r>
+        <w:rPr>
+          <w:b/>
+          <w:bCs/>
+        </w:rPr>
+        <w:t xml:space="preserve">command</w:t>
+      </w:r>
+      <w:r>
+        <w:t xml:space="preserve"> </w:t>
+      </w:r>
+      <w:r>
+        <w:t xml:space="preserve">is</w:t>
+      </w:r>
+      <w:r>
+        <w:t xml:space="preserve"> </w:t>
+      </w:r>
+      <w:r>
+        <w:t xml:space="preserve">just a mechanical pointer to it, so the agent finalizing that line during the build doesn’t violate</w:t>
+      </w:r>
+      <w:r>
+        <w:t xml:space="preserve"> </w:t>
+      </w:r>
+      <w:r>
+        <w:t xml:space="preserve">“lock the spec before the code.”</w:t>
       </w:r>
     </w:p>
     <w:p>
@@ -2800,7 +3280,7 @@
         <w:t xml:space="preserve">app/discount.js</w:t>
       </w:r>
       <w:r>
-        <w:t xml:space="preserve">, and the runner</w:t>
+        <w:t xml:space="preserve">, the runner</w:t>
       </w:r>
       <w:r>
         <w:t xml:space="preserve"> </w:t>
@@ -2812,7 +3292,22 @@
         <w:t xml:space="preserve">app/dsl_runner.js</w:t>
       </w:r>
       <w:r>
-        <w:t xml:space="preserve">.</w:t>
+        <w:t xml:space="preserve">, and fills the</w:t>
+      </w:r>
+      <w:r>
+        <w:t xml:space="preserve"> </w:t>
+      </w:r>
+      <w:r>
+        <w:rPr>
+          <w:rStyle w:val="VerbatimChar"/>
+        </w:rPr>
+        <w:t xml:space="preserve">## Test Plan</w:t>
+      </w:r>
+      <w:r>
+        <w:t xml:space="preserve"> </w:t>
+      </w:r>
+      <w:r>
+        <w:t xml:space="preserve">runner command to match.</w:t>
       </w:r>
     </w:p>
     <w:p>
@@ -3639,7 +4134,7 @@
       <w:pPr>
         <w:numPr>
           <w:ilvl w:val="0"/>
-          <w:numId w:val="1005"/>
+          <w:numId w:val="1006"/>
         </w:numPr>
       </w:pPr>
       <w:r>
@@ -3856,7 +4351,7 @@
       <w:pPr>
         <w:numPr>
           <w:ilvl w:val="0"/>
-          <w:numId w:val="1005"/>
+          <w:numId w:val="1006"/>
         </w:numPr>
       </w:pPr>
       <w:r>
@@ -3964,7 +4459,7 @@
       <w:pPr>
         <w:numPr>
           <w:ilvl w:val="0"/>
-          <w:numId w:val="1005"/>
+          <w:numId w:val="1006"/>
         </w:numPr>
       </w:pPr>
       <w:r>
@@ -5491,7 +5986,7 @@
         <w:pStyle w:val="Compact"/>
         <w:numPr>
           <w:ilvl w:val="0"/>
-          <w:numId w:val="1006"/>
+          <w:numId w:val="1007"/>
         </w:numPr>
       </w:pPr>
       <w:r>
@@ -5524,677 +6019,6 @@
       </w:r>
       <w:r>
         <w:t xml:space="preserve">, use one.</w:t>
-      </w:r>
-    </w:p>
-    <w:p>
-      <w:pPr>
-        <w:pStyle w:val="Compact"/>
-        <w:numPr>
-          <w:ilvl w:val="0"/>
-          <w:numId w:val="1006"/>
-        </w:numPr>
-      </w:pPr>
-      <w:r>
-        <w:rPr>
-          <w:b/>
-          <w:bCs/>
-        </w:rPr>
-        <w:t xml:space="preserve">Doesn’t fit:</w:t>
-      </w:r>
-      <w:r>
-        <w:t xml:space="preserve"> </w:t>
-      </w:r>
-      <w:r>
-        <w:t xml:space="preserve">open-ended output with no single right answer —</w:t>
-      </w:r>
-      <w:r>
-        <w:t xml:space="preserve"> </w:t>
-      </w:r>
-      <w:r>
-        <w:t xml:space="preserve">“write a better error message,”</w:t>
-      </w:r>
-      <w:r>
-        <w:t xml:space="preserve"> </w:t>
-      </w:r>
-      <w:r>
-        <w:t xml:space="preserve">“summarize this concisely.”</w:t>
-      </w:r>
-      <w:r>
-        <w:t xml:space="preserve"> </w:t>
-      </w:r>
-      <w:r>
-        <w:t xml:space="preserve">Forcing a spec there either flattens the task into a checklist that</w:t>
-      </w:r>
-      <w:r>
-        <w:t xml:space="preserve"> </w:t>
-      </w:r>
-      <w:r>
-        <w:t xml:space="preserve">misses the point, or you end up building an LLM judge — which just moves</w:t>
-      </w:r>
-      <w:r>
-        <w:t xml:space="preserve"> </w:t>
-      </w:r>
-      <w:r>
-        <w:t xml:space="preserve">“who verifies this”</w:t>
-      </w:r>
-      <w:r>
-        <w:t xml:space="preserve"> </w:t>
-      </w:r>
-      <w:r>
-        <w:t xml:space="preserve">one</w:t>
-      </w:r>
-      <w:r>
-        <w:t xml:space="preserve"> </w:t>
-      </w:r>
-      <w:r>
-        <w:t xml:space="preserve">level up, onto something that itself needs verifying.</w:t>
-      </w:r>
-    </w:p>
-    <w:p>
-      <w:pPr>
-        <w:pStyle w:val="Compact"/>
-        <w:numPr>
-          <w:ilvl w:val="0"/>
-          <w:numId w:val="1006"/>
-        </w:numPr>
-      </w:pPr>
-      <w:r>
-        <w:rPr>
-          <w:b/>
-          <w:bCs/>
-        </w:rPr>
-        <w:t xml:space="preserve">The honest limit of</w:t>
-      </w:r>
-      <w:r>
-        <w:rPr>
-          <w:b/>
-          <w:bCs/>
-        </w:rPr>
-        <w:t xml:space="preserve"> </w:t>
-      </w:r>
-      <w:r>
-        <w:rPr>
-          <w:b/>
-          <w:bCs/>
-          <w:i/>
-          <w:iCs/>
-        </w:rPr>
-        <w:t xml:space="preserve">this</w:t>
-      </w:r>
-      <w:r>
-        <w:rPr>
-          <w:b/>
-          <w:bCs/>
-        </w:rPr>
-        <w:t xml:space="preserve"> </w:t>
-      </w:r>
-      <w:r>
-        <w:rPr>
-          <w:b/>
-          <w:bCs/>
-        </w:rPr>
-        <w:t xml:space="preserve">exercise specifically:</w:t>
-      </w:r>
-      <w:r>
-        <w:t xml:space="preserve"> </w:t>
-      </w:r>
-      <w:r>
-        <w:t xml:space="preserve">the runner proves the</w:t>
-      </w:r>
-      <w:r>
-        <w:t xml:space="preserve"> </w:t>
-      </w:r>
-      <w:r>
-        <w:rPr>
-          <w:i/>
-          <w:iCs/>
-        </w:rPr>
-        <w:t xml:space="preserve">code</w:t>
-      </w:r>
-      <w:r>
-        <w:t xml:space="preserve"> </w:t>
-      </w:r>
-      <w:r>
-        <w:t xml:space="preserve">matches the</w:t>
-      </w:r>
-      <w:r>
-        <w:t xml:space="preserve"> </w:t>
-      </w:r>
-      <w:r>
-        <w:rPr>
-          <w:i/>
-          <w:iCs/>
-        </w:rPr>
-        <w:t xml:space="preserve">spec</w:t>
-      </w:r>
-      <w:r>
-        <w:t xml:space="preserve">. It doesn’t prove the spec matches what you actually meant — if the same person (or the same</w:t>
-      </w:r>
-      <w:r>
-        <w:t xml:space="preserve"> </w:t>
-      </w:r>
-      <w:r>
-        <w:t xml:space="preserve">agent) writes both the implementation and the spec by watching the code run, you get a regression</w:t>
-      </w:r>
-      <w:r>
-        <w:t xml:space="preserve"> </w:t>
-      </w:r>
-      <w:r>
-        <w:t xml:space="preserve">lock on today’s behavior, not a correctness check against intent. The scenario in this workshop is</w:t>
-      </w:r>
-      <w:r>
-        <w:t xml:space="preserve"> </w:t>
-      </w:r>
-      <w:r>
-        <w:t xml:space="preserve">authored in Part 1, before any code exists — that’s what makes it a real check. In your own work,</w:t>
-      </w:r>
-      <w:r>
-        <w:t xml:space="preserve"> </w:t>
-      </w:r>
-      <w:r>
-        <w:t xml:space="preserve">that means: write the spec first, or have someone other than the implementer sign off on it, before</w:t>
-      </w:r>
-      <w:r>
-        <w:t xml:space="preserve"> </w:t>
-      </w:r>
-      <w:r>
-        <w:t xml:space="preserve">trusting it as proof of anything.</w:t>
-      </w:r>
-    </w:p>
-    <w:bookmarkEnd w:id="47"/>
-    <w:bookmarkStart w:id="48" w:name="isnt-this-just-a-unit-test"/>
-    <w:p>
-      <w:pPr>
-        <w:pStyle w:val="Heading2"/>
-      </w:pPr>
-      <w:r>
-        <w:t xml:space="preserve">“Isn’t this just a unit test?”</w:t>
-      </w:r>
-    </w:p>
-    <w:p>
-      <w:pPr>
-        <w:pStyle w:val="FirstParagraph"/>
-      </w:pPr>
-      <w:r>
-        <w:t xml:space="preserve">Say yes first — for this exact bug, a unit-test equivalent would catch it too:</w:t>
-      </w:r>
-    </w:p>
-    <w:p>
-      <w:pPr>
-        <w:pStyle w:val="SourceCode"/>
-      </w:pPr>
-      <w:r>
-        <w:rPr>
-          <w:rStyle w:val="FunctionTok"/>
-        </w:rPr>
-        <w:t xml:space="preserve">test</w:t>
-      </w:r>
-      <w:r>
-        <w:rPr>
-          <w:rStyle w:val="NormalTok"/>
-        </w:rPr>
-        <w:t xml:space="preserve">(</w:t>
-      </w:r>
-      <w:r>
-        <w:rPr>
-          <w:rStyle w:val="StringTok"/>
-        </w:rPr>
-        <w:t xml:space="preserve">"below minimum is rejected"</w:t>
-      </w:r>
-      <w:r>
-        <w:rPr>
-          <w:rStyle w:val="OperatorTok"/>
-        </w:rPr>
-        <w:t xml:space="preserve">,</w:t>
-      </w:r>
-      <w:r>
-        <w:rPr>
-          <w:rStyle w:val="NormalTok"/>
-        </w:rPr>
-        <w:t xml:space="preserve"> () </w:t>
-      </w:r>
-      <w:r>
-        <w:rPr>
-          <w:rStyle w:val="KeywordTok"/>
-        </w:rPr>
-        <w:t xml:space="preserve">=&gt;</w:t>
-      </w:r>
-      <w:r>
-        <w:rPr>
-          <w:rStyle w:val="NormalTok"/>
-        </w:rPr>
-        <w:t xml:space="preserve"> {</w:t>
-      </w:r>
-      <w:r>
-        <w:br/>
-      </w:r>
-      <w:r>
-        <w:rPr>
-          <w:rStyle w:val="NormalTok"/>
-        </w:rPr>
-        <w:t xml:space="preserve">  </w:t>
-      </w:r>
-      <w:r>
-        <w:rPr>
-          <w:rStyle w:val="KeywordTok"/>
-        </w:rPr>
-        <w:t xml:space="preserve">const</w:t>
-      </w:r>
-      <w:r>
-        <w:rPr>
-          <w:rStyle w:val="NormalTok"/>
-        </w:rPr>
-        <w:t xml:space="preserve"> result </w:t>
-      </w:r>
-      <w:r>
-        <w:rPr>
-          <w:rStyle w:val="OperatorTok"/>
-        </w:rPr>
-        <w:t xml:space="preserve">=</w:t>
-      </w:r>
-      <w:r>
-        <w:rPr>
-          <w:rStyle w:val="NormalTok"/>
-        </w:rPr>
-        <w:t xml:space="preserve"> </w:t>
-      </w:r>
-      <w:r>
-        <w:rPr>
-          <w:rStyle w:val="FunctionTok"/>
-        </w:rPr>
-        <w:t xml:space="preserve">apply_discount</w:t>
-      </w:r>
-      <w:r>
-        <w:rPr>
-          <w:rStyle w:val="NormalTok"/>
-        </w:rPr>
-        <w:t xml:space="preserve">(</w:t>
-      </w:r>
-      <w:r>
-        <w:rPr>
-          <w:rStyle w:val="FloatTok"/>
-        </w:rPr>
-        <w:t xml:space="preserve">40.0</w:t>
-      </w:r>
-      <w:r>
-        <w:rPr>
-          <w:rStyle w:val="OperatorTok"/>
-        </w:rPr>
-        <w:t xml:space="preserve">,</w:t>
-      </w:r>
-      <w:r>
-        <w:rPr>
-          <w:rStyle w:val="NormalTok"/>
-        </w:rPr>
-        <w:t xml:space="preserve"> </w:t>
-      </w:r>
-      <w:r>
-        <w:rPr>
-          <w:rStyle w:val="StringTok"/>
-        </w:rPr>
-        <w:t xml:space="preserve">"SAVE10"</w:t>
-      </w:r>
-      <w:r>
-        <w:rPr>
-          <w:rStyle w:val="NormalTok"/>
-        </w:rPr>
-        <w:t xml:space="preserve">)</w:t>
-      </w:r>
-      <w:r>
-        <w:rPr>
-          <w:rStyle w:val="OperatorTok"/>
-        </w:rPr>
-        <w:t xml:space="preserve">;</w:t>
-      </w:r>
-      <w:r>
-        <w:br/>
-      </w:r>
-      <w:r>
-        <w:rPr>
-          <w:rStyle w:val="NormalTok"/>
-        </w:rPr>
-        <w:t xml:space="preserve">  </w:t>
-      </w:r>
-      <w:r>
-        <w:rPr>
-          <w:rStyle w:val="FunctionTok"/>
-        </w:rPr>
-        <w:t xml:space="preserve">expect</w:t>
-      </w:r>
-      <w:r>
-        <w:rPr>
-          <w:rStyle w:val="NormalTok"/>
-        </w:rPr>
-        <w:t xml:space="preserve">(result</w:t>
-      </w:r>
-      <w:r>
-        <w:rPr>
-          <w:rStyle w:val="OperatorTok"/>
-        </w:rPr>
-        <w:t xml:space="preserve">.</w:t>
-      </w:r>
-      <w:r>
-        <w:rPr>
-          <w:rStyle w:val="AttributeTok"/>
-        </w:rPr>
-        <w:t xml:space="preserve">applied</w:t>
-      </w:r>
-      <w:r>
-        <w:rPr>
-          <w:rStyle w:val="NormalTok"/>
-        </w:rPr>
-        <w:t xml:space="preserve">)</w:t>
-      </w:r>
-      <w:r>
-        <w:rPr>
-          <w:rStyle w:val="OperatorTok"/>
-        </w:rPr>
-        <w:t xml:space="preserve">.</w:t>
-      </w:r>
-      <w:r>
-        <w:rPr>
-          <w:rStyle w:val="FunctionTok"/>
-        </w:rPr>
-        <w:t xml:space="preserve">toBe</w:t>
-      </w:r>
-      <w:r>
-        <w:rPr>
-          <w:rStyle w:val="NormalTok"/>
-        </w:rPr>
-        <w:t xml:space="preserve">(</w:t>
-      </w:r>
-      <w:r>
-        <w:rPr>
-          <w:rStyle w:val="KeywordTok"/>
-        </w:rPr>
-        <w:t xml:space="preserve">false</w:t>
-      </w:r>
-      <w:r>
-        <w:rPr>
-          <w:rStyle w:val="NormalTok"/>
-        </w:rPr>
-        <w:t xml:space="preserve">)</w:t>
-      </w:r>
-      <w:r>
-        <w:rPr>
-          <w:rStyle w:val="OperatorTok"/>
-        </w:rPr>
-        <w:t xml:space="preserve">;</w:t>
-      </w:r>
-      <w:r>
-        <w:br/>
-      </w:r>
-      <w:r>
-        <w:rPr>
-          <w:rStyle w:val="NormalTok"/>
-        </w:rPr>
-        <w:t xml:space="preserve">  </w:t>
-      </w:r>
-      <w:r>
-        <w:rPr>
-          <w:rStyle w:val="FunctionTok"/>
-        </w:rPr>
-        <w:t xml:space="preserve">expect</w:t>
-      </w:r>
-      <w:r>
-        <w:rPr>
-          <w:rStyle w:val="NormalTok"/>
-        </w:rPr>
-        <w:t xml:space="preserve">(result</w:t>
-      </w:r>
-      <w:r>
-        <w:rPr>
-          <w:rStyle w:val="OperatorTok"/>
-        </w:rPr>
-        <w:t xml:space="preserve">.</w:t>
-      </w:r>
-      <w:r>
-        <w:rPr>
-          <w:rStyle w:val="AttributeTok"/>
-        </w:rPr>
-        <w:t xml:space="preserve">reason</w:t>
-      </w:r>
-      <w:r>
-        <w:rPr>
-          <w:rStyle w:val="NormalTok"/>
-        </w:rPr>
-        <w:t xml:space="preserve">)</w:t>
-      </w:r>
-      <w:r>
-        <w:rPr>
-          <w:rStyle w:val="OperatorTok"/>
-        </w:rPr>
-        <w:t xml:space="preserve">.</w:t>
-      </w:r>
-      <w:r>
-        <w:rPr>
-          <w:rStyle w:val="FunctionTok"/>
-        </w:rPr>
-        <w:t xml:space="preserve">toBe</w:t>
-      </w:r>
-      <w:r>
-        <w:rPr>
-          <w:rStyle w:val="NormalTok"/>
-        </w:rPr>
-        <w:t xml:space="preserve">(</w:t>
-      </w:r>
-      <w:r>
-        <w:rPr>
-          <w:rStyle w:val="StringTok"/>
-        </w:rPr>
-        <w:t xml:space="preserve">"minimum not met"</w:t>
-      </w:r>
-      <w:r>
-        <w:rPr>
-          <w:rStyle w:val="NormalTok"/>
-        </w:rPr>
-        <w:t xml:space="preserve">)</w:t>
-      </w:r>
-      <w:r>
-        <w:rPr>
-          <w:rStyle w:val="OperatorTok"/>
-        </w:rPr>
-        <w:t xml:space="preserve">;</w:t>
-      </w:r>
-      <w:r>
-        <w:br/>
-      </w:r>
-      <w:r>
-        <w:rPr>
-          <w:rStyle w:val="NormalTok"/>
-        </w:rPr>
-        <w:t xml:space="preserve">})</w:t>
-      </w:r>
-      <w:r>
-        <w:rPr>
-          <w:rStyle w:val="OperatorTok"/>
-        </w:rPr>
-        <w:t xml:space="preserve">;</w:t>
-      </w:r>
-    </w:p>
-    <w:p>
-      <w:pPr>
-        <w:pStyle w:val="FirstParagraph"/>
-      </w:pPr>
-      <w:r>
-        <w:t xml:space="preserve">Same detection power, same mechanism. The DSL isn’t a stronger test — the difference is</w:t>
-      </w:r>
-      <w:r>
-        <w:t xml:space="preserve"> </w:t>
-      </w:r>
-      <w:r>
-        <w:rPr>
-          <w:i/>
-          <w:iCs/>
-        </w:rPr>
-        <w:t xml:space="preserve">who could</w:t>
-      </w:r>
-      <w:r>
-        <w:rPr>
-          <w:i/>
-          <w:iCs/>
-        </w:rPr>
-        <w:t xml:space="preserve"> </w:t>
-      </w:r>
-      <w:r>
-        <w:rPr>
-          <w:i/>
-          <w:iCs/>
-        </w:rPr>
-        <w:t xml:space="preserve">have written it</w:t>
-      </w:r>
-      <w:r>
-        <w:t xml:space="preserve">. The</w:t>
-      </w:r>
-      <w:r>
-        <w:t xml:space="preserve"> </w:t>
-      </w:r>
-      <w:r>
-        <w:rPr>
-          <w:rStyle w:val="VerbatimChar"/>
-        </w:rPr>
-        <w:t xml:space="preserve">.feature</w:t>
-      </w:r>
-      <w:r>
-        <w:t xml:space="preserve"> </w:t>
-      </w:r>
-      <w:r>
-        <w:t xml:space="preserve">version only requires knowing the discount rule; the unit-test</w:t>
-      </w:r>
-      <w:r>
-        <w:t xml:space="preserve"> </w:t>
-      </w:r>
-      <w:r>
-        <w:t xml:space="preserve">version requires knowing the rule</w:t>
-      </w:r>
-      <w:r>
-        <w:t xml:space="preserve"> </w:t>
-      </w:r>
-      <w:r>
-        <w:rPr>
-          <w:b/>
-          <w:bCs/>
-        </w:rPr>
-        <w:t xml:space="preserve">and</w:t>
-      </w:r>
-      <w:r>
-        <w:t xml:space="preserve"> </w:t>
-      </w:r>
-      <w:r>
-        <w:t xml:space="preserve">the language (</w:t>
-      </w:r>
-      <w:r>
-        <w:rPr>
-          <w:rStyle w:val="VerbatimChar"/>
-        </w:rPr>
-        <w:t xml:space="preserve">expect</w:t>
-      </w:r>
-      <w:r>
-        <w:t xml:space="preserve">, object access, how to run the</w:t>
-      </w:r>
-      <w:r>
-        <w:t xml:space="preserve"> </w:t>
-      </w:r>
-      <w:r>
-        <w:t xml:space="preserve">suite). Whoever owns the pricing policy can write and sign off on the scenario directly, with zero</w:t>
-      </w:r>
-      <w:r>
-        <w:t xml:space="preserve"> </w:t>
-      </w:r>
-      <w:r>
-        <w:t xml:space="preserve">code literacy — the unit test needs a translation step from rule to assertion syntax, done by whoever</w:t>
-      </w:r>
-      <w:r>
-        <w:t xml:space="preserve"> </w:t>
-      </w:r>
-      <w:r>
-        <w:t xml:space="preserve">implements it, which is exactly where intent quietly drifts.</w:t>
-      </w:r>
-    </w:p>
-    <w:p>
-      <w:pPr>
-        <w:pStyle w:val="BodyText"/>
-      </w:pPr>
-      <w:r>
-        <w:t xml:space="preserve">One counter to have ready:</w:t>
-      </w:r>
-      <w:r>
-        <w:t xml:space="preserve"> </w:t>
-      </w:r>
-      <w:r>
-        <w:t xml:space="preserve">“isn’t</w:t>
-      </w:r>
-      <w:r>
-        <w:t xml:space="preserve"> </w:t>
-      </w:r>
-      <w:r>
-        <w:t xml:space="preserve">‘write the check before the code’</w:t>
-      </w:r>
-      <w:r>
-        <w:t xml:space="preserve"> </w:t>
-      </w:r>
-      <w:r>
-        <w:t xml:space="preserve">just TDD?”</w:t>
-      </w:r>
-      <w:r>
-        <w:t xml:space="preserve"> </w:t>
-      </w:r>
-      <w:r>
-        <w:t xml:space="preserve">Yes — concede it.</w:t>
-      </w:r>
-      <w:r>
-        <w:t xml:space="preserve"> </w:t>
-      </w:r>
-      <w:r>
-        <w:t xml:space="preserve">TDD gets you the ordering. It doesn’t get you the readership: a test-first unit-test file is still</w:t>
-      </w:r>
-      <w:r>
-        <w:t xml:space="preserve"> </w:t>
-      </w:r>
-      <w:r>
-        <w:t xml:space="preserve">unreadable to whoever actually owns the rule. That gap matters more, not less, as rules move further</w:t>
-      </w:r>
-      <w:r>
-        <w:t xml:space="preserve"> </w:t>
-      </w:r>
-      <w:r>
-        <w:t xml:space="preserve">from engineering — pricing policy, compliance, CFIHOS conformance — cases where the person who knows</w:t>
-      </w:r>
-      <w:r>
-        <w:t xml:space="preserve"> </w:t>
-      </w:r>
-      <w:r>
-        <w:t xml:space="preserve">what</w:t>
-      </w:r>
-      <w:r>
-        <w:t xml:space="preserve"> </w:t>
-      </w:r>
-      <w:r>
-        <w:t xml:space="preserve">“correct”</w:t>
-      </w:r>
-      <w:r>
-        <w:t xml:space="preserve"> </w:t>
-      </w:r>
-      <w:r>
-        <w:t xml:space="preserve">means was never going to write the assertion.</w:t>
-      </w:r>
-    </w:p>
-    <w:bookmarkEnd w:id="48"/>
-    <w:bookmarkStart w:id="49" w:name="X9a249f5f163a90280cb293225baf90a156639df"/>
-    <w:p>
-      <w:pPr>
-        <w:pStyle w:val="Heading2"/>
-      </w:pPr>
-      <w:r>
-        <w:t xml:space="preserve">Suggested demonstration sequence (for instructors)</w:t>
-      </w:r>
-    </w:p>
-    <w:p>
-      <w:pPr>
-        <w:pStyle w:val="FirstParagraph"/>
-      </w:pPr>
-      <w:r>
-        <w:t xml:space="preserve">Condensed recap, for running this live in front of a group:</w:t>
       </w:r>
     </w:p>
     <w:p>
@@ -6206,40 +6030,59 @@
         </w:numPr>
       </w:pPr>
       <w:r>
-        <w:t xml:space="preserve">Show</w:t>
-      </w:r>
-      <w:r>
-        <w:t xml:space="preserve"> </w:t>
-      </w:r>
-      <w:r>
-        <w:rPr>
-          <w:rStyle w:val="VerbatimChar"/>
-        </w:rPr>
-        <w:t xml:space="preserve">specs/discount.feature</w:t>
-      </w:r>
-      <w:r>
-        <w:t xml:space="preserve"> </w:t>
-      </w:r>
-      <w:r>
-        <w:t xml:space="preserve">(or author it live on the board, Part 1) — read it aloud, confirm the</w:t>
-      </w:r>
-      <w:r>
-        <w:t xml:space="preserve"> </w:t>
-      </w:r>
-      <w:r>
-        <w:t xml:space="preserve">room agrees on what</w:t>
-      </w:r>
-      <w:r>
-        <w:t xml:space="preserve"> </w:t>
-      </w:r>
-      <w:r>
-        <w:t xml:space="preserve">“correct”</w:t>
-      </w:r>
-      <w:r>
-        <w:t xml:space="preserve"> </w:t>
-      </w:r>
-      <w:r>
-        <w:t xml:space="preserve">means before any code exists.</w:t>
+        <w:rPr>
+          <w:b/>
+          <w:bCs/>
+        </w:rPr>
+        <w:t xml:space="preserve">Doesn’t fit:</w:t>
+      </w:r>
+      <w:r>
+        <w:t xml:space="preserve"> </w:t>
+      </w:r>
+      <w:r>
+        <w:t xml:space="preserve">open-ended output with no single right answer —</w:t>
+      </w:r>
+      <w:r>
+        <w:t xml:space="preserve"> </w:t>
+      </w:r>
+      <w:r>
+        <w:t xml:space="preserve">“write a better error message,”</w:t>
+      </w:r>
+      <w:r>
+        <w:t xml:space="preserve"> </w:t>
+      </w:r>
+      <w:r>
+        <w:t xml:space="preserve">“summarize this concisely.”</w:t>
+      </w:r>
+      <w:r>
+        <w:t xml:space="preserve"> </w:t>
+      </w:r>
+      <w:r>
+        <w:t xml:space="preserve">Forcing a spec there either flattens the task into a checklist that</w:t>
+      </w:r>
+      <w:r>
+        <w:t xml:space="preserve"> </w:t>
+      </w:r>
+      <w:r>
+        <w:t xml:space="preserve">misses the point, or you end up building an LLM judge — which just moves</w:t>
+      </w:r>
+      <w:r>
+        <w:t xml:space="preserve"> </w:t>
+      </w:r>
+      <w:r>
+        <w:t xml:space="preserve">“who verifies this”</w:t>
+      </w:r>
+      <w:r>
+        <w:t xml:space="preserve"> </w:t>
+      </w:r>
+      <w:r>
+        <w:t xml:space="preserve">one</w:t>
+      </w:r>
+      <w:r>
+        <w:t xml:space="preserve"> </w:t>
+      </w:r>
+      <w:r>
+        <w:t xml:space="preserve">level up, onto something that itself needs verifying.</w:t>
       </w:r>
     </w:p>
     <w:p>
@@ -6251,29 +6094,452 @@
         </w:numPr>
       </w:pPr>
       <w:r>
-        <w:t xml:space="preserve">Point out that the ticket</w:t>
-      </w:r>
-      <w:r>
-        <w:t xml:space="preserve"> </w:t>
-      </w:r>
-      <w:r>
-        <w:rPr>
+        <w:rPr>
+          <w:b/>
+          <w:bCs/>
+        </w:rPr>
+        <w:t xml:space="preserve">The honest limit of</w:t>
+      </w:r>
+      <w:r>
+        <w:rPr>
+          <w:b/>
+          <w:bCs/>
+        </w:rPr>
+        <w:t xml:space="preserve"> </w:t>
+      </w:r>
+      <w:r>
+        <w:rPr>
+          <w:b/>
+          <w:bCs/>
           <w:i/>
           <w:iCs/>
         </w:rPr>
-        <w:t xml:space="preserve">asks the agent to build the runner</w:t>
-      </w:r>
-      <w:r>
-        <w:t xml:space="preserve"> </w:t>
-      </w:r>
-      <w:r>
-        <w:t xml:space="preserve">— nobody in the room has to know how</w:t>
-      </w:r>
-      <w:r>
-        <w:t xml:space="preserve"> </w:t>
-      </w:r>
-      <w:r>
-        <w:t xml:space="preserve">to test a</w:t>
+        <w:t xml:space="preserve">this</w:t>
+      </w:r>
+      <w:r>
+        <w:rPr>
+          <w:b/>
+          <w:bCs/>
+        </w:rPr>
+        <w:t xml:space="preserve"> </w:t>
+      </w:r>
+      <w:r>
+        <w:rPr>
+          <w:b/>
+          <w:bCs/>
+        </w:rPr>
+        <w:t xml:space="preserve">exercise specifically:</w:t>
+      </w:r>
+      <w:r>
+        <w:t xml:space="preserve"> </w:t>
+      </w:r>
+      <w:r>
+        <w:t xml:space="preserve">the runner proves the</w:t>
+      </w:r>
+      <w:r>
+        <w:t xml:space="preserve"> </w:t>
+      </w:r>
+      <w:r>
+        <w:rPr>
+          <w:i/>
+          <w:iCs/>
+        </w:rPr>
+        <w:t xml:space="preserve">code</w:t>
+      </w:r>
+      <w:r>
+        <w:t xml:space="preserve"> </w:t>
+      </w:r>
+      <w:r>
+        <w:t xml:space="preserve">matches the</w:t>
+      </w:r>
+      <w:r>
+        <w:t xml:space="preserve"> </w:t>
+      </w:r>
+      <w:r>
+        <w:rPr>
+          <w:i/>
+          <w:iCs/>
+        </w:rPr>
+        <w:t xml:space="preserve">spec</w:t>
+      </w:r>
+      <w:r>
+        <w:t xml:space="preserve">. It doesn’t prove the spec matches what you actually meant — if the same person (or the same</w:t>
+      </w:r>
+      <w:r>
+        <w:t xml:space="preserve"> </w:t>
+      </w:r>
+      <w:r>
+        <w:t xml:space="preserve">agent) writes both the implementation and the spec by watching the code run, you get a regression</w:t>
+      </w:r>
+      <w:r>
+        <w:t xml:space="preserve"> </w:t>
+      </w:r>
+      <w:r>
+        <w:t xml:space="preserve">lock on today’s behavior, not a correctness check against intent. The scenario in this workshop is</w:t>
+      </w:r>
+      <w:r>
+        <w:t xml:space="preserve"> </w:t>
+      </w:r>
+      <w:r>
+        <w:t xml:space="preserve">authored in Part 1, before any code exists — that’s what makes it a real check. In your own work,</w:t>
+      </w:r>
+      <w:r>
+        <w:t xml:space="preserve"> </w:t>
+      </w:r>
+      <w:r>
+        <w:t xml:space="preserve">that means: write the spec first, or have someone other than the implementer sign off on it, before</w:t>
+      </w:r>
+      <w:r>
+        <w:t xml:space="preserve"> </w:t>
+      </w:r>
+      <w:r>
+        <w:t xml:space="preserve">trusting it as proof of anything.</w:t>
+      </w:r>
+    </w:p>
+    <w:bookmarkEnd w:id="47"/>
+    <w:bookmarkStart w:id="48" w:name="isnt-this-just-a-unit-test"/>
+    <w:p>
+      <w:pPr>
+        <w:pStyle w:val="Heading2"/>
+      </w:pPr>
+      <w:r>
+        <w:t xml:space="preserve">“Isn’t this just a unit test?”</w:t>
+      </w:r>
+    </w:p>
+    <w:p>
+      <w:pPr>
+        <w:pStyle w:val="FirstParagraph"/>
+      </w:pPr>
+      <w:r>
+        <w:t xml:space="preserve">Say yes first — for this exact bug, a unit-test equivalent would catch it too:</w:t>
+      </w:r>
+    </w:p>
+    <w:p>
+      <w:pPr>
+        <w:pStyle w:val="SourceCode"/>
+      </w:pPr>
+      <w:r>
+        <w:rPr>
+          <w:rStyle w:val="FunctionTok"/>
+        </w:rPr>
+        <w:t xml:space="preserve">test</w:t>
+      </w:r>
+      <w:r>
+        <w:rPr>
+          <w:rStyle w:val="NormalTok"/>
+        </w:rPr>
+        <w:t xml:space="preserve">(</w:t>
+      </w:r>
+      <w:r>
+        <w:rPr>
+          <w:rStyle w:val="StringTok"/>
+        </w:rPr>
+        <w:t xml:space="preserve">"below minimum is rejected"</w:t>
+      </w:r>
+      <w:r>
+        <w:rPr>
+          <w:rStyle w:val="OperatorTok"/>
+        </w:rPr>
+        <w:t xml:space="preserve">,</w:t>
+      </w:r>
+      <w:r>
+        <w:rPr>
+          <w:rStyle w:val="NormalTok"/>
+        </w:rPr>
+        <w:t xml:space="preserve"> () </w:t>
+      </w:r>
+      <w:r>
+        <w:rPr>
+          <w:rStyle w:val="KeywordTok"/>
+        </w:rPr>
+        <w:t xml:space="preserve">=&gt;</w:t>
+      </w:r>
+      <w:r>
+        <w:rPr>
+          <w:rStyle w:val="NormalTok"/>
+        </w:rPr>
+        <w:t xml:space="preserve"> {</w:t>
+      </w:r>
+      <w:r>
+        <w:br/>
+      </w:r>
+      <w:r>
+        <w:rPr>
+          <w:rStyle w:val="NormalTok"/>
+        </w:rPr>
+        <w:t xml:space="preserve">  </w:t>
+      </w:r>
+      <w:r>
+        <w:rPr>
+          <w:rStyle w:val="KeywordTok"/>
+        </w:rPr>
+        <w:t xml:space="preserve">const</w:t>
+      </w:r>
+      <w:r>
+        <w:rPr>
+          <w:rStyle w:val="NormalTok"/>
+        </w:rPr>
+        <w:t xml:space="preserve"> result </w:t>
+      </w:r>
+      <w:r>
+        <w:rPr>
+          <w:rStyle w:val="OperatorTok"/>
+        </w:rPr>
+        <w:t xml:space="preserve">=</w:t>
+      </w:r>
+      <w:r>
+        <w:rPr>
+          <w:rStyle w:val="NormalTok"/>
+        </w:rPr>
+        <w:t xml:space="preserve"> </w:t>
+      </w:r>
+      <w:r>
+        <w:rPr>
+          <w:rStyle w:val="FunctionTok"/>
+        </w:rPr>
+        <w:t xml:space="preserve">apply_discount</w:t>
+      </w:r>
+      <w:r>
+        <w:rPr>
+          <w:rStyle w:val="NormalTok"/>
+        </w:rPr>
+        <w:t xml:space="preserve">(</w:t>
+      </w:r>
+      <w:r>
+        <w:rPr>
+          <w:rStyle w:val="FloatTok"/>
+        </w:rPr>
+        <w:t xml:space="preserve">40.0</w:t>
+      </w:r>
+      <w:r>
+        <w:rPr>
+          <w:rStyle w:val="OperatorTok"/>
+        </w:rPr>
+        <w:t xml:space="preserve">,</w:t>
+      </w:r>
+      <w:r>
+        <w:rPr>
+          <w:rStyle w:val="NormalTok"/>
+        </w:rPr>
+        <w:t xml:space="preserve"> </w:t>
+      </w:r>
+      <w:r>
+        <w:rPr>
+          <w:rStyle w:val="StringTok"/>
+        </w:rPr>
+        <w:t xml:space="preserve">"SAVE10"</w:t>
+      </w:r>
+      <w:r>
+        <w:rPr>
+          <w:rStyle w:val="NormalTok"/>
+        </w:rPr>
+        <w:t xml:space="preserve">)</w:t>
+      </w:r>
+      <w:r>
+        <w:rPr>
+          <w:rStyle w:val="OperatorTok"/>
+        </w:rPr>
+        <w:t xml:space="preserve">;</w:t>
+      </w:r>
+      <w:r>
+        <w:br/>
+      </w:r>
+      <w:r>
+        <w:rPr>
+          <w:rStyle w:val="NormalTok"/>
+        </w:rPr>
+        <w:t xml:space="preserve">  </w:t>
+      </w:r>
+      <w:r>
+        <w:rPr>
+          <w:rStyle w:val="FunctionTok"/>
+        </w:rPr>
+        <w:t xml:space="preserve">expect</w:t>
+      </w:r>
+      <w:r>
+        <w:rPr>
+          <w:rStyle w:val="NormalTok"/>
+        </w:rPr>
+        <w:t xml:space="preserve">(result</w:t>
+      </w:r>
+      <w:r>
+        <w:rPr>
+          <w:rStyle w:val="OperatorTok"/>
+        </w:rPr>
+        <w:t xml:space="preserve">.</w:t>
+      </w:r>
+      <w:r>
+        <w:rPr>
+          <w:rStyle w:val="AttributeTok"/>
+        </w:rPr>
+        <w:t xml:space="preserve">applied</w:t>
+      </w:r>
+      <w:r>
+        <w:rPr>
+          <w:rStyle w:val="NormalTok"/>
+        </w:rPr>
+        <w:t xml:space="preserve">)</w:t>
+      </w:r>
+      <w:r>
+        <w:rPr>
+          <w:rStyle w:val="OperatorTok"/>
+        </w:rPr>
+        <w:t xml:space="preserve">.</w:t>
+      </w:r>
+      <w:r>
+        <w:rPr>
+          <w:rStyle w:val="FunctionTok"/>
+        </w:rPr>
+        <w:t xml:space="preserve">toBe</w:t>
+      </w:r>
+      <w:r>
+        <w:rPr>
+          <w:rStyle w:val="NormalTok"/>
+        </w:rPr>
+        <w:t xml:space="preserve">(</w:t>
+      </w:r>
+      <w:r>
+        <w:rPr>
+          <w:rStyle w:val="KeywordTok"/>
+        </w:rPr>
+        <w:t xml:space="preserve">false</w:t>
+      </w:r>
+      <w:r>
+        <w:rPr>
+          <w:rStyle w:val="NormalTok"/>
+        </w:rPr>
+        <w:t xml:space="preserve">)</w:t>
+      </w:r>
+      <w:r>
+        <w:rPr>
+          <w:rStyle w:val="OperatorTok"/>
+        </w:rPr>
+        <w:t xml:space="preserve">;</w:t>
+      </w:r>
+      <w:r>
+        <w:br/>
+      </w:r>
+      <w:r>
+        <w:rPr>
+          <w:rStyle w:val="NormalTok"/>
+        </w:rPr>
+        <w:t xml:space="preserve">  </w:t>
+      </w:r>
+      <w:r>
+        <w:rPr>
+          <w:rStyle w:val="FunctionTok"/>
+        </w:rPr>
+        <w:t xml:space="preserve">expect</w:t>
+      </w:r>
+      <w:r>
+        <w:rPr>
+          <w:rStyle w:val="NormalTok"/>
+        </w:rPr>
+        <w:t xml:space="preserve">(result</w:t>
+      </w:r>
+      <w:r>
+        <w:rPr>
+          <w:rStyle w:val="OperatorTok"/>
+        </w:rPr>
+        <w:t xml:space="preserve">.</w:t>
+      </w:r>
+      <w:r>
+        <w:rPr>
+          <w:rStyle w:val="AttributeTok"/>
+        </w:rPr>
+        <w:t xml:space="preserve">reason</w:t>
+      </w:r>
+      <w:r>
+        <w:rPr>
+          <w:rStyle w:val="NormalTok"/>
+        </w:rPr>
+        <w:t xml:space="preserve">)</w:t>
+      </w:r>
+      <w:r>
+        <w:rPr>
+          <w:rStyle w:val="OperatorTok"/>
+        </w:rPr>
+        <w:t xml:space="preserve">.</w:t>
+      </w:r>
+      <w:r>
+        <w:rPr>
+          <w:rStyle w:val="FunctionTok"/>
+        </w:rPr>
+        <w:t xml:space="preserve">toBe</w:t>
+      </w:r>
+      <w:r>
+        <w:rPr>
+          <w:rStyle w:val="NormalTok"/>
+        </w:rPr>
+        <w:t xml:space="preserve">(</w:t>
+      </w:r>
+      <w:r>
+        <w:rPr>
+          <w:rStyle w:val="StringTok"/>
+        </w:rPr>
+        <w:t xml:space="preserve">"minimum not met"</w:t>
+      </w:r>
+      <w:r>
+        <w:rPr>
+          <w:rStyle w:val="NormalTok"/>
+        </w:rPr>
+        <w:t xml:space="preserve">)</w:t>
+      </w:r>
+      <w:r>
+        <w:rPr>
+          <w:rStyle w:val="OperatorTok"/>
+        </w:rPr>
+        <w:t xml:space="preserve">;</w:t>
+      </w:r>
+      <w:r>
+        <w:br/>
+      </w:r>
+      <w:r>
+        <w:rPr>
+          <w:rStyle w:val="NormalTok"/>
+        </w:rPr>
+        <w:t xml:space="preserve">})</w:t>
+      </w:r>
+      <w:r>
+        <w:rPr>
+          <w:rStyle w:val="OperatorTok"/>
+        </w:rPr>
+        <w:t xml:space="preserve">;</w:t>
+      </w:r>
+    </w:p>
+    <w:p>
+      <w:pPr>
+        <w:pStyle w:val="FirstParagraph"/>
+      </w:pPr>
+      <w:r>
+        <w:t xml:space="preserve">Same detection power, same mechanism. The DSL isn’t a stronger test — the difference is</w:t>
+      </w:r>
+      <w:r>
+        <w:t xml:space="preserve"> </w:t>
+      </w:r>
+      <w:r>
+        <w:rPr>
+          <w:i/>
+          <w:iCs/>
+        </w:rPr>
+        <w:t xml:space="preserve">who could</w:t>
+      </w:r>
+      <w:r>
+        <w:rPr>
+          <w:i/>
+          <w:iCs/>
+        </w:rPr>
+        <w:t xml:space="preserve"> </w:t>
+      </w:r>
+      <w:r>
+        <w:rPr>
+          <w:i/>
+          <w:iCs/>
+        </w:rPr>
+        <w:t xml:space="preserve">have written it</w:t>
+      </w:r>
+      <w:r>
+        <w:t xml:space="preserve">. The</w:t>
       </w:r>
       <w:r>
         <w:t xml:space="preserve"> </w:t>
@@ -6285,191 +6551,145 @@
         <w:t xml:space="preserve">.feature</w:t>
       </w:r>
       <w:r>
-        <w:t xml:space="preserve">.</w:t>
-      </w:r>
-    </w:p>
-    <w:p>
-      <w:pPr>
-        <w:pStyle w:val="Compact"/>
-        <w:numPr>
-          <w:ilvl w:val="0"/>
-          <w:numId w:val="1007"/>
-        </w:numPr>
-      </w:pPr>
-      <w:r>
-        <w:t xml:space="preserve">Let the agent build the</w:t>
-      </w:r>
-      <w:r>
-        <w:t xml:space="preserve"> </w:t>
-      </w:r>
-      <w:r>
-        <w:rPr>
-          <w:rStyle w:val="VerbatimChar"/>
-        </w:rPr>
-        <w:t xml:space="preserve">.feature</w:t>
-      </w:r>
-      <w:r>
-        <w:t xml:space="preserve"> </w:t>
-      </w:r>
-      <w:r>
-        <w:t xml:space="preserve">+</w:t>
-      </w:r>
-      <w:r>
-        <w:t xml:space="preserve"> </w:t>
-      </w:r>
-      <w:r>
-        <w:rPr>
-          <w:rStyle w:val="VerbatimChar"/>
-        </w:rPr>
-        <w:t xml:space="preserve">discount.js</w:t>
-      </w:r>
-      <w:r>
-        <w:t xml:space="preserve"> </w:t>
-      </w:r>
-      <w:r>
-        <w:t xml:space="preserve">+</w:t>
-      </w:r>
-      <w:r>
-        <w:t xml:space="preserve"> </w:t>
-      </w:r>
-      <w:r>
-        <w:rPr>
-          <w:rStyle w:val="VerbatimChar"/>
-        </w:rPr>
-        <w:t xml:space="preserve">dsl_runner.js</w:t>
-      </w:r>
-      <w:r>
-        <w:t xml:space="preserve">; run the checker, show green;</w:t>
-      </w:r>
-      <w:r>
-        <w:t xml:space="preserve"> </w:t>
-      </w:r>
-      <w:r>
-        <w:rPr>
-          <w:rStyle w:val="VerbatimChar"/>
-        </w:rPr>
-        <w:t xml:space="preserve">node dsl_runner.js 120 SAVE20</w:t>
-      </w:r>
-      <w:r>
-        <w:t xml:space="preserve"> </w:t>
-      </w:r>
-      <w:r>
-        <w:t xml:space="preserve">to poke the rule live.</w:t>
-      </w:r>
-    </w:p>
-    <w:p>
-      <w:pPr>
-        <w:pStyle w:val="Compact"/>
-        <w:numPr>
-          <w:ilvl w:val="0"/>
-          <w:numId w:val="1007"/>
-        </w:numPr>
-      </w:pPr>
-      <w:r>
-        <w:t xml:space="preserve">Sprint the app (Part 2), open it, apply</w:t>
-      </w:r>
-      <w:r>
-        <w:t xml:space="preserve"> </w:t>
-      </w:r>
-      <w:r>
-        <w:rPr>
-          <w:rStyle w:val="VerbatimChar"/>
-        </w:rPr>
-        <w:t xml:space="preserve">SAVE20</w:t>
-      </w:r>
-      <w:r>
-        <w:t xml:space="preserve"> </w:t>
-      </w:r>
-      <w:r>
-        <w:t xml:space="preserve">→ $96.00.</w:t>
-      </w:r>
-    </w:p>
-    <w:p>
-      <w:pPr>
-        <w:pStyle w:val="Compact"/>
-        <w:numPr>
-          <w:ilvl w:val="0"/>
-          <w:numId w:val="1007"/>
-        </w:numPr>
-      </w:pPr>
-      <w:r>
-        <w:t xml:space="preserve">Break</w:t>
-      </w:r>
-      <w:r>
-        <w:t xml:space="preserve"> </w:t>
-      </w:r>
-      <w:r>
-        <w:rPr>
-          <w:rStyle w:val="VerbatimChar"/>
-        </w:rPr>
-        <w:t xml:space="preserve">discount.js</w:t>
-      </w:r>
-      <w:r>
-        <w:t xml:space="preserve"> </w:t>
-      </w:r>
-      <w:r>
-        <w:t xml:space="preserve">live, re-run the checker (and</w:t>
-      </w:r>
-      <w:r>
-        <w:t xml:space="preserve"> </w:t>
-      </w:r>
-      <w:r>
-        <w:rPr>
-          <w:rStyle w:val="VerbatimChar"/>
-        </w:rPr>
-        <w:t xml:space="preserve">sprint complete</w:t>
-      </w:r>
-      <w:r>
-        <w:t xml:space="preserve">), show the exact</w:t>
-      </w:r>
-      <w:r>
-        <w:t xml:space="preserve"> </w:t>
-      </w:r>
-      <w:r>
-        <w:rPr>
-          <w:rStyle w:val="VerbatimChar"/>
-        </w:rPr>
-        <w:t xml:space="preserve">[FAIL]</w:t>
-      </w:r>
-      <w:r>
-        <w:t xml:space="preserve"> </w:t>
-      </w:r>
-      <w:r>
+        <w:t xml:space="preserve"> </w:t>
+      </w:r>
+      <w:r>
+        <w:t xml:space="preserve">version only requires knowing the discount rule; the unit-test</w:t>
+      </w:r>
+      <w:r>
+        <w:t xml:space="preserve"> </w:t>
+      </w:r>
+      <w:r>
+        <w:t xml:space="preserve">version requires knowing the rule</w:t>
+      </w:r>
+      <w:r>
+        <w:t xml:space="preserve"> </w:t>
+      </w:r>
+      <w:r>
+        <w:rPr>
+          <w:b/>
+          <w:bCs/>
+        </w:rPr>
         <w:t xml:space="preserve">and</w:t>
       </w:r>
       <w:r>
         <w:t xml:space="preserve"> </w:t>
       </w:r>
       <w:r>
-        <w:t xml:space="preserve">the app now wrongly discounting $40, then revert and show green again. This is the whole point in</w:t>
-      </w:r>
-      <w:r>
-        <w:t xml:space="preserve"> </w:t>
-      </w:r>
-      <w:r>
-        <w:t xml:space="preserve">about fifteen seconds.</w:t>
-      </w:r>
-    </w:p>
-    <w:p>
-      <w:pPr>
-        <w:pStyle w:val="Compact"/>
-        <w:numPr>
-          <w:ilvl w:val="0"/>
-          <w:numId w:val="1007"/>
-        </w:numPr>
-      </w:pPr>
-      <w:r>
-        <w:t xml:space="preserve">Close on the honest-limit section above — name what this does and doesn’t prove before anyone asks.</w:t>
-      </w:r>
-    </w:p>
-    <w:bookmarkEnd w:id="49"/>
-    <w:bookmarkStart w:id="50" w:name="related-material"/>
+        <w:t xml:space="preserve">the language (</w:t>
+      </w:r>
+      <w:r>
+        <w:rPr>
+          <w:rStyle w:val="VerbatimChar"/>
+        </w:rPr>
+        <w:t xml:space="preserve">expect</w:t>
+      </w:r>
+      <w:r>
+        <w:t xml:space="preserve">, object access, how to run the</w:t>
+      </w:r>
+      <w:r>
+        <w:t xml:space="preserve"> </w:t>
+      </w:r>
+      <w:r>
+        <w:t xml:space="preserve">suite). Whoever owns the pricing policy can write and sign off on the scenario directly, with zero</w:t>
+      </w:r>
+      <w:r>
+        <w:t xml:space="preserve"> </w:t>
+      </w:r>
+      <w:r>
+        <w:t xml:space="preserve">code literacy — the unit test needs a translation step from rule to assertion syntax, done by whoever</w:t>
+      </w:r>
+      <w:r>
+        <w:t xml:space="preserve"> </w:t>
+      </w:r>
+      <w:r>
+        <w:t xml:space="preserve">implements it, which is exactly where intent quietly drifts.</w:t>
+      </w:r>
+    </w:p>
+    <w:p>
+      <w:pPr>
+        <w:pStyle w:val="BodyText"/>
+      </w:pPr>
+      <w:r>
+        <w:t xml:space="preserve">One counter to have ready:</w:t>
+      </w:r>
+      <w:r>
+        <w:t xml:space="preserve"> </w:t>
+      </w:r>
+      <w:r>
+        <w:t xml:space="preserve">“isn’t</w:t>
+      </w:r>
+      <w:r>
+        <w:t xml:space="preserve"> </w:t>
+      </w:r>
+      <w:r>
+        <w:t xml:space="preserve">‘write the check before the code’</w:t>
+      </w:r>
+      <w:r>
+        <w:t xml:space="preserve"> </w:t>
+      </w:r>
+      <w:r>
+        <w:t xml:space="preserve">just TDD?”</w:t>
+      </w:r>
+      <w:r>
+        <w:t xml:space="preserve"> </w:t>
+      </w:r>
+      <w:r>
+        <w:t xml:space="preserve">Yes — concede it.</w:t>
+      </w:r>
+      <w:r>
+        <w:t xml:space="preserve"> </w:t>
+      </w:r>
+      <w:r>
+        <w:t xml:space="preserve">TDD gets you the ordering. It doesn’t get you the readership: a test-first unit-test file is still</w:t>
+      </w:r>
+      <w:r>
+        <w:t xml:space="preserve"> </w:t>
+      </w:r>
+      <w:r>
+        <w:t xml:space="preserve">unreadable to whoever actually owns the rule. That gap matters more, not less, as rules move further</w:t>
+      </w:r>
+      <w:r>
+        <w:t xml:space="preserve"> </w:t>
+      </w:r>
+      <w:r>
+        <w:t xml:space="preserve">from engineering — pricing policy, compliance, CFIHOS conformance — cases where the person who knows</w:t>
+      </w:r>
+      <w:r>
+        <w:t xml:space="preserve"> </w:t>
+      </w:r>
+      <w:r>
+        <w:t xml:space="preserve">what</w:t>
+      </w:r>
+      <w:r>
+        <w:t xml:space="preserve"> </w:t>
+      </w:r>
+      <w:r>
+        <w:t xml:space="preserve">“correct”</w:t>
+      </w:r>
+      <w:r>
+        <w:t xml:space="preserve"> </w:t>
+      </w:r>
+      <w:r>
+        <w:t xml:space="preserve">means was never going to write the assertion.</w:t>
+      </w:r>
+    </w:p>
+    <w:bookmarkEnd w:id="48"/>
+    <w:bookmarkStart w:id="49" w:name="X9a249f5f163a90280cb293225baf90a156639df"/>
     <w:p>
       <w:pPr>
         <w:pStyle w:val="Heading2"/>
       </w:pPr>
       <w:r>
-        <w:t xml:space="preserve">Related material</w:t>
+        <w:t xml:space="preserve">Suggested demonstration sequence (for instructors)</w:t>
+      </w:r>
+    </w:p>
+    <w:p>
+      <w:pPr>
+        <w:pStyle w:val="FirstParagraph"/>
+      </w:pPr>
+      <w:r>
+        <w:t xml:space="preserve">Condensed recap, for running this live in front of a group:</w:t>
       </w:r>
     </w:p>
     <w:p>
@@ -6481,28 +6701,40 @@
         </w:numPr>
       </w:pPr>
       <w:r>
-        <w:t xml:space="preserve">The real-world version of this pattern: a CFIHOS-style conformance engine for plant equipment data,</w:t>
-      </w:r>
-      <w:r>
-        <w:t xml:space="preserve"> </w:t>
-      </w:r>
-      <w:r>
-        <w:t xml:space="preserve">with the same spec/runner/live-break structure, in</w:t>
-      </w:r>
-      <w:r>
-        <w:t xml:space="preserve"> </w:t>
-      </w:r>
-      <w:r>
-        <w:rPr>
-          <w:rStyle w:val="VerbatimChar"/>
-        </w:rPr>
-        <w:t xml:space="preserve">overtone_demo/scenarios.py</w:t>
-      </w:r>
-      <w:r>
-        <w:t xml:space="preserve"> </w:t>
-      </w:r>
-      <w:r>
-        <w:t xml:space="preserve">(separate repo).</w:t>
+        <w:t xml:space="preserve">Show</w:t>
+      </w:r>
+      <w:r>
+        <w:t xml:space="preserve"> </w:t>
+      </w:r>
+      <w:r>
+        <w:rPr>
+          <w:rStyle w:val="VerbatimChar"/>
+        </w:rPr>
+        <w:t xml:space="preserve">specs/discount.feature</w:t>
+      </w:r>
+      <w:r>
+        <w:t xml:space="preserve"> </w:t>
+      </w:r>
+      <w:r>
+        <w:t xml:space="preserve">(or author it live on the board, Part 1) — read it aloud, confirm the</w:t>
+      </w:r>
+      <w:r>
+        <w:t xml:space="preserve"> </w:t>
+      </w:r>
+      <w:r>
+        <w:t xml:space="preserve">room agrees on what</w:t>
+      </w:r>
+      <w:r>
+        <w:t xml:space="preserve"> </w:t>
+      </w:r>
+      <w:r>
+        <w:t xml:space="preserve">“correct”</w:t>
+      </w:r>
+      <w:r>
+        <w:t xml:space="preserve"> </w:t>
+      </w:r>
+      <w:r>
+        <w:t xml:space="preserve">means before any code exists.</w:t>
       </w:r>
     </w:p>
     <w:p>
@@ -6511,6 +6743,269 @@
         <w:numPr>
           <w:ilvl w:val="0"/>
           <w:numId w:val="1008"/>
+        </w:numPr>
+      </w:pPr>
+      <w:r>
+        <w:t xml:space="preserve">Point out that the ticket</w:t>
+      </w:r>
+      <w:r>
+        <w:t xml:space="preserve"> </w:t>
+      </w:r>
+      <w:r>
+        <w:rPr>
+          <w:i/>
+          <w:iCs/>
+        </w:rPr>
+        <w:t xml:space="preserve">asks the agent to build the runner</w:t>
+      </w:r>
+      <w:r>
+        <w:t xml:space="preserve"> </w:t>
+      </w:r>
+      <w:r>
+        <w:t xml:space="preserve">— nobody in the room has to know how</w:t>
+      </w:r>
+      <w:r>
+        <w:t xml:space="preserve"> </w:t>
+      </w:r>
+      <w:r>
+        <w:t xml:space="preserve">to test a</w:t>
+      </w:r>
+      <w:r>
+        <w:t xml:space="preserve"> </w:t>
+      </w:r>
+      <w:r>
+        <w:rPr>
+          <w:rStyle w:val="VerbatimChar"/>
+        </w:rPr>
+        <w:t xml:space="preserve">.feature</w:t>
+      </w:r>
+      <w:r>
+        <w:t xml:space="preserve">.</w:t>
+      </w:r>
+    </w:p>
+    <w:p>
+      <w:pPr>
+        <w:pStyle w:val="Compact"/>
+        <w:numPr>
+          <w:ilvl w:val="0"/>
+          <w:numId w:val="1008"/>
+        </w:numPr>
+      </w:pPr>
+      <w:r>
+        <w:t xml:space="preserve">Let the agent build the</w:t>
+      </w:r>
+      <w:r>
+        <w:t xml:space="preserve"> </w:t>
+      </w:r>
+      <w:r>
+        <w:rPr>
+          <w:rStyle w:val="VerbatimChar"/>
+        </w:rPr>
+        <w:t xml:space="preserve">.feature</w:t>
+      </w:r>
+      <w:r>
+        <w:t xml:space="preserve"> </w:t>
+      </w:r>
+      <w:r>
+        <w:t xml:space="preserve">+</w:t>
+      </w:r>
+      <w:r>
+        <w:t xml:space="preserve"> </w:t>
+      </w:r>
+      <w:r>
+        <w:rPr>
+          <w:rStyle w:val="VerbatimChar"/>
+        </w:rPr>
+        <w:t xml:space="preserve">discount.js</w:t>
+      </w:r>
+      <w:r>
+        <w:t xml:space="preserve"> </w:t>
+      </w:r>
+      <w:r>
+        <w:t xml:space="preserve">+</w:t>
+      </w:r>
+      <w:r>
+        <w:t xml:space="preserve"> </w:t>
+      </w:r>
+      <w:r>
+        <w:rPr>
+          <w:rStyle w:val="VerbatimChar"/>
+        </w:rPr>
+        <w:t xml:space="preserve">dsl_runner.js</w:t>
+      </w:r>
+      <w:r>
+        <w:t xml:space="preserve">; run the checker, show green;</w:t>
+      </w:r>
+      <w:r>
+        <w:t xml:space="preserve"> </w:t>
+      </w:r>
+      <w:r>
+        <w:rPr>
+          <w:rStyle w:val="VerbatimChar"/>
+        </w:rPr>
+        <w:t xml:space="preserve">node dsl_runner.js 120 SAVE20</w:t>
+      </w:r>
+      <w:r>
+        <w:t xml:space="preserve"> </w:t>
+      </w:r>
+      <w:r>
+        <w:t xml:space="preserve">to poke the rule live.</w:t>
+      </w:r>
+    </w:p>
+    <w:p>
+      <w:pPr>
+        <w:pStyle w:val="Compact"/>
+        <w:numPr>
+          <w:ilvl w:val="0"/>
+          <w:numId w:val="1008"/>
+        </w:numPr>
+      </w:pPr>
+      <w:r>
+        <w:t xml:space="preserve">Sprint the app (Part 2), open it, apply</w:t>
+      </w:r>
+      <w:r>
+        <w:t xml:space="preserve"> </w:t>
+      </w:r>
+      <w:r>
+        <w:rPr>
+          <w:rStyle w:val="VerbatimChar"/>
+        </w:rPr>
+        <w:t xml:space="preserve">SAVE20</w:t>
+      </w:r>
+      <w:r>
+        <w:t xml:space="preserve"> </w:t>
+      </w:r>
+      <w:r>
+        <w:t xml:space="preserve">→ $96.00.</w:t>
+      </w:r>
+    </w:p>
+    <w:p>
+      <w:pPr>
+        <w:pStyle w:val="Compact"/>
+        <w:numPr>
+          <w:ilvl w:val="0"/>
+          <w:numId w:val="1008"/>
+        </w:numPr>
+      </w:pPr>
+      <w:r>
+        <w:t xml:space="preserve">Break</w:t>
+      </w:r>
+      <w:r>
+        <w:t xml:space="preserve"> </w:t>
+      </w:r>
+      <w:r>
+        <w:rPr>
+          <w:rStyle w:val="VerbatimChar"/>
+        </w:rPr>
+        <w:t xml:space="preserve">discount.js</w:t>
+      </w:r>
+      <w:r>
+        <w:t xml:space="preserve"> </w:t>
+      </w:r>
+      <w:r>
+        <w:t xml:space="preserve">live, re-run the checker (and</w:t>
+      </w:r>
+      <w:r>
+        <w:t xml:space="preserve"> </w:t>
+      </w:r>
+      <w:r>
+        <w:rPr>
+          <w:rStyle w:val="VerbatimChar"/>
+        </w:rPr>
+        <w:t xml:space="preserve">sprint complete</w:t>
+      </w:r>
+      <w:r>
+        <w:t xml:space="preserve">), show the exact</w:t>
+      </w:r>
+      <w:r>
+        <w:t xml:space="preserve"> </w:t>
+      </w:r>
+      <w:r>
+        <w:rPr>
+          <w:rStyle w:val="VerbatimChar"/>
+        </w:rPr>
+        <w:t xml:space="preserve">[FAIL]</w:t>
+      </w:r>
+      <w:r>
+        <w:t xml:space="preserve"> </w:t>
+      </w:r>
+      <w:r>
+        <w:t xml:space="preserve">and</w:t>
+      </w:r>
+      <w:r>
+        <w:t xml:space="preserve"> </w:t>
+      </w:r>
+      <w:r>
+        <w:t xml:space="preserve">the app now wrongly discounting $40, then revert and show green again. This is the whole point in</w:t>
+      </w:r>
+      <w:r>
+        <w:t xml:space="preserve"> </w:t>
+      </w:r>
+      <w:r>
+        <w:t xml:space="preserve">about fifteen seconds.</w:t>
+      </w:r>
+    </w:p>
+    <w:p>
+      <w:pPr>
+        <w:pStyle w:val="Compact"/>
+        <w:numPr>
+          <w:ilvl w:val="0"/>
+          <w:numId w:val="1008"/>
+        </w:numPr>
+      </w:pPr>
+      <w:r>
+        <w:t xml:space="preserve">Close on the honest-limit section above — name what this does and doesn’t prove before anyone asks.</w:t>
+      </w:r>
+    </w:p>
+    <w:bookmarkEnd w:id="49"/>
+    <w:bookmarkStart w:id="50" w:name="related-material"/>
+    <w:p>
+      <w:pPr>
+        <w:pStyle w:val="Heading2"/>
+      </w:pPr>
+      <w:r>
+        <w:t xml:space="preserve">Related material</w:t>
+      </w:r>
+    </w:p>
+    <w:p>
+      <w:pPr>
+        <w:pStyle w:val="Compact"/>
+        <w:numPr>
+          <w:ilvl w:val="0"/>
+          <w:numId w:val="1009"/>
+        </w:numPr>
+      </w:pPr>
+      <w:r>
+        <w:t xml:space="preserve">The real-world version of this pattern: a CFIHOS-style conformance engine for plant equipment data,</w:t>
+      </w:r>
+      <w:r>
+        <w:t xml:space="preserve"> </w:t>
+      </w:r>
+      <w:r>
+        <w:t xml:space="preserve">with the same spec/runner/live-break structure, in</w:t>
+      </w:r>
+      <w:r>
+        <w:t xml:space="preserve"> </w:t>
+      </w:r>
+      <w:r>
+        <w:rPr>
+          <w:rStyle w:val="VerbatimChar"/>
+        </w:rPr>
+        <w:t xml:space="preserve">overtone_demo/scenarios.py</w:t>
+      </w:r>
+      <w:r>
+        <w:t xml:space="preserve"> </w:t>
+      </w:r>
+      <w:r>
+        <w:t xml:space="preserve">(separate repo).</w:t>
+      </w:r>
+    </w:p>
+    <w:p>
+      <w:pPr>
+        <w:pStyle w:val="Compact"/>
+        <w:numPr>
+          <w:ilvl w:val="0"/>
+          <w:numId w:val="1009"/>
         </w:numPr>
       </w:pPr>
       <w:r>
@@ -6914,6 +7409,9 @@
     <w:abstractNumId w:val="991"/>
   </w:num>
   <w:num w:numId="1005">
+    <w:abstractNumId w:val="991"/>
+  </w:num>
+  <w:num w:numId="1006">
     <w:abstractNumId w:val="99411"/>
     <w:lvlOverride w:ilvl="0">
       <w:startOverride w:val="1"/>
@@ -6943,10 +7441,10 @@
       <w:startOverride w:val="1"/>
     </w:lvlOverride>
   </w:num>
-  <w:num w:numId="1006">
+  <w:num w:numId="1007">
     <w:abstractNumId w:val="991"/>
   </w:num>
-  <w:num w:numId="1007">
+  <w:num w:numId="1008">
     <w:abstractNumId w:val="99411"/>
     <w:lvlOverride w:ilvl="0">
       <w:startOverride w:val="1"/>
@@ -6976,7 +7474,7 @@
       <w:startOverride w:val="1"/>
     </w:lvlOverride>
   </w:num>
-  <w:num w:numId="1008">
+  <w:num w:numId="1009">
     <w:abstractNumId w:val="991"/>
   </w:num>
 </w:numbering>

</xml_diff>

<commit_message>
fix(sprint-check): seed Test Plan placeholder on scenario-insert + save (t-321a timing)
Seed the placeholder immediately when insertEditorSnippet inserts a
scenario/scenario-file into the Acceptance editor, and on saveEdit for
acceptance docs before validation/PUT. Removes the Save->re-Edit dance and
the empty-Test-Plan save block (placeholder is a filled checkbox). Client-only
app.html; README/docx wording updated to the immediate behavior.

Closes: t-e979
</commit_message>
<xml_diff>
--- a/examples/dsl-discount-spec/README.docx
+++ b/examples/dsl-discount-spec/README.docx
@@ -2086,7 +2086,7 @@
         </w:numPr>
       </w:pPr>
       <w:r>
-        <w:t xml:space="preserve">You author only the scenario and this one Test Plan slot. You do</w:t>
+        <w:t xml:space="preserve">You author only the scenario. You do</w:t>
       </w:r>
       <w:r>
         <w:t xml:space="preserve"> </w:t>
@@ -2102,13 +2102,7 @@
         <w:t xml:space="preserve"> </w:t>
       </w:r>
       <w:r>
-        <w:t xml:space="preserve">need to know the runner’s</w:t>
-      </w:r>
-      <w:r>
-        <w:t xml:space="preserve"> </w:t>
-      </w:r>
-      <w:r>
-        <w:t xml:space="preserve">filename, the</w:t>
+        <w:t xml:space="preserve">need to know the runner’s filename, the</w:t>
       </w:r>
       <w:r>
         <w:t xml:space="preserve"> </w:t>
@@ -2123,13 +2117,67 @@
         <w:t xml:space="preserve"> </w:t>
       </w:r>
       <w:r>
-        <w:t xml:space="preserve">path, or the language — the agent picks those and fills the command in</w:t>
-      </w:r>
-      <w:r>
-        <w:t xml:space="preserve"> </w:t>
-      </w:r>
-      <w:r>
-        <w:t xml:space="preserve">(that’s why the slot is a placeholder, not a command you type).</w:t>
+        <w:t xml:space="preserve">path, or the language, and you don’t even have to type the Test Plan line:</w:t>
+      </w:r>
+      <w:r>
+        <w:t xml:space="preserve"> </w:t>
+      </w:r>
+      <w:r>
+        <w:rPr>
+          <w:b/>
+          <w:bCs/>
+        </w:rPr>
+        <w:t xml:space="preserve">the board seeds that</w:t>
+      </w:r>
+      <w:r>
+        <w:rPr>
+          <w:b/>
+          <w:bCs/>
+        </w:rPr>
+        <w:t xml:space="preserve"> </w:t>
+      </w:r>
+      <w:r>
+        <w:rPr>
+          <w:b/>
+          <w:bCs/>
+        </w:rPr>
+        <w:t xml:space="preserve">placeholder automatically the moment you insert a scenario</w:t>
+      </w:r>
+      <w:r>
+        <w:t xml:space="preserve"> </w:t>
+      </w:r>
+      <w:r>
+        <w:t xml:space="preserve">(and again on save), so a first Save</w:t>
+      </w:r>
+      <w:r>
+        <w:t xml:space="preserve"> </w:t>
+      </w:r>
+      <w:r>
+        <w:t xml:space="preserve">passes the</w:t>
+      </w:r>
+      <w:r>
+        <w:t xml:space="preserve"> </w:t>
+      </w:r>
+      <w:r>
+        <w:t xml:space="preserve">“add a Test Plan item”</w:t>
+      </w:r>
+      <w:r>
+        <w:t xml:space="preserve"> </w:t>
+      </w:r>
+      <w:r>
+        <w:t xml:space="preserve">check without a Save-then-reopen dance. The agent later replaces</w:t>
+      </w:r>
+      <w:r>
+        <w:t xml:space="preserve"> </w:t>
+      </w:r>
+      <w:r>
+        <w:t xml:space="preserve">the placeholder with the real command once it builds the runner (that’s why it’s a placeholder,</w:t>
+      </w:r>
+      <w:r>
+        <w:t xml:space="preserve"> </w:t>
+      </w:r>
+      <w:r>
+        <w:t xml:space="preserve">not a command you type).</w:t>
       </w:r>
     </w:p>
     <w:p>

</xml_diff>

<commit_message>
docs(dsl-discount-spec): shorten build-instruction ask (sprint start seeds it)
Part 1 step 3 no longer has the author paste the verbose build instruction;
it states sprint start seeds it into plan.md (start.md rule) and collapses
the full block into <details>. Step 4 prompt updated to follow the seeded
plan.md instruction. Regenerate README.docx.

Closes: t-7491
</commit_message>
<xml_diff>
--- a/examples/dsl-discount-spec/README.docx
+++ b/examples/dsl-discount-spec/README.docx
@@ -2266,91 +2266,262 @@
           <w:b/>
           <w:bCs/>
         </w:rPr>
-        <w:t xml:space="preserve">Add the build instruction — once — so the agent knows how to check it.</w:t>
-      </w:r>
-      <w:r>
-        <w:t xml:space="preserve"> </w:t>
-      </w:r>
-      <w:r>
-        <w:t xml:space="preserve">The scenario you just</w:t>
-      </w:r>
-      <w:r>
-        <w:t xml:space="preserve"> </w:t>
-      </w:r>
-      <w:r>
-        <w:t xml:space="preserve">wrote</w:t>
-      </w:r>
-      <w:r>
-        <w:t xml:space="preserve"> </w:t>
+        <w:t xml:space="preserve">You don’t write the build instruction —</w:t>
       </w:r>
       <w:r>
         <w:rPr>
           <w:b/>
           <w:bCs/>
         </w:rPr>
-        <w:t xml:space="preserve">stays in Acceptance</w:t>
-      </w:r>
-      <w:r>
-        <w:t xml:space="preserve">: that’s the source of truth, and it’s all a non-engineer needs to</w:t>
-      </w:r>
-      <w:r>
-        <w:t xml:space="preserve"> </w:t>
-      </w:r>
-      <w:r>
-        <w:t xml:space="preserve">write. To spare the newcomer from knowing how to build a runner, add a short, reusable build</w:t>
-      </w:r>
-      <w:r>
-        <w:t xml:space="preserve"> </w:t>
-      </w:r>
-      <w:r>
-        <w:t xml:space="preserve">instruction to</w:t>
-      </w:r>
-      <w:r>
-        <w:t xml:space="preserve"> </w:t>
-      </w:r>
-      <w:r>
-        <w:rPr>
-          <w:rStyle w:val="VerbatimChar"/>
-        </w:rPr>
-        <w:t xml:space="preserve">plan.md</w:t>
-      </w:r>
-      <w:r>
-        <w:t xml:space="preserve"> </w:t>
-      </w:r>
-      <w:r>
-        <w:t xml:space="preserve">(or paste it into the sprint prompt in step 4). Notice it does</w:t>
-      </w:r>
-      <w:r>
-        <w:t xml:space="preserve"> </w:t>
-      </w:r>
-      <w:r>
-        <w:rPr>
+        <w:t xml:space="preserve"> </w:t>
+      </w:r>
+      <w:r>
+        <w:rPr>
+          <w:rStyle w:val="VerbatimChar"/>
           <w:b/>
           <w:bCs/>
         </w:rPr>
-        <w:t xml:space="preserve">not</w:t>
-      </w:r>
-      <w:r>
-        <w:t xml:space="preserve"> </w:t>
-      </w:r>
-      <w:r>
-        <w:t xml:space="preserve">name a function signature — the agent infers that from the scenario:</w:t>
-      </w:r>
-    </w:p>
-    <w:p>
-      <w:pPr>
-        <w:pStyle w:val="Compact"/>
+        <w:t xml:space="preserve">sprint start</w:t>
+      </w:r>
+      <w:r>
+        <w:rPr>
+          <w:b/>
+          <w:bCs/>
+        </w:rPr>
+        <w:t xml:space="preserve"> </w:t>
+      </w:r>
+      <w:r>
+        <w:rPr>
+          <w:b/>
+          <w:bCs/>
+        </w:rPr>
+        <w:t xml:space="preserve">seeds it.</w:t>
+      </w:r>
+      <w:r>
+        <w:t xml:space="preserve"> </w:t>
+      </w:r>
+      <w:r>
+        <w:t xml:space="preserve">The scenario</w:t>
+      </w:r>
+      <w:r>
+        <w:t xml:space="preserve"> </w:t>
+      </w:r>
+      <w:r>
+        <w:rPr>
+          <w:b/>
+          <w:bCs/>
+        </w:rPr>
+        <w:t xml:space="preserve">stays in</w:t>
+      </w:r>
+      <w:r>
+        <w:rPr>
+          <w:b/>
+          <w:bCs/>
+        </w:rPr>
+        <w:t xml:space="preserve"> </w:t>
+      </w:r>
+      <w:r>
+        <w:rPr>
+          <w:b/>
+          <w:bCs/>
+        </w:rPr>
+        <w:t xml:space="preserve">Acceptance</w:t>
+      </w:r>
+      <w:r>
+        <w:t xml:space="preserve"> </w:t>
+      </w:r>
+      <w:r>
+        <w:t xml:space="preserve">(the source of truth), and that’s all a non-engineer writes. When you</w:t>
+      </w:r>
+      <w:r>
+        <w:t xml:space="preserve"> </w:t>
+      </w:r>
+      <w:r>
+        <w:rPr>
+          <w:rStyle w:val="VerbatimChar"/>
+        </w:rPr>
+        <w:t xml:space="preserve">sprint start &lt;id&gt;</w:t>
+      </w:r>
+      <w:r>
+        <w:t xml:space="preserve"> </w:t>
+      </w:r>
+      <w:r>
+        <w:t xml:space="preserve">(step 4), canon seeds a standard build instruction into</w:t>
+      </w:r>
+      <w:r>
+        <w:t xml:space="preserve"> </w:t>
+      </w:r>
+      <w:r>
+        <w:rPr>
+          <w:rStyle w:val="VerbatimChar"/>
+        </w:rPr>
+        <w:t xml:space="preserve">plan.md</w:t>
+      </w:r>
+      <w:r>
+        <w:t xml:space="preserve"> </w:t>
+      </w:r>
+      <w:r>
+        <w:t xml:space="preserve">— from</w:t>
+      </w:r>
+      <w:r>
+        <w:t xml:space="preserve"> </w:t>
+      </w:r>
+      <w:r>
+        <w:rPr>
+          <w:rStyle w:val="VerbatimChar"/>
+        </w:rPr>
+        <w:t xml:space="preserve">start.md</w:t>
+      </w:r>
+      <w:r>
+        <w:t xml:space="preserve">’s scenario-backed rule — and the agent follows it: extract the scenario to a</w:t>
+      </w:r>
+      <w:r>
+        <w:t xml:space="preserve"> </w:t>
+      </w:r>
+      <w:r>
+        <w:rPr>
+          <w:i/>
+          <w:iCs/>
+        </w:rPr>
+        <w:t xml:space="preserve">derived</w:t>
+      </w:r>
+      <w:r>
+        <w:t xml:space="preserve"> </w:t>
+      </w:r>
+      <w:r>
+        <w:rPr>
+          <w:rStyle w:val="VerbatimChar"/>
+        </w:rPr>
+        <w:t xml:space="preserve">specs/discount.feature</w:t>
+      </w:r>
+      <w:r>
+        <w:t xml:space="preserve">,</w:t>
+      </w:r>
+      <w:r>
+        <w:t xml:space="preserve"> </w:t>
+      </w:r>
+      <w:r>
+        <w:rPr>
+          <w:b/>
+          <w:bCs/>
+        </w:rPr>
+        <w:t xml:space="preserve">infer</w:t>
+      </w:r>
+      <w:r>
+        <w:t xml:space="preserve"> </w:t>
+      </w:r>
+      <w:r>
+        <w:t xml:space="preserve">the function from it (</w:t>
+      </w:r>
+      <w:r>
+        <w:rPr>
+          <w:rStyle w:val="VerbatimChar"/>
+        </w:rPr>
+        <w:t xml:space="preserve">Given</w:t>
+      </w:r>
+      <w:r>
+        <w:t xml:space="preserve"> </w:t>
+      </w:r>
+      <w:r>
+        <w:t xml:space="preserve">→ inputs,</w:t>
+      </w:r>
+      <w:r>
+        <w:t xml:space="preserve"> </w:t>
+      </w:r>
+      <w:r>
+        <w:rPr>
+          <w:rStyle w:val="VerbatimChar"/>
+        </w:rPr>
+        <w:t xml:space="preserve">Then</w:t>
+      </w:r>
+      <w:r>
+        <w:t xml:space="preserve"> </w:t>
+      </w:r>
+      <w:r>
+        <w:t xml:space="preserve">→ output fields,</w:t>
+      </w:r>
+      <w:r>
+        <w:t xml:space="preserve"> </w:t>
+      </w:r>
+      <w:r>
+        <w:t xml:space="preserve">so you never write a signature), implement</w:t>
+      </w:r>
+      <w:r>
+        <w:t xml:space="preserve"> </w:t>
+      </w:r>
+      <w:r>
+        <w:rPr>
+          <w:rStyle w:val="VerbatimChar"/>
+        </w:rPr>
+        <w:t xml:space="preserve">app/discount.js</w:t>
+      </w:r>
+      <w:r>
+        <w:t xml:space="preserve">, build</w:t>
+      </w:r>
+      <w:r>
+        <w:t xml:space="preserve"> </w:t>
+      </w:r>
+      <w:r>
+        <w:rPr>
+          <w:rStyle w:val="VerbatimChar"/>
+        </w:rPr>
+        <w:t xml:space="preserve">app/dsl_runner.js</w:t>
+      </w:r>
+      <w:r>
+        <w:t xml:space="preserve">, and write</w:t>
+      </w:r>
+      <w:r>
+        <w:t xml:space="preserve"> </w:t>
+      </w:r>
+      <w:r>
+        <w:t xml:space="preserve">the runner command into</w:t>
+      </w:r>
+      <w:r>
+        <w:t xml:space="preserve"> </w:t>
+      </w:r>
+      <w:r>
+        <w:rPr>
+          <w:rStyle w:val="VerbatimChar"/>
+        </w:rPr>
+        <w:t xml:space="preserve">## Test Plan</w:t>
+      </w:r>
+      <w:r>
+        <w:t xml:space="preserve"> </w:t>
+      </w:r>
+      <w:r>
+        <w:t xml:space="preserve">(the board already seeded a placeholder there). Default is</w:t>
+      </w:r>
+      <w:r>
+        <w:t xml:space="preserve"> </w:t>
+      </w:r>
+      <w:r>
+        <w:t xml:space="preserve">JavaScript; for Python, just tell the agent to use</w:t>
+      </w:r>
+      <w:r>
+        <w:t xml:space="preserve"> </w:t>
+      </w:r>
+      <w:r>
+        <w:rPr>
+          <w:rStyle w:val="VerbatimChar"/>
+        </w:rPr>
+        <w:t xml:space="preserve">discount.py</w:t>
+      </w:r>
+      <w:r>
+        <w:t xml:space="preserve"> </w:t>
+      </w:r>
+      <w:r>
+        <w:t xml:space="preserve">with a Python runner.</w:t>
+      </w:r>
+    </w:p>
+    <w:p>
+      <w:pPr>
         <w:numPr>
           <w:ilvl w:val="0"/>
           <w:numId w:val="1000"/>
         </w:numPr>
       </w:pPr>
       <w:r>
-        <w:rPr>
-          <w:b/>
-          <w:bCs/>
-        </w:rPr>
-        <w:t xml:space="preserve">Build instruction (for the implementing agent)</w:t>
+        <w:t xml:space="preserve">The exact build instruction canon seeds — for reference (you don’t hand it over)</w:t>
       </w:r>
     </w:p>
     <w:p>
@@ -2386,7 +2557,10 @@
         <w:t xml:space="preserve">specs/discount.feature</w:t>
       </w:r>
       <w:r>
-        <w:t xml:space="preserve">. That file is a</w:t>
+        <w:t xml:space="preserve"> </w:t>
+      </w:r>
+      <w:r>
+        <w:t xml:space="preserve">(a</w:t>
       </w:r>
       <w:r>
         <w:t xml:space="preserve"> </w:t>
@@ -2402,28 +2576,7 @@
         <w:t xml:space="preserve"> </w:t>
       </w:r>
       <w:r>
-        <w:t xml:space="preserve">—</w:t>
-      </w:r>
-      <w:r>
-        <w:t xml:space="preserve"> </w:t>
-      </w:r>
-      <w:r>
-        <w:t xml:space="preserve">Acceptance stays the source; don’t hand-edit the</w:t>
-      </w:r>
-      <w:r>
-        <w:t xml:space="preserve"> </w:t>
-      </w:r>
-      <w:r>
-        <w:rPr>
-          <w:rStyle w:val="VerbatimChar"/>
-        </w:rPr>
-        <w:t xml:space="preserve">.feature</w:t>
-      </w:r>
-      <w:r>
-        <w:t xml:space="preserve"> </w:t>
-      </w:r>
-      <w:r>
-        <w:t xml:space="preserve">afterward.</w:t>
+        <w:t xml:space="preserve">— Acceptance stays the source; don’t hand-edit it).</w:t>
       </w:r>
     </w:p>
     <w:p>
@@ -2435,7 +2588,7 @@
         </w:numPr>
       </w:pPr>
       <w:r>
-        <w:t xml:space="preserve">Infer the function under test from the scenario:</w:t>
+        <w:t xml:space="preserve">Infer the function under test:</w:t>
       </w:r>
       <w:r>
         <w:t xml:space="preserve"> </w:t>
@@ -2465,13 +2618,7 @@
         <w:t xml:space="preserve"> </w:t>
       </w:r>
       <w:r>
-        <w:t xml:space="preserve">lines are</w:t>
-      </w:r>
-      <w:r>
-        <w:t xml:space="preserve"> </w:t>
-      </w:r>
-      <w:r>
-        <w:t xml:space="preserve">the output fields. You choose the name and signature — the author doesn’t specify it.</w:t>
+        <w:t xml:space="preserve">lines are the output fields. You choose the name and signature.</w:t>
       </w:r>
     </w:p>
     <w:p>
@@ -2510,13 +2657,7 @@
         <w:t xml:space="preserve"> </w:t>
       </w:r>
       <w:r>
-        <w:t xml:space="preserve">— a small fixed-pattern Node</w:t>
-      </w:r>
-      <w:r>
-        <w:t xml:space="preserve"> </w:t>
-      </w:r>
-      <w:r>
-        <w:t xml:space="preserve">runner that recognizes exactly this</w:t>
+        <w:t xml:space="preserve">— a small fixed-pattern Node runner that recognizes this</w:t>
       </w:r>
       <w:r>
         <w:t xml:space="preserve"> </w:t>
@@ -2528,13 +2669,7 @@
         <w:t xml:space="preserve">.feature</w:t>
       </w:r>
       <w:r>
-        <w:t xml:space="preserve">’s step shapes, runs the function for each</w:t>
-      </w:r>
-      <w:r>
-        <w:t xml:space="preserve"> </w:t>
-      </w:r>
-      <w:r>
-        <w:t xml:space="preserve">scenario, prints</w:t>
+        <w:t xml:space="preserve">’s step shapes, prints</w:t>
       </w:r>
       <w:r>
         <w:t xml:space="preserve"> </w:t>
@@ -2582,7 +2717,7 @@
         </w:numPr>
       </w:pPr>
       <w:r>
-        <w:t xml:space="preserve">Write the runner command into Acceptance’s</w:t>
+        <w:t xml:space="preserve">Write the runner command into</w:t>
       </w:r>
       <w:r>
         <w:t xml:space="preserve"> </w:t>
@@ -2597,19 +2732,7 @@
         <w:t xml:space="preserve"> </w:t>
       </w:r>
       <w:r>
-        <w:t xml:space="preserve">yourself (fill the placeholder there),</w:t>
-      </w:r>
-      <w:r>
-        <w:t xml:space="preserve"> </w:t>
-      </w:r>
-      <w:r>
-        <w:t xml:space="preserve">because you chose the runner’s name, path, and language — the author didn’t. Use one Test Plan</w:t>
-      </w:r>
-      <w:r>
-        <w:t xml:space="preserve"> </w:t>
-      </w:r>
-      <w:r>
-        <w:t xml:space="preserve">line per</w:t>
+        <w:t xml:space="preserve">yourself (one line per</w:t>
       </w:r>
       <w:r>
         <w:t xml:space="preserve"> </w:t>
@@ -2621,16 +2744,7 @@
         <w:t xml:space="preserve">.feature</w:t>
       </w:r>
       <w:r>
-        <w:t xml:space="preserve"> </w:t>
-      </w:r>
-      <w:r>
-        <w:t xml:space="preserve">file. Don’t edit the spec to make the check pass; if the inputs, outputs, or</w:t>
-      </w:r>
-      <w:r>
-        <w:t xml:space="preserve"> </w:t>
-      </w:r>
-      <w:r>
-        <w:t xml:space="preserve">naming are ambiguous, ask before implementing.</w:t>
+        <w:t xml:space="preserve">); don’t edit the spec to force a pass; ask if anything is ambiguous.</w:t>
       </w:r>
     </w:p>
     <w:p>
@@ -2641,55 +2755,17 @@
         </w:numPr>
       </w:pPr>
       <w:r>
-        <w:t xml:space="preserve">This is the move that closes the</w:t>
-      </w:r>
-      <w:r>
-        <w:t xml:space="preserve"> </w:t>
-      </w:r>
-      <w:r>
-        <w:t xml:space="preserve">“but how do I even test a</w:t>
-      </w:r>
-      <w:r>
-        <w:t xml:space="preserve"> </w:t>
-      </w:r>
-      <w:r>
-        <w:rPr>
-          <w:rStyle w:val="VerbatimChar"/>
-        </w:rPr>
-        <w:t xml:space="preserve">.feature</w:t>
-      </w:r>
-      <w:r>
-        <w:t xml:space="preserve">?”</w:t>
-      </w:r>
-      <w:r>
-        <w:t xml:space="preserve"> </w:t>
-      </w:r>
-      <w:r>
-        <w:t xml:space="preserve">gap: the author writes only</w:t>
-      </w:r>
-      <w:r>
-        <w:t xml:space="preserve"> </w:t>
-      </w:r>
-      <w:r>
-        <w:t xml:space="preserve">the readable rule; the agent turns it into a</w:t>
-      </w:r>
-      <w:r>
-        <w:t xml:space="preserve"> </w:t>
-      </w:r>
-      <w:r>
-        <w:rPr>
-          <w:rStyle w:val="VerbatimChar"/>
-        </w:rPr>
-        <w:t xml:space="preserve">.feature</w:t>
-      </w:r>
-      <w:r>
-        <w:t xml:space="preserve">, a function, and a runner — and canon’s</w:t>
-      </w:r>
-      <w:r>
-        <w:t xml:space="preserve"> </w:t>
-      </w:r>
-      <w:r>
-        <w:t xml:space="preserve">fresh evaluator later grades it by</w:t>
+        <w:rPr>
+          <w:b/>
+          <w:bCs/>
+        </w:rPr>
+        <w:t xml:space="preserve">Ordering</w:t>
+      </w:r>
+      <w:r>
+        <w:t xml:space="preserve"> </w:t>
+      </w:r>
+      <w:r>
+        <w:t xml:space="preserve">this preserves: the</w:t>
       </w:r>
       <w:r>
         <w:t xml:space="preserve"> </w:t>
@@ -2699,91 +2775,34 @@
           <w:i/>
           <w:iCs/>
         </w:rPr>
-        <w:t xml:space="preserve">running</w:t>
-      </w:r>
-      <w:r>
-        <w:t xml:space="preserve"> </w:t>
-      </w:r>
-      <w:r>
-        <w:t xml:space="preserve">the command the agent wrote into</w:t>
-      </w:r>
-      <w:r>
-        <w:t xml:space="preserve"> </w:t>
-      </w:r>
-      <w:r>
-        <w:rPr>
-          <w:rStyle w:val="VerbatimChar"/>
-        </w:rPr>
-        <w:t xml:space="preserve">## Test Plan</w:t>
-      </w:r>
-      <w:r>
-        <w:t xml:space="preserve">.</w:t>
-      </w:r>
-      <w:r>
-        <w:t xml:space="preserve"> </w:t>
-      </w:r>
-      <w:r>
-        <w:t xml:space="preserve">(Default is JavaScript —</w:t>
-      </w:r>
-      <w:r>
-        <w:t xml:space="preserve"> </w:t>
-      </w:r>
-      <w:r>
-        <w:rPr>
-          <w:rStyle w:val="VerbatimChar"/>
-        </w:rPr>
-        <w:t xml:space="preserve">app/discount.js</w:t>
-      </w:r>
-      <w:r>
-        <w:t xml:space="preserve">. Want Python instead? Just tell the agent to implement it</w:t>
-      </w:r>
-      <w:r>
-        <w:t xml:space="preserve"> </w:t>
-      </w:r>
-      <w:r>
-        <w:t xml:space="preserve">in</w:t>
-      </w:r>
-      <w:r>
-        <w:t xml:space="preserve"> </w:t>
-      </w:r>
-      <w:r>
-        <w:rPr>
-          <w:rStyle w:val="VerbatimChar"/>
-        </w:rPr>
-        <w:t xml:space="preserve">discount.py</w:t>
-      </w:r>
-      <w:r>
-        <w:t xml:space="preserve"> </w:t>
-      </w:r>
-      <w:r>
-        <w:t xml:space="preserve">with a Python runner; the scenario and this instruction don’t change.)</w:t>
-      </w:r>
-    </w:p>
-    <w:p>
-      <w:pPr>
-        <w:numPr>
-          <w:ilvl w:val="0"/>
-          <w:numId w:val="1000"/>
-        </w:numPr>
-      </w:pPr>
-      <w:r>
-        <w:rPr>
-          <w:b/>
-          <w:bCs/>
-        </w:rPr>
-        <w:t xml:space="preserve">Who fills the Test Plan runner line, and when.</w:t>
-      </w:r>
-      <w:r>
-        <w:t xml:space="preserve"> </w:t>
-      </w:r>
-      <w:r>
-        <w:t xml:space="preserve">The evaluator grades a scenario-backed criterion</w:t>
-      </w:r>
-      <w:r>
-        <w:t xml:space="preserve"> </w:t>
-      </w:r>
-      <w:r>
-        <w:t xml:space="preserve">by</w:t>
+        <w:t xml:space="preserve">scenario</w:t>
+      </w:r>
+      <w:r>
+        <w:t xml:space="preserve"> </w:t>
+      </w:r>
+      <w:r>
+        <w:t xml:space="preserve">(the</w:t>
+      </w:r>
+      <w:r>
+        <w:t xml:space="preserve"> </w:t>
+      </w:r>
+      <w:r>
+        <w:rPr>
+          <w:rStyle w:val="VerbatimChar"/>
+        </w:rPr>
+        <w:t xml:space="preserve">Then</w:t>
+      </w:r>
+      <w:r>
+        <w:t xml:space="preserve"> </w:t>
+      </w:r>
+      <w:r>
+        <w:t xml:space="preserve">expectations — the correctness bar) is what’s</w:t>
+      </w:r>
+      <w:r>
+        <w:t xml:space="preserve"> </w:t>
+      </w:r>
+      <w:r>
+        <w:t xml:space="preserve">locked at the sprint-start approval gate; the runner</w:t>
       </w:r>
       <w:r>
         <w:t xml:space="preserve"> </w:t>
@@ -2793,125 +2812,19 @@
           <w:i/>
           <w:iCs/>
         </w:rPr>
-        <w:t xml:space="preserve">running</w:t>
-      </w:r>
-      <w:r>
-        <w:t xml:space="preserve"> </w:t>
-      </w:r>
-      <w:r>
-        <w:t xml:space="preserve">the command named in</w:t>
-      </w:r>
-      <w:r>
-        <w:t xml:space="preserve"> </w:t>
-      </w:r>
-      <w:r>
-        <w:rPr>
-          <w:rStyle w:val="VerbatimChar"/>
-        </w:rPr>
-        <w:t xml:space="preserve">## Test Plan</w:t>
-      </w:r>
-      <w:r>
-        <w:t xml:space="preserve">, so that command must be there by close — but it’s</w:t>
-      </w:r>
-      <w:r>
-        <w:t xml:space="preserve"> </w:t>
-      </w:r>
-      <w:r>
-        <w:t xml:space="preserve">the</w:t>
-      </w:r>
-      <w:r>
-        <w:t xml:space="preserve"> </w:t>
-      </w:r>
-      <w:r>
-        <w:rPr>
-          <w:b/>
-          <w:bCs/>
-        </w:rPr>
-        <w:t xml:space="preserve">agent’s</w:t>
-      </w:r>
-      <w:r>
-        <w:t xml:space="preserve"> </w:t>
-      </w:r>
-      <w:r>
-        <w:t xml:space="preserve">to write, not the author’s:</w:t>
-      </w:r>
-    </w:p>
-    <w:p>
-      <w:pPr>
-        <w:pStyle w:val="Compact"/>
-        <w:numPr>
-          <w:ilvl w:val="1"/>
-          <w:numId w:val="1005"/>
-        </w:numPr>
-      </w:pPr>
-      <w:r>
-        <w:rPr>
-          <w:b/>
-          <w:bCs/>
-        </w:rPr>
-        <w:t xml:space="preserve">New ticket / no runner yet:</w:t>
-      </w:r>
-      <w:r>
-        <w:t xml:space="preserve"> </w:t>
-      </w:r>
-      <w:r>
-        <w:t xml:space="preserve">the author leaves the Test Plan slot empty (the placeholder above);</w:t>
-      </w:r>
-      <w:r>
-        <w:t xml:space="preserve"> </w:t>
-      </w:r>
-      <w:r>
-        <w:t xml:space="preserve">the agent writes the command once it’s built the runner. A brand-new scenario’s author never has</w:t>
-      </w:r>
-      <w:r>
-        <w:t xml:space="preserve"> </w:t>
-      </w:r>
-      <w:r>
-        <w:t xml:space="preserve">to know the runner’s filename, path, or language.</w:t>
-      </w:r>
-    </w:p>
-    <w:p>
-      <w:pPr>
-        <w:pStyle w:val="Compact"/>
-        <w:numPr>
-          <w:ilvl w:val="1"/>
-          <w:numId w:val="1005"/>
-        </w:numPr>
-      </w:pPr>
-      <w:r>
-        <w:rPr>
-          <w:b/>
-          <w:bCs/>
-        </w:rPr>
-        <w:t xml:space="preserve">A ticket that reuses an existing runner:</w:t>
-      </w:r>
-      <w:r>
-        <w:t xml:space="preserve"> </w:t>
-      </w:r>
-      <w:r>
-        <w:t xml:space="preserve">the command is known convention, so it’s fine to</w:t>
-      </w:r>
-      <w:r>
-        <w:t xml:space="preserve"> </w:t>
-      </w:r>
-      <w:r>
-        <w:t xml:space="preserve">pre-fill or</w:t>
-      </w:r>
-      <w:r>
-        <w:t xml:space="preserve"> </w:t>
-      </w:r>
-      <w:r>
-        <w:rPr>
-          <w:b/>
-          <w:bCs/>
-        </w:rPr>
-        <w:t xml:space="preserve">append</w:t>
-      </w:r>
-      <w:r>
-        <w:t xml:space="preserve"> </w:t>
-      </w:r>
-      <w:r>
-        <w:t xml:space="preserve">it by hand — e.g. add</w:t>
+        <w:t xml:space="preserve">command</w:t>
+      </w:r>
+      <w:r>
+        <w:t xml:space="preserve"> </w:t>
+      </w:r>
+      <w:r>
+        <w:t xml:space="preserve">is a mechanical pointer the agent</w:t>
+      </w:r>
+      <w:r>
+        <w:t xml:space="preserve"> </w:t>
+      </w:r>
+      <w:r>
+        <w:t xml:space="preserve">fills during the build. (Reusing a runner that already exists? You can pre-fill or append</w:t>
       </w:r>
       <w:r>
         <w:t xml:space="preserve"> </w:t>
@@ -2926,155 +2839,19 @@
         <w:t xml:space="preserve"> </w:t>
       </w:r>
       <w:r>
-        <w:t xml:space="preserve">for the new file; the agent just adds the new scenarios.</w:t>
-      </w:r>
-    </w:p>
-    <w:p>
-      <w:pPr>
-        <w:pStyle w:val="Compact"/>
-        <w:numPr>
-          <w:ilvl w:val="1"/>
-          <w:numId w:val="1005"/>
-        </w:numPr>
-      </w:pPr>
-      <w:r>
-        <w:rPr>
-          <w:b/>
-          <w:bCs/>
-        </w:rPr>
-        <w:t xml:space="preserve">Several distinct</w:t>
-      </w:r>
-      <w:r>
-        <w:rPr>
-          <w:b/>
-          <w:bCs/>
-        </w:rPr>
-        <w:t xml:space="preserve"> </w:t>
-      </w:r>
-      <w:r>
-        <w:rPr>
-          <w:rStyle w:val="VerbatimChar"/>
-          <w:b/>
-          <w:bCs/>
+        <w:t xml:space="preserve">by hand — one Test Plan line per</w:t>
+      </w:r>
+      <w:r>
+        <w:t xml:space="preserve"> </w:t>
+      </w:r>
+      <w:r>
+        <w:rPr>
+          <w:rStyle w:val="VerbatimChar"/>
         </w:rPr>
         <w:t xml:space="preserve">.feature</w:t>
       </w:r>
       <w:r>
-        <w:rPr>
-          <w:b/>
-          <w:bCs/>
-        </w:rPr>
-        <w:t xml:space="preserve"> </w:t>
-      </w:r>
-      <w:r>
-        <w:rPr>
-          <w:b/>
-          <w:bCs/>
-        </w:rPr>
-        <w:t xml:space="preserve">files in one ticket:</w:t>
-      </w:r>
-      <w:r>
-        <w:t xml:space="preserve"> </w:t>
-      </w:r>
-      <w:r>
-        <w:t xml:space="preserve">one Test Plan line each (the agent appends</w:t>
-      </w:r>
-      <w:r>
-        <w:t xml:space="preserve"> </w:t>
-      </w:r>
-      <w:r>
-        <w:t xml:space="preserve">them). Keep cohesive scenarios in a single</w:t>
-      </w:r>
-      <w:r>
-        <w:t xml:space="preserve"> </w:t>
-      </w:r>
-      <w:r>
-        <w:rPr>
-          <w:rStyle w:val="VerbatimChar"/>
-        </w:rPr>
-        <w:t xml:space="preserve">.feature</w:t>
-      </w:r>
-      <w:r>
-        <w:t xml:space="preserve"> </w:t>
-      </w:r>
-      <w:r>
-        <w:t xml:space="preserve">with a single line.</w:t>
-      </w:r>
-    </w:p>
-    <w:p>
-      <w:pPr>
-        <w:numPr>
-          <w:ilvl w:val="0"/>
-          <w:numId w:val="1000"/>
-        </w:numPr>
-      </w:pPr>
-      <w:r>
-        <w:t xml:space="preserve">Note the ordering this preserves: the</w:t>
-      </w:r>
-      <w:r>
-        <w:t xml:space="preserve"> </w:t>
-      </w:r>
-      <w:r>
-        <w:rPr>
-          <w:b/>
-          <w:bCs/>
-        </w:rPr>
-        <w:t xml:space="preserve">scenario</w:t>
-      </w:r>
-      <w:r>
-        <w:t xml:space="preserve"> </w:t>
-      </w:r>
-      <w:r>
-        <w:t xml:space="preserve">— the</w:t>
-      </w:r>
-      <w:r>
-        <w:t xml:space="preserve"> </w:t>
-      </w:r>
-      <w:r>
-        <w:rPr>
-          <w:rStyle w:val="VerbatimChar"/>
-        </w:rPr>
-        <w:t xml:space="preserve">Then</w:t>
-      </w:r>
-      <w:r>
-        <w:t xml:space="preserve"> </w:t>
-      </w:r>
-      <w:r>
-        <w:t xml:space="preserve">expectations, i.e. the correctness</w:t>
-      </w:r>
-      <w:r>
-        <w:t xml:space="preserve"> </w:t>
-      </w:r>
-      <w:r>
-        <w:t xml:space="preserve">bar — is what’s locked at the sprint-start approval gate, before any code. The runner</w:t>
-      </w:r>
-      <w:r>
-        <w:t xml:space="preserve"> </w:t>
-      </w:r>
-      <w:r>
-        <w:rPr>
-          <w:b/>
-          <w:bCs/>
-        </w:rPr>
-        <w:t xml:space="preserve">command</w:t>
-      </w:r>
-      <w:r>
-        <w:t xml:space="preserve"> </w:t>
-      </w:r>
-      <w:r>
-        <w:t xml:space="preserve">is</w:t>
-      </w:r>
-      <w:r>
-        <w:t xml:space="preserve"> </w:t>
-      </w:r>
-      <w:r>
-        <w:t xml:space="preserve">just a mechanical pointer to it, so the agent finalizing that line during the build doesn’t violate</w:t>
-      </w:r>
-      <w:r>
-        <w:t xml:space="preserve"> </w:t>
-      </w:r>
-      <w:r>
-        <w:t xml:space="preserve">“lock the spec before the code.”</w:t>
+        <w:t xml:space="preserve">.)</w:t>
       </w:r>
     </w:p>
     <w:p>
@@ -3272,19 +3049,34 @@
         <w:t xml:space="preserve">sprint start &lt;id&gt;</w:t>
       </w:r>
       <w:r>
-        <w:t xml:space="preserve">) and implement it per its Acceptance scenario</w:t>
-      </w:r>
-      <w:r>
-        <w:t xml:space="preserve"> </w:t>
-      </w:r>
-      <w:r>
-        <w:t xml:space="preserve">and the build instruction in the plan. Ask me anything ambiguous first; after I approve the plan,</w:t>
-      </w:r>
-      <w:r>
-        <w:t xml:space="preserve"> </w:t>
-      </w:r>
-      <w:r>
-        <w:t xml:space="preserve">build it — don’t edit the spec or the runner to force a pass.</w:t>
+        <w:t xml:space="preserve">) and follow the build instruction it seeds</w:t>
+      </w:r>
+      <w:r>
+        <w:t xml:space="preserve"> </w:t>
+      </w:r>
+      <w:r>
+        <w:t xml:space="preserve">into</w:t>
+      </w:r>
+      <w:r>
+        <w:t xml:space="preserve"> </w:t>
+      </w:r>
+      <w:r>
+        <w:rPr>
+          <w:rStyle w:val="VerbatimChar"/>
+        </w:rPr>
+        <w:t xml:space="preserve">plan.md</w:t>
+      </w:r>
+      <w:r>
+        <w:t xml:space="preserve"> </w:t>
+      </w:r>
+      <w:r>
+        <w:t xml:space="preserve">from the Acceptance scenario. Ask me anything ambiguous first; after I approve the</w:t>
+      </w:r>
+      <w:r>
+        <w:t xml:space="preserve"> </w:t>
+      </w:r>
+      <w:r>
+        <w:t xml:space="preserve">plan, build it — don’t edit the spec or the runner to force a pass.</w:t>
       </w:r>
     </w:p>
     <w:p>
@@ -4182,7 +3974,7 @@
       <w:pPr>
         <w:numPr>
           <w:ilvl w:val="0"/>
-          <w:numId w:val="1006"/>
+          <w:numId w:val="1005"/>
         </w:numPr>
       </w:pPr>
       <w:r>
@@ -4399,7 +4191,7 @@
       <w:pPr>
         <w:numPr>
           <w:ilvl w:val="0"/>
-          <w:numId w:val="1006"/>
+          <w:numId w:val="1005"/>
         </w:numPr>
       </w:pPr>
       <w:r>
@@ -4507,7 +4299,7 @@
       <w:pPr>
         <w:numPr>
           <w:ilvl w:val="0"/>
-          <w:numId w:val="1006"/>
+          <w:numId w:val="1005"/>
         </w:numPr>
       </w:pPr>
       <w:r>
@@ -6034,7 +5826,7 @@
         <w:pStyle w:val="Compact"/>
         <w:numPr>
           <w:ilvl w:val="0"/>
-          <w:numId w:val="1007"/>
+          <w:numId w:val="1006"/>
         </w:numPr>
       </w:pPr>
       <w:r>
@@ -6067,6 +5859,677 @@
       </w:r>
       <w:r>
         <w:t xml:space="preserve">, use one.</w:t>
+      </w:r>
+    </w:p>
+    <w:p>
+      <w:pPr>
+        <w:pStyle w:val="Compact"/>
+        <w:numPr>
+          <w:ilvl w:val="0"/>
+          <w:numId w:val="1006"/>
+        </w:numPr>
+      </w:pPr>
+      <w:r>
+        <w:rPr>
+          <w:b/>
+          <w:bCs/>
+        </w:rPr>
+        <w:t xml:space="preserve">Doesn’t fit:</w:t>
+      </w:r>
+      <w:r>
+        <w:t xml:space="preserve"> </w:t>
+      </w:r>
+      <w:r>
+        <w:t xml:space="preserve">open-ended output with no single right answer —</w:t>
+      </w:r>
+      <w:r>
+        <w:t xml:space="preserve"> </w:t>
+      </w:r>
+      <w:r>
+        <w:t xml:space="preserve">“write a better error message,”</w:t>
+      </w:r>
+      <w:r>
+        <w:t xml:space="preserve"> </w:t>
+      </w:r>
+      <w:r>
+        <w:t xml:space="preserve">“summarize this concisely.”</w:t>
+      </w:r>
+      <w:r>
+        <w:t xml:space="preserve"> </w:t>
+      </w:r>
+      <w:r>
+        <w:t xml:space="preserve">Forcing a spec there either flattens the task into a checklist that</w:t>
+      </w:r>
+      <w:r>
+        <w:t xml:space="preserve"> </w:t>
+      </w:r>
+      <w:r>
+        <w:t xml:space="preserve">misses the point, or you end up building an LLM judge — which just moves</w:t>
+      </w:r>
+      <w:r>
+        <w:t xml:space="preserve"> </w:t>
+      </w:r>
+      <w:r>
+        <w:t xml:space="preserve">“who verifies this”</w:t>
+      </w:r>
+      <w:r>
+        <w:t xml:space="preserve"> </w:t>
+      </w:r>
+      <w:r>
+        <w:t xml:space="preserve">one</w:t>
+      </w:r>
+      <w:r>
+        <w:t xml:space="preserve"> </w:t>
+      </w:r>
+      <w:r>
+        <w:t xml:space="preserve">level up, onto something that itself needs verifying.</w:t>
+      </w:r>
+    </w:p>
+    <w:p>
+      <w:pPr>
+        <w:pStyle w:val="Compact"/>
+        <w:numPr>
+          <w:ilvl w:val="0"/>
+          <w:numId w:val="1006"/>
+        </w:numPr>
+      </w:pPr>
+      <w:r>
+        <w:rPr>
+          <w:b/>
+          <w:bCs/>
+        </w:rPr>
+        <w:t xml:space="preserve">The honest limit of</w:t>
+      </w:r>
+      <w:r>
+        <w:rPr>
+          <w:b/>
+          <w:bCs/>
+        </w:rPr>
+        <w:t xml:space="preserve"> </w:t>
+      </w:r>
+      <w:r>
+        <w:rPr>
+          <w:b/>
+          <w:bCs/>
+          <w:i/>
+          <w:iCs/>
+        </w:rPr>
+        <w:t xml:space="preserve">this</w:t>
+      </w:r>
+      <w:r>
+        <w:rPr>
+          <w:b/>
+          <w:bCs/>
+        </w:rPr>
+        <w:t xml:space="preserve"> </w:t>
+      </w:r>
+      <w:r>
+        <w:rPr>
+          <w:b/>
+          <w:bCs/>
+        </w:rPr>
+        <w:t xml:space="preserve">exercise specifically:</w:t>
+      </w:r>
+      <w:r>
+        <w:t xml:space="preserve"> </w:t>
+      </w:r>
+      <w:r>
+        <w:t xml:space="preserve">the runner proves the</w:t>
+      </w:r>
+      <w:r>
+        <w:t xml:space="preserve"> </w:t>
+      </w:r>
+      <w:r>
+        <w:rPr>
+          <w:i/>
+          <w:iCs/>
+        </w:rPr>
+        <w:t xml:space="preserve">code</w:t>
+      </w:r>
+      <w:r>
+        <w:t xml:space="preserve"> </w:t>
+      </w:r>
+      <w:r>
+        <w:t xml:space="preserve">matches the</w:t>
+      </w:r>
+      <w:r>
+        <w:t xml:space="preserve"> </w:t>
+      </w:r>
+      <w:r>
+        <w:rPr>
+          <w:i/>
+          <w:iCs/>
+        </w:rPr>
+        <w:t xml:space="preserve">spec</w:t>
+      </w:r>
+      <w:r>
+        <w:t xml:space="preserve">. It doesn’t prove the spec matches what you actually meant — if the same person (or the same</w:t>
+      </w:r>
+      <w:r>
+        <w:t xml:space="preserve"> </w:t>
+      </w:r>
+      <w:r>
+        <w:t xml:space="preserve">agent) writes both the implementation and the spec by watching the code run, you get a regression</w:t>
+      </w:r>
+      <w:r>
+        <w:t xml:space="preserve"> </w:t>
+      </w:r>
+      <w:r>
+        <w:t xml:space="preserve">lock on today’s behavior, not a correctness check against intent. The scenario in this workshop is</w:t>
+      </w:r>
+      <w:r>
+        <w:t xml:space="preserve"> </w:t>
+      </w:r>
+      <w:r>
+        <w:t xml:space="preserve">authored in Part 1, before any code exists — that’s what makes it a real check. In your own work,</w:t>
+      </w:r>
+      <w:r>
+        <w:t xml:space="preserve"> </w:t>
+      </w:r>
+      <w:r>
+        <w:t xml:space="preserve">that means: write the spec first, or have someone other than the implementer sign off on it, before</w:t>
+      </w:r>
+      <w:r>
+        <w:t xml:space="preserve"> </w:t>
+      </w:r>
+      <w:r>
+        <w:t xml:space="preserve">trusting it as proof of anything.</w:t>
+      </w:r>
+    </w:p>
+    <w:bookmarkEnd w:id="47"/>
+    <w:bookmarkStart w:id="48" w:name="isnt-this-just-a-unit-test"/>
+    <w:p>
+      <w:pPr>
+        <w:pStyle w:val="Heading2"/>
+      </w:pPr>
+      <w:r>
+        <w:t xml:space="preserve">“Isn’t this just a unit test?”</w:t>
+      </w:r>
+    </w:p>
+    <w:p>
+      <w:pPr>
+        <w:pStyle w:val="FirstParagraph"/>
+      </w:pPr>
+      <w:r>
+        <w:t xml:space="preserve">Say yes first — for this exact bug, a unit-test equivalent would catch it too:</w:t>
+      </w:r>
+    </w:p>
+    <w:p>
+      <w:pPr>
+        <w:pStyle w:val="SourceCode"/>
+      </w:pPr>
+      <w:r>
+        <w:rPr>
+          <w:rStyle w:val="FunctionTok"/>
+        </w:rPr>
+        <w:t xml:space="preserve">test</w:t>
+      </w:r>
+      <w:r>
+        <w:rPr>
+          <w:rStyle w:val="NormalTok"/>
+        </w:rPr>
+        <w:t xml:space="preserve">(</w:t>
+      </w:r>
+      <w:r>
+        <w:rPr>
+          <w:rStyle w:val="StringTok"/>
+        </w:rPr>
+        <w:t xml:space="preserve">"below minimum is rejected"</w:t>
+      </w:r>
+      <w:r>
+        <w:rPr>
+          <w:rStyle w:val="OperatorTok"/>
+        </w:rPr>
+        <w:t xml:space="preserve">,</w:t>
+      </w:r>
+      <w:r>
+        <w:rPr>
+          <w:rStyle w:val="NormalTok"/>
+        </w:rPr>
+        <w:t xml:space="preserve"> () </w:t>
+      </w:r>
+      <w:r>
+        <w:rPr>
+          <w:rStyle w:val="KeywordTok"/>
+        </w:rPr>
+        <w:t xml:space="preserve">=&gt;</w:t>
+      </w:r>
+      <w:r>
+        <w:rPr>
+          <w:rStyle w:val="NormalTok"/>
+        </w:rPr>
+        <w:t xml:space="preserve"> {</w:t>
+      </w:r>
+      <w:r>
+        <w:br/>
+      </w:r>
+      <w:r>
+        <w:rPr>
+          <w:rStyle w:val="NormalTok"/>
+        </w:rPr>
+        <w:t xml:space="preserve">  </w:t>
+      </w:r>
+      <w:r>
+        <w:rPr>
+          <w:rStyle w:val="KeywordTok"/>
+        </w:rPr>
+        <w:t xml:space="preserve">const</w:t>
+      </w:r>
+      <w:r>
+        <w:rPr>
+          <w:rStyle w:val="NormalTok"/>
+        </w:rPr>
+        <w:t xml:space="preserve"> result </w:t>
+      </w:r>
+      <w:r>
+        <w:rPr>
+          <w:rStyle w:val="OperatorTok"/>
+        </w:rPr>
+        <w:t xml:space="preserve">=</w:t>
+      </w:r>
+      <w:r>
+        <w:rPr>
+          <w:rStyle w:val="NormalTok"/>
+        </w:rPr>
+        <w:t xml:space="preserve"> </w:t>
+      </w:r>
+      <w:r>
+        <w:rPr>
+          <w:rStyle w:val="FunctionTok"/>
+        </w:rPr>
+        <w:t xml:space="preserve">apply_discount</w:t>
+      </w:r>
+      <w:r>
+        <w:rPr>
+          <w:rStyle w:val="NormalTok"/>
+        </w:rPr>
+        <w:t xml:space="preserve">(</w:t>
+      </w:r>
+      <w:r>
+        <w:rPr>
+          <w:rStyle w:val="FloatTok"/>
+        </w:rPr>
+        <w:t xml:space="preserve">40.0</w:t>
+      </w:r>
+      <w:r>
+        <w:rPr>
+          <w:rStyle w:val="OperatorTok"/>
+        </w:rPr>
+        <w:t xml:space="preserve">,</w:t>
+      </w:r>
+      <w:r>
+        <w:rPr>
+          <w:rStyle w:val="NormalTok"/>
+        </w:rPr>
+        <w:t xml:space="preserve"> </w:t>
+      </w:r>
+      <w:r>
+        <w:rPr>
+          <w:rStyle w:val="StringTok"/>
+        </w:rPr>
+        <w:t xml:space="preserve">"SAVE10"</w:t>
+      </w:r>
+      <w:r>
+        <w:rPr>
+          <w:rStyle w:val="NormalTok"/>
+        </w:rPr>
+        <w:t xml:space="preserve">)</w:t>
+      </w:r>
+      <w:r>
+        <w:rPr>
+          <w:rStyle w:val="OperatorTok"/>
+        </w:rPr>
+        <w:t xml:space="preserve">;</w:t>
+      </w:r>
+      <w:r>
+        <w:br/>
+      </w:r>
+      <w:r>
+        <w:rPr>
+          <w:rStyle w:val="NormalTok"/>
+        </w:rPr>
+        <w:t xml:space="preserve">  </w:t>
+      </w:r>
+      <w:r>
+        <w:rPr>
+          <w:rStyle w:val="FunctionTok"/>
+        </w:rPr>
+        <w:t xml:space="preserve">expect</w:t>
+      </w:r>
+      <w:r>
+        <w:rPr>
+          <w:rStyle w:val="NormalTok"/>
+        </w:rPr>
+        <w:t xml:space="preserve">(result</w:t>
+      </w:r>
+      <w:r>
+        <w:rPr>
+          <w:rStyle w:val="OperatorTok"/>
+        </w:rPr>
+        <w:t xml:space="preserve">.</w:t>
+      </w:r>
+      <w:r>
+        <w:rPr>
+          <w:rStyle w:val="AttributeTok"/>
+        </w:rPr>
+        <w:t xml:space="preserve">applied</w:t>
+      </w:r>
+      <w:r>
+        <w:rPr>
+          <w:rStyle w:val="NormalTok"/>
+        </w:rPr>
+        <w:t xml:space="preserve">)</w:t>
+      </w:r>
+      <w:r>
+        <w:rPr>
+          <w:rStyle w:val="OperatorTok"/>
+        </w:rPr>
+        <w:t xml:space="preserve">.</w:t>
+      </w:r>
+      <w:r>
+        <w:rPr>
+          <w:rStyle w:val="FunctionTok"/>
+        </w:rPr>
+        <w:t xml:space="preserve">toBe</w:t>
+      </w:r>
+      <w:r>
+        <w:rPr>
+          <w:rStyle w:val="NormalTok"/>
+        </w:rPr>
+        <w:t xml:space="preserve">(</w:t>
+      </w:r>
+      <w:r>
+        <w:rPr>
+          <w:rStyle w:val="KeywordTok"/>
+        </w:rPr>
+        <w:t xml:space="preserve">false</w:t>
+      </w:r>
+      <w:r>
+        <w:rPr>
+          <w:rStyle w:val="NormalTok"/>
+        </w:rPr>
+        <w:t xml:space="preserve">)</w:t>
+      </w:r>
+      <w:r>
+        <w:rPr>
+          <w:rStyle w:val="OperatorTok"/>
+        </w:rPr>
+        <w:t xml:space="preserve">;</w:t>
+      </w:r>
+      <w:r>
+        <w:br/>
+      </w:r>
+      <w:r>
+        <w:rPr>
+          <w:rStyle w:val="NormalTok"/>
+        </w:rPr>
+        <w:t xml:space="preserve">  </w:t>
+      </w:r>
+      <w:r>
+        <w:rPr>
+          <w:rStyle w:val="FunctionTok"/>
+        </w:rPr>
+        <w:t xml:space="preserve">expect</w:t>
+      </w:r>
+      <w:r>
+        <w:rPr>
+          <w:rStyle w:val="NormalTok"/>
+        </w:rPr>
+        <w:t xml:space="preserve">(result</w:t>
+      </w:r>
+      <w:r>
+        <w:rPr>
+          <w:rStyle w:val="OperatorTok"/>
+        </w:rPr>
+        <w:t xml:space="preserve">.</w:t>
+      </w:r>
+      <w:r>
+        <w:rPr>
+          <w:rStyle w:val="AttributeTok"/>
+        </w:rPr>
+        <w:t xml:space="preserve">reason</w:t>
+      </w:r>
+      <w:r>
+        <w:rPr>
+          <w:rStyle w:val="NormalTok"/>
+        </w:rPr>
+        <w:t xml:space="preserve">)</w:t>
+      </w:r>
+      <w:r>
+        <w:rPr>
+          <w:rStyle w:val="OperatorTok"/>
+        </w:rPr>
+        <w:t xml:space="preserve">.</w:t>
+      </w:r>
+      <w:r>
+        <w:rPr>
+          <w:rStyle w:val="FunctionTok"/>
+        </w:rPr>
+        <w:t xml:space="preserve">toBe</w:t>
+      </w:r>
+      <w:r>
+        <w:rPr>
+          <w:rStyle w:val="NormalTok"/>
+        </w:rPr>
+        <w:t xml:space="preserve">(</w:t>
+      </w:r>
+      <w:r>
+        <w:rPr>
+          <w:rStyle w:val="StringTok"/>
+        </w:rPr>
+        <w:t xml:space="preserve">"minimum not met"</w:t>
+      </w:r>
+      <w:r>
+        <w:rPr>
+          <w:rStyle w:val="NormalTok"/>
+        </w:rPr>
+        <w:t xml:space="preserve">)</w:t>
+      </w:r>
+      <w:r>
+        <w:rPr>
+          <w:rStyle w:val="OperatorTok"/>
+        </w:rPr>
+        <w:t xml:space="preserve">;</w:t>
+      </w:r>
+      <w:r>
+        <w:br/>
+      </w:r>
+      <w:r>
+        <w:rPr>
+          <w:rStyle w:val="NormalTok"/>
+        </w:rPr>
+        <w:t xml:space="preserve">})</w:t>
+      </w:r>
+      <w:r>
+        <w:rPr>
+          <w:rStyle w:val="OperatorTok"/>
+        </w:rPr>
+        <w:t xml:space="preserve">;</w:t>
+      </w:r>
+    </w:p>
+    <w:p>
+      <w:pPr>
+        <w:pStyle w:val="FirstParagraph"/>
+      </w:pPr>
+      <w:r>
+        <w:t xml:space="preserve">Same detection power, same mechanism. The DSL isn’t a stronger test — the difference is</w:t>
+      </w:r>
+      <w:r>
+        <w:t xml:space="preserve"> </w:t>
+      </w:r>
+      <w:r>
+        <w:rPr>
+          <w:i/>
+          <w:iCs/>
+        </w:rPr>
+        <w:t xml:space="preserve">who could</w:t>
+      </w:r>
+      <w:r>
+        <w:rPr>
+          <w:i/>
+          <w:iCs/>
+        </w:rPr>
+        <w:t xml:space="preserve"> </w:t>
+      </w:r>
+      <w:r>
+        <w:rPr>
+          <w:i/>
+          <w:iCs/>
+        </w:rPr>
+        <w:t xml:space="preserve">have written it</w:t>
+      </w:r>
+      <w:r>
+        <w:t xml:space="preserve">. The</w:t>
+      </w:r>
+      <w:r>
+        <w:t xml:space="preserve"> </w:t>
+      </w:r>
+      <w:r>
+        <w:rPr>
+          <w:rStyle w:val="VerbatimChar"/>
+        </w:rPr>
+        <w:t xml:space="preserve">.feature</w:t>
+      </w:r>
+      <w:r>
+        <w:t xml:space="preserve"> </w:t>
+      </w:r>
+      <w:r>
+        <w:t xml:space="preserve">version only requires knowing the discount rule; the unit-test</w:t>
+      </w:r>
+      <w:r>
+        <w:t xml:space="preserve"> </w:t>
+      </w:r>
+      <w:r>
+        <w:t xml:space="preserve">version requires knowing the rule</w:t>
+      </w:r>
+      <w:r>
+        <w:t xml:space="preserve"> </w:t>
+      </w:r>
+      <w:r>
+        <w:rPr>
+          <w:b/>
+          <w:bCs/>
+        </w:rPr>
+        <w:t xml:space="preserve">and</w:t>
+      </w:r>
+      <w:r>
+        <w:t xml:space="preserve"> </w:t>
+      </w:r>
+      <w:r>
+        <w:t xml:space="preserve">the language (</w:t>
+      </w:r>
+      <w:r>
+        <w:rPr>
+          <w:rStyle w:val="VerbatimChar"/>
+        </w:rPr>
+        <w:t xml:space="preserve">expect</w:t>
+      </w:r>
+      <w:r>
+        <w:t xml:space="preserve">, object access, how to run the</w:t>
+      </w:r>
+      <w:r>
+        <w:t xml:space="preserve"> </w:t>
+      </w:r>
+      <w:r>
+        <w:t xml:space="preserve">suite). Whoever owns the pricing policy can write and sign off on the scenario directly, with zero</w:t>
+      </w:r>
+      <w:r>
+        <w:t xml:space="preserve"> </w:t>
+      </w:r>
+      <w:r>
+        <w:t xml:space="preserve">code literacy — the unit test needs a translation step from rule to assertion syntax, done by whoever</w:t>
+      </w:r>
+      <w:r>
+        <w:t xml:space="preserve"> </w:t>
+      </w:r>
+      <w:r>
+        <w:t xml:space="preserve">implements it, which is exactly where intent quietly drifts.</w:t>
+      </w:r>
+    </w:p>
+    <w:p>
+      <w:pPr>
+        <w:pStyle w:val="BodyText"/>
+      </w:pPr>
+      <w:r>
+        <w:t xml:space="preserve">One counter to have ready:</w:t>
+      </w:r>
+      <w:r>
+        <w:t xml:space="preserve"> </w:t>
+      </w:r>
+      <w:r>
+        <w:t xml:space="preserve">“isn’t</w:t>
+      </w:r>
+      <w:r>
+        <w:t xml:space="preserve"> </w:t>
+      </w:r>
+      <w:r>
+        <w:t xml:space="preserve">‘write the check before the code’</w:t>
+      </w:r>
+      <w:r>
+        <w:t xml:space="preserve"> </w:t>
+      </w:r>
+      <w:r>
+        <w:t xml:space="preserve">just TDD?”</w:t>
+      </w:r>
+      <w:r>
+        <w:t xml:space="preserve"> </w:t>
+      </w:r>
+      <w:r>
+        <w:t xml:space="preserve">Yes — concede it.</w:t>
+      </w:r>
+      <w:r>
+        <w:t xml:space="preserve"> </w:t>
+      </w:r>
+      <w:r>
+        <w:t xml:space="preserve">TDD gets you the ordering. It doesn’t get you the readership: a test-first unit-test file is still</w:t>
+      </w:r>
+      <w:r>
+        <w:t xml:space="preserve"> </w:t>
+      </w:r>
+      <w:r>
+        <w:t xml:space="preserve">unreadable to whoever actually owns the rule. That gap matters more, not less, as rules move further</w:t>
+      </w:r>
+      <w:r>
+        <w:t xml:space="preserve"> </w:t>
+      </w:r>
+      <w:r>
+        <w:t xml:space="preserve">from engineering — pricing policy, compliance, CFIHOS conformance — cases where the person who knows</w:t>
+      </w:r>
+      <w:r>
+        <w:t xml:space="preserve"> </w:t>
+      </w:r>
+      <w:r>
+        <w:t xml:space="preserve">what</w:t>
+      </w:r>
+      <w:r>
+        <w:t xml:space="preserve"> </w:t>
+      </w:r>
+      <w:r>
+        <w:t xml:space="preserve">“correct”</w:t>
+      </w:r>
+      <w:r>
+        <w:t xml:space="preserve"> </w:t>
+      </w:r>
+      <w:r>
+        <w:t xml:space="preserve">means was never going to write the assertion.</w:t>
+      </w:r>
+    </w:p>
+    <w:bookmarkEnd w:id="48"/>
+    <w:bookmarkStart w:id="49" w:name="X9a249f5f163a90280cb293225baf90a156639df"/>
+    <w:p>
+      <w:pPr>
+        <w:pStyle w:val="Heading2"/>
+      </w:pPr>
+      <w:r>
+        <w:t xml:space="preserve">Suggested demonstration sequence (for instructors)</w:t>
+      </w:r>
+    </w:p>
+    <w:p>
+      <w:pPr>
+        <w:pStyle w:val="FirstParagraph"/>
+      </w:pPr>
+      <w:r>
+        <w:t xml:space="preserve">Condensed recap, for running this live in front of a group:</w:t>
       </w:r>
     </w:p>
     <w:p>
@@ -6078,59 +6541,40 @@
         </w:numPr>
       </w:pPr>
       <w:r>
-        <w:rPr>
-          <w:b/>
-          <w:bCs/>
-        </w:rPr>
-        <w:t xml:space="preserve">Doesn’t fit:</w:t>
-      </w:r>
-      <w:r>
-        <w:t xml:space="preserve"> </w:t>
-      </w:r>
-      <w:r>
-        <w:t xml:space="preserve">open-ended output with no single right answer —</w:t>
-      </w:r>
-      <w:r>
-        <w:t xml:space="preserve"> </w:t>
-      </w:r>
-      <w:r>
-        <w:t xml:space="preserve">“write a better error message,”</w:t>
-      </w:r>
-      <w:r>
-        <w:t xml:space="preserve"> </w:t>
-      </w:r>
-      <w:r>
-        <w:t xml:space="preserve">“summarize this concisely.”</w:t>
-      </w:r>
-      <w:r>
-        <w:t xml:space="preserve"> </w:t>
-      </w:r>
-      <w:r>
-        <w:t xml:space="preserve">Forcing a spec there either flattens the task into a checklist that</w:t>
-      </w:r>
-      <w:r>
-        <w:t xml:space="preserve"> </w:t>
-      </w:r>
-      <w:r>
-        <w:t xml:space="preserve">misses the point, or you end up building an LLM judge — which just moves</w:t>
-      </w:r>
-      <w:r>
-        <w:t xml:space="preserve"> </w:t>
-      </w:r>
-      <w:r>
-        <w:t xml:space="preserve">“who verifies this”</w:t>
-      </w:r>
-      <w:r>
-        <w:t xml:space="preserve"> </w:t>
-      </w:r>
-      <w:r>
-        <w:t xml:space="preserve">one</w:t>
-      </w:r>
-      <w:r>
-        <w:t xml:space="preserve"> </w:t>
-      </w:r>
-      <w:r>
-        <w:t xml:space="preserve">level up, onto something that itself needs verifying.</w:t>
+        <w:t xml:space="preserve">Show</w:t>
+      </w:r>
+      <w:r>
+        <w:t xml:space="preserve"> </w:t>
+      </w:r>
+      <w:r>
+        <w:rPr>
+          <w:rStyle w:val="VerbatimChar"/>
+        </w:rPr>
+        <w:t xml:space="preserve">specs/discount.feature</w:t>
+      </w:r>
+      <w:r>
+        <w:t xml:space="preserve"> </w:t>
+      </w:r>
+      <w:r>
+        <w:t xml:space="preserve">(or author it live on the board, Part 1) — read it aloud, confirm the</w:t>
+      </w:r>
+      <w:r>
+        <w:t xml:space="preserve"> </w:t>
+      </w:r>
+      <w:r>
+        <w:t xml:space="preserve">room agrees on what</w:t>
+      </w:r>
+      <w:r>
+        <w:t xml:space="preserve"> </w:t>
+      </w:r>
+      <w:r>
+        <w:t xml:space="preserve">“correct”</w:t>
+      </w:r>
+      <w:r>
+        <w:t xml:space="preserve"> </w:t>
+      </w:r>
+      <w:r>
+        <w:t xml:space="preserve">means before any code exists.</w:t>
       </w:r>
     </w:p>
     <w:p>
@@ -6142,602 +6586,225 @@
         </w:numPr>
       </w:pPr>
       <w:r>
-        <w:rPr>
-          <w:b/>
-          <w:bCs/>
-        </w:rPr>
-        <w:t xml:space="preserve">The honest limit of</w:t>
-      </w:r>
-      <w:r>
-        <w:rPr>
-          <w:b/>
-          <w:bCs/>
-        </w:rPr>
-        <w:t xml:space="preserve"> </w:t>
-      </w:r>
-      <w:r>
-        <w:rPr>
-          <w:b/>
-          <w:bCs/>
+        <w:t xml:space="preserve">Point out that the ticket</w:t>
+      </w:r>
+      <w:r>
+        <w:t xml:space="preserve"> </w:t>
+      </w:r>
+      <w:r>
+        <w:rPr>
           <w:i/>
           <w:iCs/>
         </w:rPr>
-        <w:t xml:space="preserve">this</w:t>
-      </w:r>
-      <w:r>
-        <w:rPr>
-          <w:b/>
-          <w:bCs/>
-        </w:rPr>
-        <w:t xml:space="preserve"> </w:t>
-      </w:r>
-      <w:r>
-        <w:rPr>
-          <w:b/>
-          <w:bCs/>
-        </w:rPr>
-        <w:t xml:space="preserve">exercise specifically:</w:t>
-      </w:r>
-      <w:r>
-        <w:t xml:space="preserve"> </w:t>
-      </w:r>
-      <w:r>
-        <w:t xml:space="preserve">the runner proves the</w:t>
-      </w:r>
-      <w:r>
-        <w:t xml:space="preserve"> </w:t>
-      </w:r>
-      <w:r>
-        <w:rPr>
-          <w:i/>
-          <w:iCs/>
-        </w:rPr>
-        <w:t xml:space="preserve">code</w:t>
-      </w:r>
-      <w:r>
-        <w:t xml:space="preserve"> </w:t>
-      </w:r>
-      <w:r>
-        <w:t xml:space="preserve">matches the</w:t>
-      </w:r>
-      <w:r>
-        <w:t xml:space="preserve"> </w:t>
-      </w:r>
-      <w:r>
-        <w:rPr>
-          <w:i/>
-          <w:iCs/>
-        </w:rPr>
-        <w:t xml:space="preserve">spec</w:t>
-      </w:r>
-      <w:r>
-        <w:t xml:space="preserve">. It doesn’t prove the spec matches what you actually meant — if the same person (or the same</w:t>
-      </w:r>
-      <w:r>
-        <w:t xml:space="preserve"> </w:t>
-      </w:r>
-      <w:r>
-        <w:t xml:space="preserve">agent) writes both the implementation and the spec by watching the code run, you get a regression</w:t>
-      </w:r>
-      <w:r>
-        <w:t xml:space="preserve"> </w:t>
-      </w:r>
-      <w:r>
-        <w:t xml:space="preserve">lock on today’s behavior, not a correctness check against intent. The scenario in this workshop is</w:t>
-      </w:r>
-      <w:r>
-        <w:t xml:space="preserve"> </w:t>
-      </w:r>
-      <w:r>
-        <w:t xml:space="preserve">authored in Part 1, before any code exists — that’s what makes it a real check. In your own work,</w:t>
-      </w:r>
-      <w:r>
-        <w:t xml:space="preserve"> </w:t>
-      </w:r>
-      <w:r>
-        <w:t xml:space="preserve">that means: write the spec first, or have someone other than the implementer sign off on it, before</w:t>
-      </w:r>
-      <w:r>
-        <w:t xml:space="preserve"> </w:t>
-      </w:r>
-      <w:r>
-        <w:t xml:space="preserve">trusting it as proof of anything.</w:t>
-      </w:r>
-    </w:p>
-    <w:bookmarkEnd w:id="47"/>
-    <w:bookmarkStart w:id="48" w:name="isnt-this-just-a-unit-test"/>
+        <w:t xml:space="preserve">asks the agent to build the runner</w:t>
+      </w:r>
+      <w:r>
+        <w:t xml:space="preserve"> </w:t>
+      </w:r>
+      <w:r>
+        <w:t xml:space="preserve">— nobody in the room has to know how</w:t>
+      </w:r>
+      <w:r>
+        <w:t xml:space="preserve"> </w:t>
+      </w:r>
+      <w:r>
+        <w:t xml:space="preserve">to test a</w:t>
+      </w:r>
+      <w:r>
+        <w:t xml:space="preserve"> </w:t>
+      </w:r>
+      <w:r>
+        <w:rPr>
+          <w:rStyle w:val="VerbatimChar"/>
+        </w:rPr>
+        <w:t xml:space="preserve">.feature</w:t>
+      </w:r>
+      <w:r>
+        <w:t xml:space="preserve">.</w:t>
+      </w:r>
+    </w:p>
+    <w:p>
+      <w:pPr>
+        <w:pStyle w:val="Compact"/>
+        <w:numPr>
+          <w:ilvl w:val="0"/>
+          <w:numId w:val="1007"/>
+        </w:numPr>
+      </w:pPr>
+      <w:r>
+        <w:t xml:space="preserve">Let the agent build the</w:t>
+      </w:r>
+      <w:r>
+        <w:t xml:space="preserve"> </w:t>
+      </w:r>
+      <w:r>
+        <w:rPr>
+          <w:rStyle w:val="VerbatimChar"/>
+        </w:rPr>
+        <w:t xml:space="preserve">.feature</w:t>
+      </w:r>
+      <w:r>
+        <w:t xml:space="preserve"> </w:t>
+      </w:r>
+      <w:r>
+        <w:t xml:space="preserve">+</w:t>
+      </w:r>
+      <w:r>
+        <w:t xml:space="preserve"> </w:t>
+      </w:r>
+      <w:r>
+        <w:rPr>
+          <w:rStyle w:val="VerbatimChar"/>
+        </w:rPr>
+        <w:t xml:space="preserve">discount.js</w:t>
+      </w:r>
+      <w:r>
+        <w:t xml:space="preserve"> </w:t>
+      </w:r>
+      <w:r>
+        <w:t xml:space="preserve">+</w:t>
+      </w:r>
+      <w:r>
+        <w:t xml:space="preserve"> </w:t>
+      </w:r>
+      <w:r>
+        <w:rPr>
+          <w:rStyle w:val="VerbatimChar"/>
+        </w:rPr>
+        <w:t xml:space="preserve">dsl_runner.js</w:t>
+      </w:r>
+      <w:r>
+        <w:t xml:space="preserve">; run the checker, show green;</w:t>
+      </w:r>
+      <w:r>
+        <w:t xml:space="preserve"> </w:t>
+      </w:r>
+      <w:r>
+        <w:rPr>
+          <w:rStyle w:val="VerbatimChar"/>
+        </w:rPr>
+        <w:t xml:space="preserve">node dsl_runner.js 120 SAVE20</w:t>
+      </w:r>
+      <w:r>
+        <w:t xml:space="preserve"> </w:t>
+      </w:r>
+      <w:r>
+        <w:t xml:space="preserve">to poke the rule live.</w:t>
+      </w:r>
+    </w:p>
+    <w:p>
+      <w:pPr>
+        <w:pStyle w:val="Compact"/>
+        <w:numPr>
+          <w:ilvl w:val="0"/>
+          <w:numId w:val="1007"/>
+        </w:numPr>
+      </w:pPr>
+      <w:r>
+        <w:t xml:space="preserve">Sprint the app (Part 2), open it, apply</w:t>
+      </w:r>
+      <w:r>
+        <w:t xml:space="preserve"> </w:t>
+      </w:r>
+      <w:r>
+        <w:rPr>
+          <w:rStyle w:val="VerbatimChar"/>
+        </w:rPr>
+        <w:t xml:space="preserve">SAVE20</w:t>
+      </w:r>
+      <w:r>
+        <w:t xml:space="preserve"> </w:t>
+      </w:r>
+      <w:r>
+        <w:t xml:space="preserve">→ $96.00.</w:t>
+      </w:r>
+    </w:p>
+    <w:p>
+      <w:pPr>
+        <w:pStyle w:val="Compact"/>
+        <w:numPr>
+          <w:ilvl w:val="0"/>
+          <w:numId w:val="1007"/>
+        </w:numPr>
+      </w:pPr>
+      <w:r>
+        <w:t xml:space="preserve">Break</w:t>
+      </w:r>
+      <w:r>
+        <w:t xml:space="preserve"> </w:t>
+      </w:r>
+      <w:r>
+        <w:rPr>
+          <w:rStyle w:val="VerbatimChar"/>
+        </w:rPr>
+        <w:t xml:space="preserve">discount.js</w:t>
+      </w:r>
+      <w:r>
+        <w:t xml:space="preserve"> </w:t>
+      </w:r>
+      <w:r>
+        <w:t xml:space="preserve">live, re-run the checker (and</w:t>
+      </w:r>
+      <w:r>
+        <w:t xml:space="preserve"> </w:t>
+      </w:r>
+      <w:r>
+        <w:rPr>
+          <w:rStyle w:val="VerbatimChar"/>
+        </w:rPr>
+        <w:t xml:space="preserve">sprint complete</w:t>
+      </w:r>
+      <w:r>
+        <w:t xml:space="preserve">), show the exact</w:t>
+      </w:r>
+      <w:r>
+        <w:t xml:space="preserve"> </w:t>
+      </w:r>
+      <w:r>
+        <w:rPr>
+          <w:rStyle w:val="VerbatimChar"/>
+        </w:rPr>
+        <w:t xml:space="preserve">[FAIL]</w:t>
+      </w:r>
+      <w:r>
+        <w:t xml:space="preserve"> </w:t>
+      </w:r>
+      <w:r>
+        <w:t xml:space="preserve">and</w:t>
+      </w:r>
+      <w:r>
+        <w:t xml:space="preserve"> </w:t>
+      </w:r>
+      <w:r>
+        <w:t xml:space="preserve">the app now wrongly discounting $40, then revert and show green again. This is the whole point in</w:t>
+      </w:r>
+      <w:r>
+        <w:t xml:space="preserve"> </w:t>
+      </w:r>
+      <w:r>
+        <w:t xml:space="preserve">about fifteen seconds.</w:t>
+      </w:r>
+    </w:p>
+    <w:p>
+      <w:pPr>
+        <w:pStyle w:val="Compact"/>
+        <w:numPr>
+          <w:ilvl w:val="0"/>
+          <w:numId w:val="1007"/>
+        </w:numPr>
+      </w:pPr>
+      <w:r>
+        <w:t xml:space="preserve">Close on the honest-limit section above — name what this does and doesn’t prove before anyone asks.</w:t>
+      </w:r>
+    </w:p>
+    <w:bookmarkEnd w:id="49"/>
+    <w:bookmarkStart w:id="50" w:name="related-material"/>
     <w:p>
       <w:pPr>
         <w:pStyle w:val="Heading2"/>
       </w:pPr>
       <w:r>
-        <w:t xml:space="preserve">“Isn’t this just a unit test?”</w:t>
-      </w:r>
-    </w:p>
-    <w:p>
-      <w:pPr>
-        <w:pStyle w:val="FirstParagraph"/>
-      </w:pPr>
-      <w:r>
-        <w:t xml:space="preserve">Say yes first — for this exact bug, a unit-test equivalent would catch it too:</w:t>
-      </w:r>
-    </w:p>
-    <w:p>
-      <w:pPr>
-        <w:pStyle w:val="SourceCode"/>
-      </w:pPr>
-      <w:r>
-        <w:rPr>
-          <w:rStyle w:val="FunctionTok"/>
-        </w:rPr>
-        <w:t xml:space="preserve">test</w:t>
-      </w:r>
-      <w:r>
-        <w:rPr>
-          <w:rStyle w:val="NormalTok"/>
-        </w:rPr>
-        <w:t xml:space="preserve">(</w:t>
-      </w:r>
-      <w:r>
-        <w:rPr>
-          <w:rStyle w:val="StringTok"/>
-        </w:rPr>
-        <w:t xml:space="preserve">"below minimum is rejected"</w:t>
-      </w:r>
-      <w:r>
-        <w:rPr>
-          <w:rStyle w:val="OperatorTok"/>
-        </w:rPr>
-        <w:t xml:space="preserve">,</w:t>
-      </w:r>
-      <w:r>
-        <w:rPr>
-          <w:rStyle w:val="NormalTok"/>
-        </w:rPr>
-        <w:t xml:space="preserve"> () </w:t>
-      </w:r>
-      <w:r>
-        <w:rPr>
-          <w:rStyle w:val="KeywordTok"/>
-        </w:rPr>
-        <w:t xml:space="preserve">=&gt;</w:t>
-      </w:r>
-      <w:r>
-        <w:rPr>
-          <w:rStyle w:val="NormalTok"/>
-        </w:rPr>
-        <w:t xml:space="preserve"> {</w:t>
-      </w:r>
-      <w:r>
-        <w:br/>
-      </w:r>
-      <w:r>
-        <w:rPr>
-          <w:rStyle w:val="NormalTok"/>
-        </w:rPr>
-        <w:t xml:space="preserve">  </w:t>
-      </w:r>
-      <w:r>
-        <w:rPr>
-          <w:rStyle w:val="KeywordTok"/>
-        </w:rPr>
-        <w:t xml:space="preserve">const</w:t>
-      </w:r>
-      <w:r>
-        <w:rPr>
-          <w:rStyle w:val="NormalTok"/>
-        </w:rPr>
-        <w:t xml:space="preserve"> result </w:t>
-      </w:r>
-      <w:r>
-        <w:rPr>
-          <w:rStyle w:val="OperatorTok"/>
-        </w:rPr>
-        <w:t xml:space="preserve">=</w:t>
-      </w:r>
-      <w:r>
-        <w:rPr>
-          <w:rStyle w:val="NormalTok"/>
-        </w:rPr>
-        <w:t xml:space="preserve"> </w:t>
-      </w:r>
-      <w:r>
-        <w:rPr>
-          <w:rStyle w:val="FunctionTok"/>
-        </w:rPr>
-        <w:t xml:space="preserve">apply_discount</w:t>
-      </w:r>
-      <w:r>
-        <w:rPr>
-          <w:rStyle w:val="NormalTok"/>
-        </w:rPr>
-        <w:t xml:space="preserve">(</w:t>
-      </w:r>
-      <w:r>
-        <w:rPr>
-          <w:rStyle w:val="FloatTok"/>
-        </w:rPr>
-        <w:t xml:space="preserve">40.0</w:t>
-      </w:r>
-      <w:r>
-        <w:rPr>
-          <w:rStyle w:val="OperatorTok"/>
-        </w:rPr>
-        <w:t xml:space="preserve">,</w:t>
-      </w:r>
-      <w:r>
-        <w:rPr>
-          <w:rStyle w:val="NormalTok"/>
-        </w:rPr>
-        <w:t xml:space="preserve"> </w:t>
-      </w:r>
-      <w:r>
-        <w:rPr>
-          <w:rStyle w:val="StringTok"/>
-        </w:rPr>
-        <w:t xml:space="preserve">"SAVE10"</w:t>
-      </w:r>
-      <w:r>
-        <w:rPr>
-          <w:rStyle w:val="NormalTok"/>
-        </w:rPr>
-        <w:t xml:space="preserve">)</w:t>
-      </w:r>
-      <w:r>
-        <w:rPr>
-          <w:rStyle w:val="OperatorTok"/>
-        </w:rPr>
-        <w:t xml:space="preserve">;</w:t>
-      </w:r>
-      <w:r>
-        <w:br/>
-      </w:r>
-      <w:r>
-        <w:rPr>
-          <w:rStyle w:val="NormalTok"/>
-        </w:rPr>
-        <w:t xml:space="preserve">  </w:t>
-      </w:r>
-      <w:r>
-        <w:rPr>
-          <w:rStyle w:val="FunctionTok"/>
-        </w:rPr>
-        <w:t xml:space="preserve">expect</w:t>
-      </w:r>
-      <w:r>
-        <w:rPr>
-          <w:rStyle w:val="NormalTok"/>
-        </w:rPr>
-        <w:t xml:space="preserve">(result</w:t>
-      </w:r>
-      <w:r>
-        <w:rPr>
-          <w:rStyle w:val="OperatorTok"/>
-        </w:rPr>
-        <w:t xml:space="preserve">.</w:t>
-      </w:r>
-      <w:r>
-        <w:rPr>
-          <w:rStyle w:val="AttributeTok"/>
-        </w:rPr>
-        <w:t xml:space="preserve">applied</w:t>
-      </w:r>
-      <w:r>
-        <w:rPr>
-          <w:rStyle w:val="NormalTok"/>
-        </w:rPr>
-        <w:t xml:space="preserve">)</w:t>
-      </w:r>
-      <w:r>
-        <w:rPr>
-          <w:rStyle w:val="OperatorTok"/>
-        </w:rPr>
-        <w:t xml:space="preserve">.</w:t>
-      </w:r>
-      <w:r>
-        <w:rPr>
-          <w:rStyle w:val="FunctionTok"/>
-        </w:rPr>
-        <w:t xml:space="preserve">toBe</w:t>
-      </w:r>
-      <w:r>
-        <w:rPr>
-          <w:rStyle w:val="NormalTok"/>
-        </w:rPr>
-        <w:t xml:space="preserve">(</w:t>
-      </w:r>
-      <w:r>
-        <w:rPr>
-          <w:rStyle w:val="KeywordTok"/>
-        </w:rPr>
-        <w:t xml:space="preserve">false</w:t>
-      </w:r>
-      <w:r>
-        <w:rPr>
-          <w:rStyle w:val="NormalTok"/>
-        </w:rPr>
-        <w:t xml:space="preserve">)</w:t>
-      </w:r>
-      <w:r>
-        <w:rPr>
-          <w:rStyle w:val="OperatorTok"/>
-        </w:rPr>
-        <w:t xml:space="preserve">;</w:t>
-      </w:r>
-      <w:r>
-        <w:br/>
-      </w:r>
-      <w:r>
-        <w:rPr>
-          <w:rStyle w:val="NormalTok"/>
-        </w:rPr>
-        <w:t xml:space="preserve">  </w:t>
-      </w:r>
-      <w:r>
-        <w:rPr>
-          <w:rStyle w:val="FunctionTok"/>
-        </w:rPr>
-        <w:t xml:space="preserve">expect</w:t>
-      </w:r>
-      <w:r>
-        <w:rPr>
-          <w:rStyle w:val="NormalTok"/>
-        </w:rPr>
-        <w:t xml:space="preserve">(result</w:t>
-      </w:r>
-      <w:r>
-        <w:rPr>
-          <w:rStyle w:val="OperatorTok"/>
-        </w:rPr>
-        <w:t xml:space="preserve">.</w:t>
-      </w:r>
-      <w:r>
-        <w:rPr>
-          <w:rStyle w:val="AttributeTok"/>
-        </w:rPr>
-        <w:t xml:space="preserve">reason</w:t>
-      </w:r>
-      <w:r>
-        <w:rPr>
-          <w:rStyle w:val="NormalTok"/>
-        </w:rPr>
-        <w:t xml:space="preserve">)</w:t>
-      </w:r>
-      <w:r>
-        <w:rPr>
-          <w:rStyle w:val="OperatorTok"/>
-        </w:rPr>
-        <w:t xml:space="preserve">.</w:t>
-      </w:r>
-      <w:r>
-        <w:rPr>
-          <w:rStyle w:val="FunctionTok"/>
-        </w:rPr>
-        <w:t xml:space="preserve">toBe</w:t>
-      </w:r>
-      <w:r>
-        <w:rPr>
-          <w:rStyle w:val="NormalTok"/>
-        </w:rPr>
-        <w:t xml:space="preserve">(</w:t>
-      </w:r>
-      <w:r>
-        <w:rPr>
-          <w:rStyle w:val="StringTok"/>
-        </w:rPr>
-        <w:t xml:space="preserve">"minimum not met"</w:t>
-      </w:r>
-      <w:r>
-        <w:rPr>
-          <w:rStyle w:val="NormalTok"/>
-        </w:rPr>
-        <w:t xml:space="preserve">)</w:t>
-      </w:r>
-      <w:r>
-        <w:rPr>
-          <w:rStyle w:val="OperatorTok"/>
-        </w:rPr>
-        <w:t xml:space="preserve">;</w:t>
-      </w:r>
-      <w:r>
-        <w:br/>
-      </w:r>
-      <w:r>
-        <w:rPr>
-          <w:rStyle w:val="NormalTok"/>
-        </w:rPr>
-        <w:t xml:space="preserve">})</w:t>
-      </w:r>
-      <w:r>
-        <w:rPr>
-          <w:rStyle w:val="OperatorTok"/>
-        </w:rPr>
-        <w:t xml:space="preserve">;</w:t>
-      </w:r>
-    </w:p>
-    <w:p>
-      <w:pPr>
-        <w:pStyle w:val="FirstParagraph"/>
-      </w:pPr>
-      <w:r>
-        <w:t xml:space="preserve">Same detection power, same mechanism. The DSL isn’t a stronger test — the difference is</w:t>
-      </w:r>
-      <w:r>
-        <w:t xml:space="preserve"> </w:t>
-      </w:r>
-      <w:r>
-        <w:rPr>
-          <w:i/>
-          <w:iCs/>
-        </w:rPr>
-        <w:t xml:space="preserve">who could</w:t>
-      </w:r>
-      <w:r>
-        <w:rPr>
-          <w:i/>
-          <w:iCs/>
-        </w:rPr>
-        <w:t xml:space="preserve"> </w:t>
-      </w:r>
-      <w:r>
-        <w:rPr>
-          <w:i/>
-          <w:iCs/>
-        </w:rPr>
-        <w:t xml:space="preserve">have written it</w:t>
-      </w:r>
-      <w:r>
-        <w:t xml:space="preserve">. The</w:t>
-      </w:r>
-      <w:r>
-        <w:t xml:space="preserve"> </w:t>
-      </w:r>
-      <w:r>
-        <w:rPr>
-          <w:rStyle w:val="VerbatimChar"/>
-        </w:rPr>
-        <w:t xml:space="preserve">.feature</w:t>
-      </w:r>
-      <w:r>
-        <w:t xml:space="preserve"> </w:t>
-      </w:r>
-      <w:r>
-        <w:t xml:space="preserve">version only requires knowing the discount rule; the unit-test</w:t>
-      </w:r>
-      <w:r>
-        <w:t xml:space="preserve"> </w:t>
-      </w:r>
-      <w:r>
-        <w:t xml:space="preserve">version requires knowing the rule</w:t>
-      </w:r>
-      <w:r>
-        <w:t xml:space="preserve"> </w:t>
-      </w:r>
-      <w:r>
-        <w:rPr>
-          <w:b/>
-          <w:bCs/>
-        </w:rPr>
-        <w:t xml:space="preserve">and</w:t>
-      </w:r>
-      <w:r>
-        <w:t xml:space="preserve"> </w:t>
-      </w:r>
-      <w:r>
-        <w:t xml:space="preserve">the language (</w:t>
-      </w:r>
-      <w:r>
-        <w:rPr>
-          <w:rStyle w:val="VerbatimChar"/>
-        </w:rPr>
-        <w:t xml:space="preserve">expect</w:t>
-      </w:r>
-      <w:r>
-        <w:t xml:space="preserve">, object access, how to run the</w:t>
-      </w:r>
-      <w:r>
-        <w:t xml:space="preserve"> </w:t>
-      </w:r>
-      <w:r>
-        <w:t xml:space="preserve">suite). Whoever owns the pricing policy can write and sign off on the scenario directly, with zero</w:t>
-      </w:r>
-      <w:r>
-        <w:t xml:space="preserve"> </w:t>
-      </w:r>
-      <w:r>
-        <w:t xml:space="preserve">code literacy — the unit test needs a translation step from rule to assertion syntax, done by whoever</w:t>
-      </w:r>
-      <w:r>
-        <w:t xml:space="preserve"> </w:t>
-      </w:r>
-      <w:r>
-        <w:t xml:space="preserve">implements it, which is exactly where intent quietly drifts.</w:t>
-      </w:r>
-    </w:p>
-    <w:p>
-      <w:pPr>
-        <w:pStyle w:val="BodyText"/>
-      </w:pPr>
-      <w:r>
-        <w:t xml:space="preserve">One counter to have ready:</w:t>
-      </w:r>
-      <w:r>
-        <w:t xml:space="preserve"> </w:t>
-      </w:r>
-      <w:r>
-        <w:t xml:space="preserve">“isn’t</w:t>
-      </w:r>
-      <w:r>
-        <w:t xml:space="preserve"> </w:t>
-      </w:r>
-      <w:r>
-        <w:t xml:space="preserve">‘write the check before the code’</w:t>
-      </w:r>
-      <w:r>
-        <w:t xml:space="preserve"> </w:t>
-      </w:r>
-      <w:r>
-        <w:t xml:space="preserve">just TDD?”</w:t>
-      </w:r>
-      <w:r>
-        <w:t xml:space="preserve"> </w:t>
-      </w:r>
-      <w:r>
-        <w:t xml:space="preserve">Yes — concede it.</w:t>
-      </w:r>
-      <w:r>
-        <w:t xml:space="preserve"> </w:t>
-      </w:r>
-      <w:r>
-        <w:t xml:space="preserve">TDD gets you the ordering. It doesn’t get you the readership: a test-first unit-test file is still</w:t>
-      </w:r>
-      <w:r>
-        <w:t xml:space="preserve"> </w:t>
-      </w:r>
-      <w:r>
-        <w:t xml:space="preserve">unreadable to whoever actually owns the rule. That gap matters more, not less, as rules move further</w:t>
-      </w:r>
-      <w:r>
-        <w:t xml:space="preserve"> </w:t>
-      </w:r>
-      <w:r>
-        <w:t xml:space="preserve">from engineering — pricing policy, compliance, CFIHOS conformance — cases where the person who knows</w:t>
-      </w:r>
-      <w:r>
-        <w:t xml:space="preserve"> </w:t>
-      </w:r>
-      <w:r>
-        <w:t xml:space="preserve">what</w:t>
-      </w:r>
-      <w:r>
-        <w:t xml:space="preserve"> </w:t>
-      </w:r>
-      <w:r>
-        <w:t xml:space="preserve">“correct”</w:t>
-      </w:r>
-      <w:r>
-        <w:t xml:space="preserve"> </w:t>
-      </w:r>
-      <w:r>
-        <w:t xml:space="preserve">means was never going to write the assertion.</w:t>
-      </w:r>
-    </w:p>
-    <w:bookmarkEnd w:id="48"/>
-    <w:bookmarkStart w:id="49" w:name="X9a249f5f163a90280cb293225baf90a156639df"/>
-    <w:p>
-      <w:pPr>
-        <w:pStyle w:val="Heading2"/>
-      </w:pPr>
-      <w:r>
-        <w:t xml:space="preserve">Suggested demonstration sequence (for instructors)</w:t>
-      </w:r>
-    </w:p>
-    <w:p>
-      <w:pPr>
-        <w:pStyle w:val="FirstParagraph"/>
-      </w:pPr>
-      <w:r>
-        <w:t xml:space="preserve">Condensed recap, for running this live in front of a group:</w:t>
+        <w:t xml:space="preserve">Related material</w:t>
       </w:r>
     </w:p>
     <w:p>
@@ -6749,40 +6816,28 @@
         </w:numPr>
       </w:pPr>
       <w:r>
-        <w:t xml:space="preserve">Show</w:t>
-      </w:r>
-      <w:r>
-        <w:t xml:space="preserve"> </w:t>
-      </w:r>
-      <w:r>
-        <w:rPr>
-          <w:rStyle w:val="VerbatimChar"/>
-        </w:rPr>
-        <w:t xml:space="preserve">specs/discount.feature</w:t>
-      </w:r>
-      <w:r>
-        <w:t xml:space="preserve"> </w:t>
-      </w:r>
-      <w:r>
-        <w:t xml:space="preserve">(or author it live on the board, Part 1) — read it aloud, confirm the</w:t>
-      </w:r>
-      <w:r>
-        <w:t xml:space="preserve"> </w:t>
-      </w:r>
-      <w:r>
-        <w:t xml:space="preserve">room agrees on what</w:t>
-      </w:r>
-      <w:r>
-        <w:t xml:space="preserve"> </w:t>
-      </w:r>
-      <w:r>
-        <w:t xml:space="preserve">“correct”</w:t>
-      </w:r>
-      <w:r>
-        <w:t xml:space="preserve"> </w:t>
-      </w:r>
-      <w:r>
-        <w:t xml:space="preserve">means before any code exists.</w:t>
+        <w:t xml:space="preserve">The real-world version of this pattern: a CFIHOS-style conformance engine for plant equipment data,</w:t>
+      </w:r>
+      <w:r>
+        <w:t xml:space="preserve"> </w:t>
+      </w:r>
+      <w:r>
+        <w:t xml:space="preserve">with the same spec/runner/live-break structure, in</w:t>
+      </w:r>
+      <w:r>
+        <w:t xml:space="preserve"> </w:t>
+      </w:r>
+      <w:r>
+        <w:rPr>
+          <w:rStyle w:val="VerbatimChar"/>
+        </w:rPr>
+        <w:t xml:space="preserve">overtone_demo/scenarios.py</w:t>
+      </w:r>
+      <w:r>
+        <w:t xml:space="preserve"> </w:t>
+      </w:r>
+      <w:r>
+        <w:t xml:space="preserve">(separate repo).</w:t>
       </w:r>
     </w:p>
     <w:p>
@@ -6791,269 +6846,6 @@
         <w:numPr>
           <w:ilvl w:val="0"/>
           <w:numId w:val="1008"/>
-        </w:numPr>
-      </w:pPr>
-      <w:r>
-        <w:t xml:space="preserve">Point out that the ticket</w:t>
-      </w:r>
-      <w:r>
-        <w:t xml:space="preserve"> </w:t>
-      </w:r>
-      <w:r>
-        <w:rPr>
-          <w:i/>
-          <w:iCs/>
-        </w:rPr>
-        <w:t xml:space="preserve">asks the agent to build the runner</w:t>
-      </w:r>
-      <w:r>
-        <w:t xml:space="preserve"> </w:t>
-      </w:r>
-      <w:r>
-        <w:t xml:space="preserve">— nobody in the room has to know how</w:t>
-      </w:r>
-      <w:r>
-        <w:t xml:space="preserve"> </w:t>
-      </w:r>
-      <w:r>
-        <w:t xml:space="preserve">to test a</w:t>
-      </w:r>
-      <w:r>
-        <w:t xml:space="preserve"> </w:t>
-      </w:r>
-      <w:r>
-        <w:rPr>
-          <w:rStyle w:val="VerbatimChar"/>
-        </w:rPr>
-        <w:t xml:space="preserve">.feature</w:t>
-      </w:r>
-      <w:r>
-        <w:t xml:space="preserve">.</w:t>
-      </w:r>
-    </w:p>
-    <w:p>
-      <w:pPr>
-        <w:pStyle w:val="Compact"/>
-        <w:numPr>
-          <w:ilvl w:val="0"/>
-          <w:numId w:val="1008"/>
-        </w:numPr>
-      </w:pPr>
-      <w:r>
-        <w:t xml:space="preserve">Let the agent build the</w:t>
-      </w:r>
-      <w:r>
-        <w:t xml:space="preserve"> </w:t>
-      </w:r>
-      <w:r>
-        <w:rPr>
-          <w:rStyle w:val="VerbatimChar"/>
-        </w:rPr>
-        <w:t xml:space="preserve">.feature</w:t>
-      </w:r>
-      <w:r>
-        <w:t xml:space="preserve"> </w:t>
-      </w:r>
-      <w:r>
-        <w:t xml:space="preserve">+</w:t>
-      </w:r>
-      <w:r>
-        <w:t xml:space="preserve"> </w:t>
-      </w:r>
-      <w:r>
-        <w:rPr>
-          <w:rStyle w:val="VerbatimChar"/>
-        </w:rPr>
-        <w:t xml:space="preserve">discount.js</w:t>
-      </w:r>
-      <w:r>
-        <w:t xml:space="preserve"> </w:t>
-      </w:r>
-      <w:r>
-        <w:t xml:space="preserve">+</w:t>
-      </w:r>
-      <w:r>
-        <w:t xml:space="preserve"> </w:t>
-      </w:r>
-      <w:r>
-        <w:rPr>
-          <w:rStyle w:val="VerbatimChar"/>
-        </w:rPr>
-        <w:t xml:space="preserve">dsl_runner.js</w:t>
-      </w:r>
-      <w:r>
-        <w:t xml:space="preserve">; run the checker, show green;</w:t>
-      </w:r>
-      <w:r>
-        <w:t xml:space="preserve"> </w:t>
-      </w:r>
-      <w:r>
-        <w:rPr>
-          <w:rStyle w:val="VerbatimChar"/>
-        </w:rPr>
-        <w:t xml:space="preserve">node dsl_runner.js 120 SAVE20</w:t>
-      </w:r>
-      <w:r>
-        <w:t xml:space="preserve"> </w:t>
-      </w:r>
-      <w:r>
-        <w:t xml:space="preserve">to poke the rule live.</w:t>
-      </w:r>
-    </w:p>
-    <w:p>
-      <w:pPr>
-        <w:pStyle w:val="Compact"/>
-        <w:numPr>
-          <w:ilvl w:val="0"/>
-          <w:numId w:val="1008"/>
-        </w:numPr>
-      </w:pPr>
-      <w:r>
-        <w:t xml:space="preserve">Sprint the app (Part 2), open it, apply</w:t>
-      </w:r>
-      <w:r>
-        <w:t xml:space="preserve"> </w:t>
-      </w:r>
-      <w:r>
-        <w:rPr>
-          <w:rStyle w:val="VerbatimChar"/>
-        </w:rPr>
-        <w:t xml:space="preserve">SAVE20</w:t>
-      </w:r>
-      <w:r>
-        <w:t xml:space="preserve"> </w:t>
-      </w:r>
-      <w:r>
-        <w:t xml:space="preserve">→ $96.00.</w:t>
-      </w:r>
-    </w:p>
-    <w:p>
-      <w:pPr>
-        <w:pStyle w:val="Compact"/>
-        <w:numPr>
-          <w:ilvl w:val="0"/>
-          <w:numId w:val="1008"/>
-        </w:numPr>
-      </w:pPr>
-      <w:r>
-        <w:t xml:space="preserve">Break</w:t>
-      </w:r>
-      <w:r>
-        <w:t xml:space="preserve"> </w:t>
-      </w:r>
-      <w:r>
-        <w:rPr>
-          <w:rStyle w:val="VerbatimChar"/>
-        </w:rPr>
-        <w:t xml:space="preserve">discount.js</w:t>
-      </w:r>
-      <w:r>
-        <w:t xml:space="preserve"> </w:t>
-      </w:r>
-      <w:r>
-        <w:t xml:space="preserve">live, re-run the checker (and</w:t>
-      </w:r>
-      <w:r>
-        <w:t xml:space="preserve"> </w:t>
-      </w:r>
-      <w:r>
-        <w:rPr>
-          <w:rStyle w:val="VerbatimChar"/>
-        </w:rPr>
-        <w:t xml:space="preserve">sprint complete</w:t>
-      </w:r>
-      <w:r>
-        <w:t xml:space="preserve">), show the exact</w:t>
-      </w:r>
-      <w:r>
-        <w:t xml:space="preserve"> </w:t>
-      </w:r>
-      <w:r>
-        <w:rPr>
-          <w:rStyle w:val="VerbatimChar"/>
-        </w:rPr>
-        <w:t xml:space="preserve">[FAIL]</w:t>
-      </w:r>
-      <w:r>
-        <w:t xml:space="preserve"> </w:t>
-      </w:r>
-      <w:r>
-        <w:t xml:space="preserve">and</w:t>
-      </w:r>
-      <w:r>
-        <w:t xml:space="preserve"> </w:t>
-      </w:r>
-      <w:r>
-        <w:t xml:space="preserve">the app now wrongly discounting $40, then revert and show green again. This is the whole point in</w:t>
-      </w:r>
-      <w:r>
-        <w:t xml:space="preserve"> </w:t>
-      </w:r>
-      <w:r>
-        <w:t xml:space="preserve">about fifteen seconds.</w:t>
-      </w:r>
-    </w:p>
-    <w:p>
-      <w:pPr>
-        <w:pStyle w:val="Compact"/>
-        <w:numPr>
-          <w:ilvl w:val="0"/>
-          <w:numId w:val="1008"/>
-        </w:numPr>
-      </w:pPr>
-      <w:r>
-        <w:t xml:space="preserve">Close on the honest-limit section above — name what this does and doesn’t prove before anyone asks.</w:t>
-      </w:r>
-    </w:p>
-    <w:bookmarkEnd w:id="49"/>
-    <w:bookmarkStart w:id="50" w:name="related-material"/>
-    <w:p>
-      <w:pPr>
-        <w:pStyle w:val="Heading2"/>
-      </w:pPr>
-      <w:r>
-        <w:t xml:space="preserve">Related material</w:t>
-      </w:r>
-    </w:p>
-    <w:p>
-      <w:pPr>
-        <w:pStyle w:val="Compact"/>
-        <w:numPr>
-          <w:ilvl w:val="0"/>
-          <w:numId w:val="1009"/>
-        </w:numPr>
-      </w:pPr>
-      <w:r>
-        <w:t xml:space="preserve">The real-world version of this pattern: a CFIHOS-style conformance engine for plant equipment data,</w:t>
-      </w:r>
-      <w:r>
-        <w:t xml:space="preserve"> </w:t>
-      </w:r>
-      <w:r>
-        <w:t xml:space="preserve">with the same spec/runner/live-break structure, in</w:t>
-      </w:r>
-      <w:r>
-        <w:t xml:space="preserve"> </w:t>
-      </w:r>
-      <w:r>
-        <w:rPr>
-          <w:rStyle w:val="VerbatimChar"/>
-        </w:rPr>
-        <w:t xml:space="preserve">overtone_demo/scenarios.py</w:t>
-      </w:r>
-      <w:r>
-        <w:t xml:space="preserve"> </w:t>
-      </w:r>
-      <w:r>
-        <w:t xml:space="preserve">(separate repo).</w:t>
-      </w:r>
-    </w:p>
-    <w:p>
-      <w:pPr>
-        <w:pStyle w:val="Compact"/>
-        <w:numPr>
-          <w:ilvl w:val="0"/>
-          <w:numId w:val="1009"/>
         </w:numPr>
       </w:pPr>
       <w:r>
@@ -7457,9 +7249,6 @@
     <w:abstractNumId w:val="991"/>
   </w:num>
   <w:num w:numId="1005">
-    <w:abstractNumId w:val="991"/>
-  </w:num>
-  <w:num w:numId="1006">
     <w:abstractNumId w:val="99411"/>
     <w:lvlOverride w:ilvl="0">
       <w:startOverride w:val="1"/>
@@ -7489,10 +7278,10 @@
       <w:startOverride w:val="1"/>
     </w:lvlOverride>
   </w:num>
-  <w:num w:numId="1007">
+  <w:num w:numId="1006">
     <w:abstractNumId w:val="991"/>
   </w:num>
-  <w:num w:numId="1008">
+  <w:num w:numId="1007">
     <w:abstractNumId w:val="99411"/>
     <w:lvlOverride w:ilvl="0">
       <w:startOverride w:val="1"/>
@@ -7522,7 +7311,7 @@
       <w:startOverride w:val="1"/>
     </w:lvlOverride>
   </w:num>
-  <w:num w:numId="1009">
+  <w:num w:numId="1008">
     <w:abstractNumId w:val="991"/>
   </w:num>
 </w:numbering>

</xml_diff>

<commit_message>
docs(dsl-discount-spec): scenario-derived per-scenario runner output
Both dsl_runner.py and app/dsl_runner.js check mode now print one line per
scenario — Amount/Code/Verdict/Reason — projected from the scenario (Given ->
Amount/Code, Then -> Verdict, result -> Reason), instead of the [PASS]/[FAIL]
scenario-name line. On FAIL the exact mismatch is appended; scenario-name +
PASS/FAIL is documented as the fallback. Exit-code contract (0/1) unchanged.
README text, both runner screenshots, and README.docx updated to match.

Closes: t-07aa
</commit_message>
<xml_diff>
--- a/examples/dsl-discount-spec/README.docx
+++ b/examples/dsl-discount-spec/README.docx
@@ -381,10 +381,16 @@
         <w:t xml:space="preserve"> </w:t>
       </w:r>
       <w:r>
-        <w:rPr>
-          <w:rStyle w:val="VerbatimChar"/>
-        </w:rPr>
-        <w:t xml:space="preserve">[PASS]</w:t>
+        <w:t xml:space="preserve">a</w:t>
+      </w:r>
+      <w:r>
+        <w:t xml:space="preserve"> </w:t>
+      </w:r>
+      <w:r>
+        <w:rPr>
+          <w:rStyle w:val="VerbatimChar"/>
+        </w:rPr>
+        <w:t xml:space="preserve">PASS</w:t>
       </w:r>
       <w:r>
         <w:t xml:space="preserve">/</w:t>
@@ -393,13 +399,13 @@
         <w:rPr>
           <w:rStyle w:val="VerbatimChar"/>
         </w:rPr>
-        <w:t xml:space="preserve">[FAIL]</w:t>
-      </w:r>
-      <w:r>
-        <w:t xml:space="preserve"> </w:t>
-      </w:r>
-      <w:r>
-        <w:t xml:space="preserve">and returning exit code</w:t>
+        <w:t xml:space="preserve">FAIL</w:t>
+      </w:r>
+      <w:r>
+        <w:t xml:space="preserve"> </w:t>
+      </w:r>
+      <w:r>
+        <w:t xml:space="preserve">verdict per scenario and returning exit code</w:t>
       </w:r>
       <w:r>
         <w:t xml:space="preserve"> </w:t>
@@ -986,7 +992,7 @@
               <w:rPr>
                 <w:rStyle w:val="VerbatimChar"/>
               </w:rPr>
-              <w:t xml:space="preserve">[PASS]</w:t>
+              <w:t xml:space="preserve">PASS</w:t>
             </w:r>
             <w:r>
               <w:t xml:space="preserve">/</w:t>
@@ -995,10 +1001,13 @@
               <w:rPr>
                 <w:rStyle w:val="VerbatimChar"/>
               </w:rPr>
-              <w:t xml:space="preserve">[FAIL]</w:t>
-            </w:r>
-            <w:r>
-              <w:t xml:space="preserve">, exit 0/1)</w:t>
+              <w:t xml:space="preserve">FAIL</w:t>
+            </w:r>
+            <w:r>
+              <w:t xml:space="preserve"> </w:t>
+            </w:r>
+            <w:r>
+              <w:t xml:space="preserve">per scenario, exit 0/1)</w:t>
             </w:r>
           </w:p>
         </w:tc>
@@ -2669,16 +2678,16 @@
         <w:t xml:space="preserve">.feature</w:t>
       </w:r>
       <w:r>
-        <w:t xml:space="preserve">’s step shapes, prints</w:t>
-      </w:r>
-      <w:r>
-        <w:t xml:space="preserve"> </w:t>
-      </w:r>
-      <w:r>
-        <w:rPr>
-          <w:rStyle w:val="VerbatimChar"/>
-        </w:rPr>
-        <w:t xml:space="preserve">[PASS]</w:t>
+        <w:t xml:space="preserve">’s step shapes, prints a</w:t>
+      </w:r>
+      <w:r>
+        <w:t xml:space="preserve"> </w:t>
+      </w:r>
+      <w:r>
+        <w:rPr>
+          <w:rStyle w:val="VerbatimChar"/>
+        </w:rPr>
+        <w:t xml:space="preserve">PASS</w:t>
       </w:r>
       <w:r>
         <w:t xml:space="preserve">/</w:t>
@@ -2687,10 +2696,13 @@
         <w:rPr>
           <w:rStyle w:val="VerbatimChar"/>
         </w:rPr>
-        <w:t xml:space="preserve">[FAIL]</w:t>
-      </w:r>
-      <w:r>
-        <w:t xml:space="preserve">, and exits</w:t>
+        <w:t xml:space="preserve">FAIL</w:t>
+      </w:r>
+      <w:r>
+        <w:t xml:space="preserve"> </w:t>
+      </w:r>
+      <w:r>
+        <w:t xml:space="preserve">verdict per scenario, and exits</w:t>
       </w:r>
       <w:r>
         <w:t xml:space="preserve"> </w:t>
@@ -3222,66 +3234,22 @@
         </w:numPr>
       </w:pPr>
       <w:r>
-        <w:t xml:space="preserve">Three</w:t>
-      </w:r>
-      <w:r>
-        <w:t xml:space="preserve"> </w:t>
-      </w:r>
-      <w:r>
-        <w:rPr>
-          <w:rStyle w:val="VerbatimChar"/>
-        </w:rPr>
-        <w:t xml:space="preserve">[PASS]</w:t>
-      </w:r>
-      <w:r>
-        <w:t xml:space="preserve"> </w:t>
-      </w:r>
-      <w:r>
-        <w:t xml:space="preserve">lines and exit code 0. Second,</w:t>
-      </w:r>
-      <w:r>
-        <w:t xml:space="preserve"> </w:t>
-      </w:r>
-      <w:r>
-        <w:rPr>
-          <w:b/>
-          <w:bCs/>
-        </w:rPr>
-        <w:t xml:space="preserve">try the rule</w:t>
-      </w:r>
-      <w:r>
-        <w:t xml:space="preserve"> </w:t>
-      </w:r>
-      <w:r>
-        <w:t xml:space="preserve">on any amount and code you like —</w:t>
-      </w:r>
-      <w:r>
-        <w:t xml:space="preserve"> </w:t>
-      </w:r>
-      <w:r>
-        <w:t xml:space="preserve">this just computes the result, it is</w:t>
-      </w:r>
-      <w:r>
-        <w:t xml:space="preserve"> </w:t>
-      </w:r>
-      <w:r>
-        <w:rPr>
-          <w:i/>
-          <w:iCs/>
-        </w:rPr>
-        <w:t xml:space="preserve">not</w:t>
-      </w:r>
-      <w:r>
-        <w:t xml:space="preserve"> </w:t>
-      </w:r>
-      <w:r>
-        <w:t xml:space="preserve">a pass/fail check (there’s no expected value to compare</w:t>
-      </w:r>
-      <w:r>
-        <w:t xml:space="preserve"> </w:t>
-      </w:r>
-      <w:r>
-        <w:t xml:space="preserve">against):</w:t>
+        <w:t xml:space="preserve">Three lines — one</w:t>
+      </w:r>
+      <w:r>
+        <w:t xml:space="preserve"> </w:t>
+      </w:r>
+      <w:r>
+        <w:rPr>
+          <w:rStyle w:val="VerbatimChar"/>
+        </w:rPr>
+        <w:t xml:space="preserve">Verdict: PASS</w:t>
+      </w:r>
+      <w:r>
+        <w:t xml:space="preserve"> </w:t>
+      </w:r>
+      <w:r>
+        <w:t xml:space="preserve">per scenario — and exit code 0:</w:t>
       </w:r>
     </w:p>
     <w:p>
@@ -3294,6 +3262,94 @@
       </w:pPr>
       <w:r>
         <w:rPr>
+          <w:rStyle w:val="VerbatimChar"/>
+        </w:rPr>
+        <w:t xml:space="preserve">Amount: 120, Code: SAVE20, Verdict: PASS, Reason: SAVE20 applied</w:t>
+      </w:r>
+      <w:r>
+        <w:br/>
+      </w:r>
+      <w:r>
+        <w:rPr>
+          <w:rStyle w:val="VerbatimChar"/>
+        </w:rPr>
+        <w:t xml:space="preserve">Amount: 40, Code: SAVE10, Verdict: PASS, Reason: minimum not met</w:t>
+      </w:r>
+      <w:r>
+        <w:br/>
+      </w:r>
+      <w:r>
+        <w:rPr>
+          <w:rStyle w:val="VerbatimChar"/>
+        </w:rPr>
+        <w:t xml:space="preserve">Amount: 200, Code: SAVE99, Verdict: PASS, Reason: invalid code</w:t>
+      </w:r>
+    </w:p>
+    <w:p>
+      <w:pPr>
+        <w:numPr>
+          <w:ilvl w:val="0"/>
+          <w:numId w:val="1000"/>
+        </w:numPr>
+      </w:pPr>
+      <w:r>
+        <w:t xml:space="preserve">Second,</w:t>
+      </w:r>
+      <w:r>
+        <w:t xml:space="preserve"> </w:t>
+      </w:r>
+      <w:r>
+        <w:rPr>
+          <w:b/>
+          <w:bCs/>
+        </w:rPr>
+        <w:t xml:space="preserve">try the rule</w:t>
+      </w:r>
+      <w:r>
+        <w:t xml:space="preserve"> </w:t>
+      </w:r>
+      <w:r>
+        <w:t xml:space="preserve">on any amount and code you like —</w:t>
+      </w:r>
+      <w:r>
+        <w:t xml:space="preserve"> </w:t>
+      </w:r>
+      <w:r>
+        <w:t xml:space="preserve">this just computes the result, it is</w:t>
+      </w:r>
+      <w:r>
+        <w:t xml:space="preserve"> </w:t>
+      </w:r>
+      <w:r>
+        <w:rPr>
+          <w:i/>
+          <w:iCs/>
+        </w:rPr>
+        <w:t xml:space="preserve">not</w:t>
+      </w:r>
+      <w:r>
+        <w:t xml:space="preserve"> </w:t>
+      </w:r>
+      <w:r>
+        <w:t xml:space="preserve">a pass/fail check (there’s no expected value to compare</w:t>
+      </w:r>
+      <w:r>
+        <w:t xml:space="preserve"> </w:t>
+      </w:r>
+      <w:r>
+        <w:t xml:space="preserve">against):</w:t>
+      </w:r>
+    </w:p>
+    <w:p>
+      <w:pPr>
+        <w:pStyle w:val="SourceCode"/>
+        <w:numPr>
+          <w:ilvl w:val="0"/>
+          <w:numId w:val="1000"/>
+        </w:numPr>
+      </w:pPr>
+      <w:r>
+        <w:rPr>
           <w:rStyle w:val="ExtensionTok"/>
         </w:rPr>
         <w:t xml:space="preserve">$</w:t>
@@ -3544,9 +3600,9 @@
       <w:r>
         <w:drawing>
           <wp:inline>
-            <wp:extent cx="5334000" cy="2773680"/>
+            <wp:extent cx="5334000" cy="2448393"/>
             <wp:effectExtent b="0" l="0" r="0" t="0"/>
-            <wp:docPr descr="Terminal: node dsl_runner.js specs/discount.feature prints three green [PASS] lines and exits 0, then two try-it runs (120/SAVE20 → 96, 40/SAVE10 → minimum not met) print the computed applied/final_total/reason" title="" id="34" name="Picture"/>
+            <wp:docPr descr="Terminal: node dsl_runner.js specs/discount.feature prints three per-scenario lines — Amount/Code/Verdict: PASS/Reason for SAVE20, SAVE10, SAVE99 — and exits 0, then two try-it runs (120/SAVE20 → 96, 40/SAVE10 → minimum not met) print the computed applied/final_total/reason" title="" id="34" name="Picture"/>
             <a:graphic>
               <a:graphicData uri="http://schemas.openxmlformats.org/drawingml/2006/picture">
                 <pic:pic>
@@ -3565,7 +3621,7 @@
                   <pic:spPr bwMode="auto">
                     <a:xfrm>
                       <a:off x="0" y="0"/>
-                      <a:ext cx="5334000" cy="2773680"/>
+                      <a:ext cx="5334000" cy="2448393"/>
                     </a:xfrm>
                     <a:prstGeom prst="rect">
                       <a:avLst/>
@@ -3593,7 +3649,7 @@
         </w:numPr>
       </w:pPr>
       <w:r>
-        <w:t xml:space="preserve">Terminal: node dsl_runner.js specs/discount.feature prints three green [PASS] lines and exits 0, then two try-it runs (120/SAVE20 → 96, 40/SAVE10 → minimum not met) print the computed applied/final_total/reason</w:t>
+        <w:t xml:space="preserve">Terminal: node dsl_runner.js specs/discount.feature prints three per-scenario lines — Amount/Code/Verdict: PASS/Reason for SAVE20, SAVE10, SAVE99 — and exits 0, then two try-it runs (120/SAVE20 → 96, 40/SAVE10 → minimum not met) print the computed applied/final_total/reason</w:t>
       </w:r>
     </w:p>
     <w:p>
@@ -4035,7 +4091,7 @@
         <w:rPr>
           <w:rStyle w:val="VerbatimChar"/>
         </w:rPr>
-        <w:t xml:space="preserve">[PASS] Valid code above minimum applies the discount</w:t>
+        <w:t xml:space="preserve">Amount: 120, Code: SAVE20, Verdict: PASS, Reason: SAVE20 applied</w:t>
       </w:r>
       <w:r>
         <w:br/>
@@ -4044,7 +4100,7 @@
         <w:rPr>
           <w:rStyle w:val="VerbatimChar"/>
         </w:rPr>
-        <w:t xml:space="preserve">[FAIL] Valid code below minimum is rejected -- applied true != expected false; reason "SAVE10 applied" != expected "minimum not met"</w:t>
+        <w:t xml:space="preserve">Amount: 40, Code: SAVE10, Verdict: FAIL, Reason: SAVE10 applied -- applied true != expected false; reason "SAVE10 applied" != expected "minimum not met"</w:t>
       </w:r>
       <w:r>
         <w:br/>
@@ -4053,7 +4109,7 @@
         <w:rPr>
           <w:rStyle w:val="VerbatimChar"/>
         </w:rPr>
-        <w:t xml:space="preserve">[PASS] Unknown code is rejected</w:t>
+        <w:t xml:space="preserve">Amount: 200, Code: SAVE99, Verdict: PASS, Reason: invalid code</w:t>
       </w:r>
     </w:p>
     <w:p>
@@ -4067,9 +4123,9 @@
       <w:r>
         <w:drawing>
           <wp:inline>
-            <wp:extent cx="5334000" cy="1641230"/>
+            <wp:extent cx="5334000" cy="1714500"/>
             <wp:effectExtent b="0" l="0" r="0" t="0"/>
-            <wp:docPr descr="Terminal: after the minimum-cart check is removed, node dsl_runner.js specs/discount.feature prints [PASS], a red [FAIL] on “Valid code below minimum is rejected” naming the exact applied/reason mismatch, then [PASS], and exits 1" title="" id="39" name="Picture"/>
+            <wp:docPr descr="Terminal: after the minimum-cart check is removed, node dsl_runner.js specs/discount.feature prints a PASS line, a red Verdict: FAIL on the “below minimum” scenario naming the exact applied/reason mismatch, then a PASS line, and exits 1" title="" id="39" name="Picture"/>
             <a:graphic>
               <a:graphicData uri="http://schemas.openxmlformats.org/drawingml/2006/picture">
                 <pic:pic>
@@ -4088,7 +4144,7 @@
                   <pic:spPr bwMode="auto">
                     <a:xfrm>
                       <a:off x="0" y="0"/>
-                      <a:ext cx="5334000" cy="1641230"/>
+                      <a:ext cx="5334000" cy="1714500"/>
                     </a:xfrm>
                     <a:prstGeom prst="rect">
                       <a:avLst/>
@@ -4116,19 +4172,19 @@
         </w:numPr>
       </w:pPr>
       <w:r>
-        <w:t xml:space="preserve">Terminal: after the minimum-cart check is removed, node dsl_runner.js specs/discount.feature prints [PASS], a red [FAIL] on</w:t>
-      </w:r>
-      <w:r>
-        <w:t xml:space="preserve"> </w:t>
-      </w:r>
-      <w:r>
-        <w:t xml:space="preserve">“Valid code below minimum is rejected”</w:t>
-      </w:r>
-      <w:r>
-        <w:t xml:space="preserve"> </w:t>
-      </w:r>
-      <w:r>
-        <w:t xml:space="preserve">naming the exact applied/reason mismatch, then [PASS], and exits 1</w:t>
+        <w:t xml:space="preserve">Terminal: after the minimum-cart check is removed, node dsl_runner.js specs/discount.feature prints a PASS line, a red Verdict: FAIL on the</w:t>
+      </w:r>
+      <w:r>
+        <w:t xml:space="preserve"> </w:t>
+      </w:r>
+      <w:r>
+        <w:t xml:space="preserve">“below minimum”</w:t>
+      </w:r>
+      <w:r>
+        <w:t xml:space="preserve"> </w:t>
+      </w:r>
+      <w:r>
+        <w:t xml:space="preserve">scenario naming the exact applied/reason mismatch, then a PASS line, and exits 1</w:t>
       </w:r>
     </w:p>
     <w:p>
@@ -4312,7 +4368,7 @@
         <w:rPr>
           <w:rStyle w:val="VerbatimChar"/>
         </w:rPr>
-        <w:t xml:space="preserve">[PASS]</w:t>
+        <w:t xml:space="preserve">PASS</w:t>
       </w:r>
       <w:r>
         <w:t xml:space="preserve"> </w:t>
@@ -4933,7 +4989,7 @@
         <w:rPr>
           <w:rStyle w:val="VerbatimChar"/>
         </w:rPr>
-        <w:t xml:space="preserve">[PASS]</w:t>
+        <w:t xml:space="preserve">PASS</w:t>
       </w:r>
       <w:r>
         <w:t xml:space="preserve">/</w:t>
@@ -4942,7 +4998,7 @@
         <w:rPr>
           <w:rStyle w:val="VerbatimChar"/>
         </w:rPr>
-        <w:t xml:space="preserve">[FAIL]</w:t>
+        <w:t xml:space="preserve">FAIL</w:t>
       </w:r>
       <w:r>
         <w:t xml:space="preserve"> </w:t>
@@ -5401,7 +5457,7 @@
               <w:rPr>
                 <w:rStyle w:val="VerbatimChar"/>
               </w:rPr>
-              <w:t xml:space="preserve">[PASS]</w:t>
+              <w:t xml:space="preserve">PASS</w:t>
             </w:r>
             <w:r>
               <w:t xml:space="preserve">;</w:t>
@@ -5504,7 +5560,7 @@
               <w:rPr>
                 <w:rStyle w:val="VerbatimChar"/>
               </w:rPr>
-              <w:t xml:space="preserve">[PASS]</w:t>
+              <w:t xml:space="preserve">PASS</w:t>
             </w:r>
             <w:r>
               <w:t xml:space="preserve">;</w:t>
@@ -5607,7 +5663,7 @@
               <w:rPr>
                 <w:rStyle w:val="VerbatimChar"/>
               </w:rPr>
-              <w:t xml:space="preserve">[PASS]</w:t>
+              <w:t xml:space="preserve">PASS</w:t>
             </w:r>
             <w:r>
               <w:t xml:space="preserve">;</w:t>
@@ -5701,7 +5757,7 @@
               <w:rPr>
                 <w:rStyle w:val="VerbatimChar"/>
               </w:rPr>
-              <w:t xml:space="preserve">[FAIL]</w:t>
+              <w:t xml:space="preserve">FAIL</w:t>
             </w:r>
             <w:r>
               <w:t xml:space="preserve"> </w:t>
@@ -5762,7 +5818,7 @@
               <w:rPr>
                 <w:rStyle w:val="VerbatimChar"/>
               </w:rPr>
-              <w:t xml:space="preserve">[PASS]</w:t>
+              <w:t xml:space="preserve">PASS</w:t>
             </w:r>
             <w:r>
               <w:t xml:space="preserve"> </w:t>
@@ -6764,7 +6820,7 @@
         <w:rPr>
           <w:rStyle w:val="VerbatimChar"/>
         </w:rPr>
-        <w:t xml:space="preserve">[FAIL]</w:t>
+        <w:t xml:space="preserve">FAIL</w:t>
       </w:r>
       <w:r>
         <w:t xml:space="preserve"> </w:t>

</xml_diff>

<commit_message>
docs(dsl-discount-spec): pin applied-case reason in scenario 1
Scenario 1 now asserts And reason is "SAVE20 applied", so the runner enforces
the applied-case message instead of leaving it to the implementation — the
README/screenshot output is now guaranteed, not one model's choice. README
authoring block matches; a note in 'The spec, annotated' explains the runner
enforces only Then-asserted values and the shown discount.js is one reference
implementation. No runner change; shipped discount.js still passes. docx regenerated.

Closes: t-527e
</commit_message>
<xml_diff>
--- a/examples/dsl-discount-spec/README.docx
+++ b/examples/dsl-discount-spec/README.docx
@@ -1856,6 +1856,15 @@
         <w:br/>
       </w:r>
       <w:r>
+        <w:rPr>
+          <w:rStyle w:val="InformationTok"/>
+        </w:rPr>
+        <w:t xml:space="preserve">  And reason is "SAVE20 applied"</w:t>
+      </w:r>
+      <w:r>
+        <w:br/>
+      </w:r>
+      <w:r>
         <w:br/>
       </w:r>
       <w:r>
@@ -4656,6 +4665,183 @@
       </w:r>
       <w:r>
         <w:t xml:space="preserve">steps; a spec that’s readable but unrun is just a comment.</w:t>
+      </w:r>
+    </w:p>
+    <w:p>
+      <w:pPr>
+        <w:pStyle w:val="BodyText"/>
+      </w:pPr>
+      <w:r>
+        <w:t xml:space="preserve">The runner enforces</w:t>
+      </w:r>
+      <w:r>
+        <w:t xml:space="preserve"> </w:t>
+      </w:r>
+      <w:r>
+        <w:rPr>
+          <w:b/>
+          <w:bCs/>
+        </w:rPr>
+        <w:t xml:space="preserve">only the values a</w:t>
+      </w:r>
+      <w:r>
+        <w:rPr>
+          <w:b/>
+          <w:bCs/>
+        </w:rPr>
+        <w:t xml:space="preserve"> </w:t>
+      </w:r>
+      <w:r>
+        <w:rPr>
+          <w:rStyle w:val="VerbatimChar"/>
+          <w:b/>
+          <w:bCs/>
+        </w:rPr>
+        <w:t xml:space="preserve">Then</w:t>
+      </w:r>
+      <w:r>
+        <w:rPr>
+          <w:b/>
+          <w:bCs/>
+        </w:rPr>
+        <w:t xml:space="preserve"> </w:t>
+      </w:r>
+      <w:r>
+        <w:rPr>
+          <w:b/>
+          <w:bCs/>
+        </w:rPr>
+        <w:t xml:space="preserve">line asserts</w:t>
+      </w:r>
+      <w:r>
+        <w:t xml:space="preserve"> </w:t>
+      </w:r>
+      <w:r>
+        <w:t xml:space="preserve">— here</w:t>
+      </w:r>
+      <w:r>
+        <w:t xml:space="preserve"> </w:t>
+      </w:r>
+      <w:r>
+        <w:rPr>
+          <w:rStyle w:val="VerbatimChar"/>
+        </w:rPr>
+        <w:t xml:space="preserve">applied</w:t>
+      </w:r>
+      <w:r>
+        <w:t xml:space="preserve">,</w:t>
+      </w:r>
+      <w:r>
+        <w:t xml:space="preserve"> </w:t>
+      </w:r>
+      <w:r>
+        <w:rPr>
+          <w:rStyle w:val="VerbatimChar"/>
+        </w:rPr>
+        <w:t xml:space="preserve">reason</w:t>
+      </w:r>
+      <w:r>
+        <w:t xml:space="preserve">, and (in</w:t>
+      </w:r>
+      <w:r>
+        <w:t xml:space="preserve"> </w:t>
+      </w:r>
+      <w:r>
+        <w:t xml:space="preserve">scenario 1)</w:t>
+      </w:r>
+      <w:r>
+        <w:t xml:space="preserve"> </w:t>
+      </w:r>
+      <w:r>
+        <w:rPr>
+          <w:rStyle w:val="VerbatimChar"/>
+        </w:rPr>
+        <w:t xml:space="preserve">final_total</w:t>
+      </w:r>
+      <w:r>
+        <w:t xml:space="preserve">. Everything the spec doesn’t assert is free: the function’s name, its</w:t>
+      </w:r>
+      <w:r>
+        <w:t xml:space="preserve"> </w:t>
+      </w:r>
+      <w:r>
+        <w:t xml:space="preserve">internal structure, and any field no</w:t>
+      </w:r>
+      <w:r>
+        <w:t xml:space="preserve"> </w:t>
+      </w:r>
+      <w:r>
+        <w:rPr>
+          <w:rStyle w:val="VerbatimChar"/>
+        </w:rPr>
+        <w:t xml:space="preserve">Then</w:t>
+      </w:r>
+      <w:r>
+        <w:t xml:space="preserve"> </w:t>
+      </w:r>
+      <w:r>
+        <w:t xml:space="preserve">mentions. That’s a feature, not a gap — you pin what you</w:t>
+      </w:r>
+      <w:r>
+        <w:t xml:space="preserve"> </w:t>
+      </w:r>
+      <w:r>
+        <w:t xml:space="preserve">care about and leave the rest to the implementation. It’s also why scenario 1 pins</w:t>
+      </w:r>
+      <w:r>
+        <w:t xml:space="preserve"> </w:t>
+      </w:r>
+      <w:r>
+        <w:rPr>
+          <w:rStyle w:val="VerbatimChar"/>
+        </w:rPr>
+        <w:t xml:space="preserve">And reason is "SAVE20 applied"</w:t>
+      </w:r>
+      <w:r>
+        <w:t xml:space="preserve">: the applied-case message is part of the contract, so every correct</w:t>
+      </w:r>
+      <w:r>
+        <w:t xml:space="preserve"> </w:t>
+      </w:r>
+      <w:r>
+        <w:t xml:space="preserve">build must produce it. The</w:t>
+      </w:r>
+      <w:r>
+        <w:t xml:space="preserve"> </w:t>
+      </w:r>
+      <w:r>
+        <w:rPr>
+          <w:rStyle w:val="VerbatimChar"/>
+        </w:rPr>
+        <w:t xml:space="preserve">app/discount.js</w:t>
+      </w:r>
+      <w:r>
+        <w:t xml:space="preserve"> </w:t>
+      </w:r>
+      <w:r>
+        <w:t xml:space="preserve">shown in this repo is</w:t>
+      </w:r>
+      <w:r>
+        <w:t xml:space="preserve"> </w:t>
+      </w:r>
+      <w:r>
+        <w:rPr>
+          <w:b/>
+          <w:bCs/>
+        </w:rPr>
+        <w:t xml:space="preserve">one reference implementation</w:t>
+      </w:r>
+      <w:r>
+        <w:t xml:space="preserve"> </w:t>
+      </w:r>
+      <w:r>
+        <w:t xml:space="preserve">your agent might produce; a different model may name things differently or word an unasserted field</w:t>
+      </w:r>
+      <w:r>
+        <w:t xml:space="preserve"> </w:t>
+      </w:r>
+      <w:r>
+        <w:t xml:space="preserve">differently and still pass — the spec, not the code listing, is the source of truth.</w:t>
       </w:r>
     </w:p>
     <w:bookmarkEnd w:id="42"/>

</xml_diff>

<commit_message>
fix(sprint): scenario-backed builds infer signature only, ask about unspecified rule values
start.md build-instruction step 6: never invent thresholds/rates/ranges the
scenarios don't pin — enumerate unspecified behavior and ask, don't guess.
dsl-discount-spec: add boundary scenarios pinning SAVE10 50/10% + SAVE20 100,
a README 'pin the numbers' note, and discount.py (fixes the broken Python
runner — discount.py was never committed). Both runners exit 0.

Closes: t-ef19
</commit_message>
<xml_diff>
--- a/examples/dsl-discount-spec/README.docx
+++ b/examples/dsl-discount-spec/README.docx
@@ -529,13 +529,56 @@
         <w:t xml:space="preserve">.feature</w:t>
       </w:r>
       <w:r>
-        <w:t xml:space="preserve">, the runner, and the rule — inferring the function straight from the</w:t>
-      </w:r>
-      <w:r>
-        <w:t xml:space="preserve"> </w:t>
-      </w:r>
-      <w:r>
-        <w:t xml:space="preserve">scenario, so you never write a function signature. canon’s fresh evaluator then grades the work by</w:t>
+        <w:t xml:space="preserve">, the runner, and the rule — inferring the function’s</w:t>
+      </w:r>
+      <w:r>
+        <w:t xml:space="preserve"> </w:t>
+      </w:r>
+      <w:r>
+        <w:rPr>
+          <w:b/>
+          <w:bCs/>
+        </w:rPr>
+        <w:t xml:space="preserve">signature</w:t>
+      </w:r>
+      <w:r>
+        <w:t xml:space="preserve"> </w:t>
+      </w:r>
+      <w:r>
+        <w:t xml:space="preserve">from the</w:t>
+      </w:r>
+      <w:r>
+        <w:t xml:space="preserve"> </w:t>
+      </w:r>
+      <w:r>
+        <w:t xml:space="preserve">scenario (</w:t>
+      </w:r>
+      <w:r>
+        <w:rPr>
+          <w:rStyle w:val="VerbatimChar"/>
+        </w:rPr>
+        <w:t xml:space="preserve">Given</w:t>
+      </w:r>
+      <w:r>
+        <w:t xml:space="preserve">→inputs,</w:t>
+      </w:r>
+      <w:r>
+        <w:t xml:space="preserve"> </w:t>
+      </w:r>
+      <w:r>
+        <w:rPr>
+          <w:rStyle w:val="VerbatimChar"/>
+        </w:rPr>
+        <w:t xml:space="preserve">Then</w:t>
+      </w:r>
+      <w:r>
+        <w:t xml:space="preserve">→outputs), so you never write a function signature. canon’s fresh</w:t>
+      </w:r>
+      <w:r>
+        <w:t xml:space="preserve"> </w:t>
+      </w:r>
+      <w:r>
+        <w:t xml:space="preserve">evaluator then grades the work by</w:t>
       </w:r>
       <w:r>
         <w:t xml:space="preserve"> </w:t>
@@ -551,12 +594,225 @@
         <w:t xml:space="preserve"> </w:t>
       </w:r>
       <w:r>
-        <w:t xml:space="preserve">that runner. You supply the intent and the behavior; the harness builds and checks the rest.</w:t>
-      </w:r>
-    </w:p>
-    <w:p>
-      <w:pPr>
-        <w:pStyle w:val="BodyText"/>
+        <w:t xml:space="preserve">that runner. You supply the intent and the behavior;</w:t>
+      </w:r>
+      <w:r>
+        <w:t xml:space="preserve"> </w:t>
+      </w:r>
+      <w:r>
+        <w:t xml:space="preserve">the harness builds and checks the rest.</w:t>
+      </w:r>
+    </w:p>
+    <w:p>
+      <w:pPr>
+        <w:pStyle w:val="BlockText"/>
+      </w:pPr>
+      <w:r>
+        <w:rPr>
+          <w:b/>
+          <w:bCs/>
+        </w:rPr>
+        <w:t xml:space="preserve">Pin the numbers, or the agent must ask.</w:t>
+      </w:r>
+      <w:r>
+        <w:t xml:space="preserve"> </w:t>
+      </w:r>
+      <w:r>
+        <w:t xml:space="preserve">Inference stops at the signature — it does</w:t>
+      </w:r>
+      <w:r>
+        <w:t xml:space="preserve"> </w:t>
+      </w:r>
+      <w:r>
+        <w:rPr>
+          <w:b/>
+          <w:bCs/>
+        </w:rPr>
+        <w:t xml:space="preserve">not</w:t>
+      </w:r>
+      <w:r>
+        <w:t xml:space="preserve"> </w:t>
+      </w:r>
+      <w:r>
+        <w:t xml:space="preserve">extend to business-rule</w:t>
+      </w:r>
+      <w:r>
+        <w:t xml:space="preserve"> </w:t>
+      </w:r>
+      <w:r>
+        <w:rPr>
+          <w:i/>
+          <w:iCs/>
+        </w:rPr>
+        <w:t xml:space="preserve">values</w:t>
+      </w:r>
+      <w:r>
+        <w:t xml:space="preserve">. A scenario proving</w:t>
+      </w:r>
+      <w:r>
+        <w:t xml:space="preserve"> </w:t>
+      </w:r>
+      <w:r>
+        <w:t xml:space="preserve">“cart_total 40 + SAVE10 → rejected”</w:t>
+      </w:r>
+      <w:r>
+        <w:t xml:space="preserve"> </w:t>
+      </w:r>
+      <w:r>
+        <w:t xml:space="preserve">pins only</w:t>
+      </w:r>
+      <w:r>
+        <w:t xml:space="preserve"> </w:t>
+      </w:r>
+      <w:r>
+        <w:t xml:space="preserve">“SAVE10’s minimum is above 40”</w:t>
+      </w:r>
+      <w:r>
+        <w:t xml:space="preserve">, not</w:t>
+      </w:r>
+      <w:r>
+        <w:t xml:space="preserve"> </w:t>
+      </w:r>
+      <w:r>
+        <w:t xml:space="preserve">“= 50”</w:t>
+      </w:r>
+      <w:r>
+        <w:t xml:space="preserve">, and says nothing about SAVE10’s rate. Any threshold,</w:t>
+      </w:r>
+      <w:r>
+        <w:t xml:space="preserve"> </w:t>
+      </w:r>
+      <w:r>
+        <w:t xml:space="preserve">rate, boundary, or range your scenarios don’t pin, the build instruction requires the agent to</w:t>
+      </w:r>
+      <w:r>
+        <w:t xml:space="preserve"> </w:t>
+      </w:r>
+      <w:r>
+        <w:rPr>
+          <w:b/>
+          <w:bCs/>
+        </w:rPr>
+        <w:t xml:space="preserve">surface as an explicit gap and ask</w:t>
+      </w:r>
+      <w:r>
+        <w:t xml:space="preserve"> </w:t>
+      </w:r>
+      <w:r>
+        <w:t xml:space="preserve">— never fill in with a plausible guess. (A guessed</w:t>
+      </w:r>
+      <w:r>
+        <w:t xml:space="preserve"> </w:t>
+      </w:r>
+      <w:r>
+        <w:t xml:space="preserve">threshold still makes the runner pass every scenario, so neither the runner nor the fresh</w:t>
+      </w:r>
+      <w:r>
+        <w:t xml:space="preserve"> </w:t>
+      </w:r>
+      <w:r>
+        <w:t xml:space="preserve">evaluator would catch it — which is exactly why the value has to be pinned.) The boundary</w:t>
+      </w:r>
+      <w:r>
+        <w:t xml:space="preserve"> </w:t>
+      </w:r>
+      <w:r>
+        <w:t xml:space="preserve">scenarios in</w:t>
+      </w:r>
+      <w:r>
+        <w:t xml:space="preserve"> </w:t>
+      </w:r>
+      <w:r>
+        <w:rPr>
+          <w:rStyle w:val="VerbatimChar"/>
+        </w:rPr>
+        <w:t xml:space="preserve">specs/discount.feature</w:t>
+      </w:r>
+      <w:r>
+        <w:t xml:space="preserve"> </w:t>
+      </w:r>
+      <w:r>
+        <w:t xml:space="preserve">(</w:t>
+      </w:r>
+      <w:r>
+        <w:rPr>
+          <w:rStyle w:val="VerbatimChar"/>
+        </w:rPr>
+        <w:t xml:space="preserve">50.00</w:t>
+      </w:r>
+      <w:r>
+        <w:t xml:space="preserve">/</w:t>
+      </w:r>
+      <w:r>
+        <w:rPr>
+          <w:rStyle w:val="VerbatimChar"/>
+        </w:rPr>
+        <w:t xml:space="preserve">49.99</w:t>
+      </w:r>
+      <w:r>
+        <w:t xml:space="preserve"> </w:t>
+      </w:r>
+      <w:r>
+        <w:t xml:space="preserve">for SAVE10,</w:t>
+      </w:r>
+      <w:r>
+        <w:t xml:space="preserve"> </w:t>
+      </w:r>
+      <w:r>
+        <w:rPr>
+          <w:rStyle w:val="VerbatimChar"/>
+        </w:rPr>
+        <w:t xml:space="preserve">99.99</w:t>
+      </w:r>
+      <w:r>
+        <w:t xml:space="preserve"> </w:t>
+      </w:r>
+      <w:r>
+        <w:t xml:space="preserve">for SAVE20) exist to</w:t>
+      </w:r>
+      <w:r>
+        <w:t xml:space="preserve"> </w:t>
+      </w:r>
+      <w:r>
+        <w:t xml:space="preserve">pin</w:t>
+      </w:r>
+      <w:r>
+        <w:t xml:space="preserve"> </w:t>
+      </w:r>
+      <w:r>
+        <w:rPr>
+          <w:rStyle w:val="VerbatimChar"/>
+        </w:rPr>
+        <w:t xml:space="preserve">50</w:t>
+      </w:r>
+      <w:r>
+        <w:t xml:space="preserve">/</w:t>
+      </w:r>
+      <w:r>
+        <w:rPr>
+          <w:rStyle w:val="VerbatimChar"/>
+        </w:rPr>
+        <w:t xml:space="preserve">100</w:t>
+      </w:r>
+      <w:r>
+        <w:t xml:space="preserve">/</w:t>
+      </w:r>
+      <w:r>
+        <w:rPr>
+          <w:rStyle w:val="VerbatimChar"/>
+        </w:rPr>
+        <w:t xml:space="preserve">10%</w:t>
+      </w:r>
+      <w:r>
+        <w:t xml:space="preserve"> </w:t>
+      </w:r>
+      <w:r>
+        <w:t xml:space="preserve">so nothing is left to inference.</w:t>
+      </w:r>
+    </w:p>
+    <w:p>
+      <w:pPr>
+        <w:pStyle w:val="FirstParagraph"/>
       </w:pPr>
       <w:r>
         <w:t xml:space="preserve">The rest of this README walks that arc end to end.</w:t>
@@ -2429,7 +2685,23 @@
         <w:t xml:space="preserve"> </w:t>
       </w:r>
       <w:r>
-        <w:t xml:space="preserve">the function from it (</w:t>
+        <w:t xml:space="preserve">the function’s</w:t>
+      </w:r>
+      <w:r>
+        <w:t xml:space="preserve"> </w:t>
+      </w:r>
+      <w:r>
+        <w:rPr>
+          <w:i/>
+          <w:iCs/>
+        </w:rPr>
+        <w:t xml:space="preserve">signature</w:t>
+      </w:r>
+      <w:r>
+        <w:t xml:space="preserve"> </w:t>
+      </w:r>
+      <w:r>
+        <w:t xml:space="preserve">from it (</w:t>
       </w:r>
       <w:r>
         <w:rPr>
@@ -2462,7 +2734,29 @@
         <w:t xml:space="preserve"> </w:t>
       </w:r>
       <w:r>
-        <w:t xml:space="preserve">so you never write a signature), implement</w:t>
+        <w:t xml:space="preserve">so you never write a signature — but inference stops there; rule</w:t>
+      </w:r>
+      <w:r>
+        <w:t xml:space="preserve"> </w:t>
+      </w:r>
+      <w:r>
+        <w:rPr>
+          <w:i/>
+          <w:iCs/>
+        </w:rPr>
+        <w:t xml:space="preserve">values</w:t>
+      </w:r>
+      <w:r>
+        <w:t xml:space="preserve"> </w:t>
+      </w:r>
+      <w:r>
+        <w:t xml:space="preserve">it can’t see get asked about, not guessed),</w:t>
+      </w:r>
+      <w:r>
+        <w:t xml:space="preserve"> </w:t>
+      </w:r>
+      <w:r>
+        <w:t xml:space="preserve">implement</w:t>
       </w:r>
       <w:r>
         <w:t xml:space="preserve"> </w:t>
@@ -2606,7 +2900,23 @@
         </w:numPr>
       </w:pPr>
       <w:r>
-        <w:t xml:space="preserve">Infer the function under test:</w:t>
+        <w:t xml:space="preserve">Infer the function’s</w:t>
+      </w:r>
+      <w:r>
+        <w:t xml:space="preserve"> </w:t>
+      </w:r>
+      <w:r>
+        <w:rPr>
+          <w:b/>
+          <w:bCs/>
+        </w:rPr>
+        <w:t xml:space="preserve">signature</w:t>
+      </w:r>
+      <w:r>
+        <w:t xml:space="preserve"> </w:t>
+      </w:r>
+      <w:r>
+        <w:t xml:space="preserve">only:</w:t>
       </w:r>
       <w:r>
         <w:t xml:space="preserve"> </w:t>
@@ -2636,7 +2946,23 @@
         <w:t xml:space="preserve"> </w:t>
       </w:r>
       <w:r>
-        <w:t xml:space="preserve">lines are the output fields. You choose the name and signature.</w:t>
+        <w:t xml:space="preserve">lines are the output fields. You choose the name and signature. Inference does</w:t>
+      </w:r>
+      <w:r>
+        <w:t xml:space="preserve"> </w:t>
+      </w:r>
+      <w:r>
+        <w:rPr>
+          <w:b/>
+          <w:bCs/>
+        </w:rPr>
+        <w:t xml:space="preserve">not</w:t>
+      </w:r>
+      <w:r>
+        <w:t xml:space="preserve"> </w:t>
+      </w:r>
+      <w:r>
+        <w:t xml:space="preserve">extend to business-rule values.</w:t>
       </w:r>
     </w:p>
     <w:p>
@@ -2765,7 +3091,45 @@
         <w:t xml:space="preserve">.feature</w:t>
       </w:r>
       <w:r>
-        <w:t xml:space="preserve">); don’t edit the spec to force a pass; ask if anything is ambiguous.</w:t>
+        <w:t xml:space="preserve">); don’t edit the spec to force a pass.</w:t>
+      </w:r>
+    </w:p>
+    <w:p>
+      <w:pPr>
+        <w:pStyle w:val="Compact"/>
+        <w:numPr>
+          <w:ilvl w:val="1"/>
+          <w:numId w:val="1004"/>
+        </w:numPr>
+      </w:pPr>
+      <w:r>
+        <w:rPr>
+          <w:b/>
+          <w:bCs/>
+        </w:rPr>
+        <w:t xml:space="preserve">Never invent rule values the scenarios don’t pin</w:t>
+      </w:r>
+      <w:r>
+        <w:t xml:space="preserve"> </w:t>
+      </w:r>
+      <w:r>
+        <w:t xml:space="preserve">(thresholds, rates, boundaries, ranges between the given data points, unhandled inputs). Before implementing, list every unspecified behavior and surface it as an explicit gap to confirm; ask if the signature</w:t>
+      </w:r>
+      <w:r>
+        <w:t xml:space="preserve"> </w:t>
+      </w:r>
+      <w:r>
+        <w:rPr>
+          <w:i/>
+          <w:iCs/>
+        </w:rPr>
+        <w:t xml:space="preserve">or</w:t>
+      </w:r>
+      <w:r>
+        <w:t xml:space="preserve"> </w:t>
+      </w:r>
+      <w:r>
+        <w:t xml:space="preserve">any rule value is ambiguous.</w:t>
       </w:r>
     </w:p>
     <w:p>

</xml_diff>

<commit_message>
fix(example): pin SAVE20 min=100 on both sides (add 100.00-applies scenario)
Reviewer caught that 99.99-rejected + 120-applied only bounds SAVE20 min to
(99.99, 120] — a guess like 105 would still pass. Add the at-boundary
100.00 -> applied (80.00) scenario so the README's 'pins 100' claim holds.

Closes: t-ef19
</commit_message>
<xml_diff>
--- a/examples/dsl-discount-spec/README.docx
+++ b/examples/dsl-discount-spec/README.docx
@@ -762,19 +762,28 @@
         <w:rPr>
           <w:rStyle w:val="VerbatimChar"/>
         </w:rPr>
+        <w:t xml:space="preserve">100.00</w:t>
+      </w:r>
+      <w:r>
+        <w:t xml:space="preserve">/</w:t>
+      </w:r>
+      <w:r>
+        <w:rPr>
+          <w:rStyle w:val="VerbatimChar"/>
+        </w:rPr>
         <w:t xml:space="preserve">99.99</w:t>
       </w:r>
       <w:r>
         <w:t xml:space="preserve"> </w:t>
       </w:r>
       <w:r>
-        <w:t xml:space="preserve">for SAVE20) exist to</w:t>
-      </w:r>
-      <w:r>
-        <w:t xml:space="preserve"> </w:t>
-      </w:r>
-      <w:r>
-        <w:t xml:space="preserve">pin</w:t>
+        <w:t xml:space="preserve">for SAVE20)</w:t>
+      </w:r>
+      <w:r>
+        <w:t xml:space="preserve"> </w:t>
+      </w:r>
+      <w:r>
+        <w:t xml:space="preserve">exist to pin</w:t>
       </w:r>
       <w:r>
         <w:t xml:space="preserve"> </w:t>
@@ -804,10 +813,19 @@
         <w:t xml:space="preserve">10%</w:t>
       </w:r>
       <w:r>
-        <w:t xml:space="preserve"> </w:t>
-      </w:r>
-      <w:r>
-        <w:t xml:space="preserve">so nothing is left to inference.</w:t>
+        <w:t xml:space="preserve">/</w:t>
+      </w:r>
+      <w:r>
+        <w:rPr>
+          <w:rStyle w:val="VerbatimChar"/>
+        </w:rPr>
+        <w:t xml:space="preserve">20%</w:t>
+      </w:r>
+      <w:r>
+        <w:t xml:space="preserve"> </w:t>
+      </w:r>
+      <w:r>
+        <w:t xml:space="preserve">on both sides so nothing is left to inference.</w:t>
       </w:r>
     </w:p>
     <w:p>

</xml_diff>